<commit_message>
done Loi cam on
</commit_message>
<xml_diff>
--- a/BAO-CAO-THUC-TAP.docx
+++ b/BAO-CAO-THUC-TAP.docx
@@ -171,7 +171,7 @@
                   </wp:anchor>
                 </w:drawing>
               </mc:Choice>
-              <mc:Fallback xmlns:w16sdtfl="http://schemas.microsoft.com/office/word/2024/wordml/sdtformatlock" xmlns:w16du="http://schemas.microsoft.com/office/word/2023/wordml/word16du" xmlns:oel="http://schemas.microsoft.com/office/2019/extlst">
+              <mc:Fallback xmlns:oel="http://schemas.microsoft.com/office/2019/extlst" xmlns:w16du="http://schemas.microsoft.com/office/word/2023/wordml/word16du" xmlns:w16sdtfl="http://schemas.microsoft.com/office/word/2024/wordml/sdtformatlock">
                 <w:pict>
                   <v:line w14:anchorId="1BB953F1" id="Straight Connector 18" o:spid="_x0000_s1026" style="position:absolute;z-index:251674624;visibility:visible;mso-wrap-style:square;mso-wrap-distance-left:9pt;mso-wrap-distance-top:0;mso-wrap-distance-right:9pt;mso-wrap-distance-bottom:0;mso-position-horizontal:absolute;mso-position-horizontal-relative:text;mso-position-vertical:absolute;mso-position-vertical-relative:text" from="1.2pt,19.05pt" to="185.7pt,19.05pt" o:gfxdata="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" strokecolor="#4472c4 [3204]" strokeweight=".5pt">
                     <v:stroke joinstyle="miter"/>
@@ -1007,7 +1007,6 @@
         </w:tabs>
         <w:spacing w:after="240" w:line="360" w:lineRule="auto"/>
         <w:ind w:firstLine="567"/>
-        <w:jc w:val="left"/>
         <w:rPr>
           <w:rFonts w:cs="Times New Roman"/>
           <w:color w:val="000000" w:themeColor="text1"/>
@@ -1032,7 +1031,21 @@
           <w:rFonts w:cs="Times New Roman"/>
           <w:color w:val="000000" w:themeColor="text1"/>
         </w:rPr>
-        <w:t xml:space="preserve"> cá nhân và đơn vị. Những sự hướng dẫn đó không chỉ giúp tôi hoàn thành tốt kỳ thực tập mà còn mang lại cho tôi nhiều kinh nghiệm thực tế quý báu.</w:t>
+        <w:t xml:space="preserve"> cá nhân và đơn vị. Những sự </w:t>
+      </w:r>
+      <w:r>
+        <w:rPr>
+          <w:rFonts w:cs="Times New Roman"/>
+          <w:color w:val="000000" w:themeColor="text1"/>
+        </w:rPr>
+        <w:br/>
+      </w:r>
+      <w:r>
+        <w:rPr>
+          <w:rFonts w:cs="Times New Roman"/>
+          <w:color w:val="000000" w:themeColor="text1"/>
+        </w:rPr>
+        <w:t>hướng dẫn đó không chỉ giúp tôi hoàn thành tốt kỳ thực tập mà còn mang lại cho tôi nhiều kinh nghiệm thực tế quý báu.</w:t>
       </w:r>
       <w:r>
         <w:rPr>
@@ -1063,25 +1076,66 @@
         </w:tabs>
         <w:spacing w:after="240" w:line="360" w:lineRule="auto"/>
         <w:ind w:firstLine="567"/>
-        <w:jc w:val="left"/>
-        <w:rPr>
-          <w:rFonts w:cs="Times New Roman"/>
-          <w:color w:val="000000" w:themeColor="text1"/>
-        </w:rPr>
-      </w:pPr>
-      <w:r>
-        <w:rPr>
-          <w:rFonts w:cs="Times New Roman"/>
-          <w:color w:val="000000" w:themeColor="text1"/>
-        </w:rPr>
-        <w:t>Trước hết, tôi xin chân thành cảm ơn TS. Huỳnh Đệ Thủ đã tận tình hướng dẫn, định hướng chuyên môn cho bản thân tôi và góp nhiều ý kiến đáng giá trong suốt quá trình thực tập và làm báo cáo.</w:t>
-      </w:r>
-      <w:r>
-        <w:rPr>
-          <w:rFonts w:cs="Times New Roman"/>
-          <w:color w:val="000000" w:themeColor="text1"/>
-        </w:rPr>
-        <w:t xml:space="preserve"> Những lời góp ý kịp thời của thầy đã giúp tôi hoàn thiện nội dung báo cáo, đồng thời còn có thể tự nâng cao tư duy bản thân về mặt học thuật và khả năng thích ứng, tiếp cận với vấn đề một</w:t>
+        <w:rPr>
+          <w:rFonts w:cs="Times New Roman"/>
+          <w:color w:val="000000" w:themeColor="text1"/>
+        </w:rPr>
+      </w:pPr>
+      <w:r>
+        <w:rPr>
+          <w:rFonts w:cs="Times New Roman"/>
+          <w:color w:val="000000" w:themeColor="text1"/>
+        </w:rPr>
+        <w:t xml:space="preserve">Trước hết, tôi xin chân thành cảm ơn TS. Huỳnh Đệ Thủ đã tận tình hướng dẫn, định hướng chuyên môn cho bản thân tôi và góp nhiều ý kiến đáng giá trong suốt </w:t>
+      </w:r>
+      <w:r>
+        <w:rPr>
+          <w:rFonts w:cs="Times New Roman"/>
+          <w:color w:val="000000" w:themeColor="text1"/>
+        </w:rPr>
+        <w:br/>
+      </w:r>
+      <w:r>
+        <w:rPr>
+          <w:rFonts w:cs="Times New Roman"/>
+          <w:color w:val="000000" w:themeColor="text1"/>
+        </w:rPr>
+        <w:t>quá trình thực tập và làm báo cáo.</w:t>
+      </w:r>
+      <w:r>
+        <w:rPr>
+          <w:rFonts w:cs="Times New Roman"/>
+          <w:color w:val="000000" w:themeColor="text1"/>
+        </w:rPr>
+        <w:t xml:space="preserve"> Những lời góp ý kịp thời của thầy đã giúp tôi </w:t>
+      </w:r>
+      <w:r>
+        <w:rPr>
+          <w:rFonts w:cs="Times New Roman"/>
+          <w:color w:val="000000" w:themeColor="text1"/>
+        </w:rPr>
+        <w:br/>
+      </w:r>
+      <w:r>
+        <w:rPr>
+          <w:rFonts w:cs="Times New Roman"/>
+          <w:color w:val="000000" w:themeColor="text1"/>
+        </w:rPr>
+        <w:t xml:space="preserve">hoàn thiện nội dung báo cáo, đồng thời còn có thể tự nâng cao tư duy bản thân về </w:t>
+      </w:r>
+      <w:r>
+        <w:rPr>
+          <w:rFonts w:cs="Times New Roman"/>
+          <w:color w:val="000000" w:themeColor="text1"/>
+        </w:rPr>
+        <w:br/>
+      </w:r>
+      <w:r>
+        <w:rPr>
+          <w:rFonts w:cs="Times New Roman"/>
+          <w:color w:val="000000" w:themeColor="text1"/>
+        </w:rPr>
+        <w:t>mặt học thuật và khả năng thích ứng, tiếp cận với vấn đề một</w:t>
       </w:r>
       <w:r>
         <w:rPr>
@@ -1105,18 +1159,17 @@
         </w:tabs>
         <w:spacing w:after="240" w:line="360" w:lineRule="auto"/>
         <w:ind w:firstLine="567"/>
-        <w:jc w:val="left"/>
-        <w:rPr>
-          <w:rFonts w:cs="Times New Roman"/>
-          <w:color w:val="000000" w:themeColor="text1"/>
-        </w:rPr>
-      </w:pPr>
-      <w:r>
-        <w:rPr>
-          <w:rFonts w:cs="Times New Roman"/>
-          <w:color w:val="000000" w:themeColor="text1"/>
-        </w:rPr>
-        <w:t xml:space="preserve">Tiếp theo, tôi xin gửi lời cảm ơn sâu sắc đến </w:t>
+        <w:rPr>
+          <w:rFonts w:cs="Times New Roman"/>
+          <w:color w:val="000000" w:themeColor="text1"/>
+        </w:rPr>
+      </w:pPr>
+      <w:r>
+        <w:rPr>
+          <w:rFonts w:cs="Times New Roman"/>
+          <w:color w:val="000000" w:themeColor="text1"/>
+        </w:rPr>
+        <w:t xml:space="preserve">Tiếp theo, tôi xin gửi lời cảm ơn đến </w:t>
       </w:r>
       <w:r>
         <w:rPr>
@@ -1151,7 +1204,21 @@
           <w:rFonts w:cs="Times New Roman"/>
           <w:color w:val="000000" w:themeColor="text1"/>
         </w:rPr>
-        <w:t xml:space="preserve"> dự án thực tế, quy trình làm việc bài bản và những công nghệ đang được áp dụng trong doanh nghiệp.</w:t>
+        <w:t xml:space="preserve"> dự án thực tế, quy trình làm việc bài bản và </w:t>
+      </w:r>
+      <w:r>
+        <w:rPr>
+          <w:rFonts w:cs="Times New Roman"/>
+          <w:color w:val="000000" w:themeColor="text1"/>
+        </w:rPr>
+        <w:br/>
+      </w:r>
+      <w:r>
+        <w:rPr>
+          <w:rFonts w:cs="Times New Roman"/>
+          <w:color w:val="000000" w:themeColor="text1"/>
+        </w:rPr>
+        <w:t>những công nghệ đang được áp dụng trong doanh nghiệp.</w:t>
       </w:r>
     </w:p>
     <w:p>
@@ -1161,18 +1228,31 @@
         </w:tabs>
         <w:spacing w:after="240" w:line="360" w:lineRule="auto"/>
         <w:ind w:firstLine="567"/>
-        <w:jc w:val="left"/>
-        <w:rPr>
-          <w:rFonts w:cs="Times New Roman"/>
-          <w:color w:val="000000" w:themeColor="text1"/>
-        </w:rPr>
-      </w:pPr>
-      <w:r>
-        <w:rPr>
-          <w:rFonts w:cs="Times New Roman"/>
-          <w:color w:val="000000" w:themeColor="text1"/>
-        </w:rPr>
-        <w:t>Tôi cũng xin phép gửi lời cảm ơn đến anh Đoàn Hồng Đăng đã trực tiếp hướng dẫn</w:t>
+        <w:rPr>
+          <w:rFonts w:cs="Times New Roman"/>
+          <w:color w:val="000000" w:themeColor="text1"/>
+        </w:rPr>
+      </w:pPr>
+      <w:r>
+        <w:rPr>
+          <w:rFonts w:cs="Times New Roman"/>
+          <w:color w:val="000000" w:themeColor="text1"/>
+        </w:rPr>
+        <w:t xml:space="preserve">Tôi cũng xin phép gửi lời cảm ơn đến anh Đoàn Hồng Đăng đã trực tiếp </w:t>
+      </w:r>
+      <w:r>
+        <w:rPr>
+          <w:rFonts w:cs="Times New Roman"/>
+          <w:color w:val="000000" w:themeColor="text1"/>
+        </w:rPr>
+        <w:br/>
+      </w:r>
+      <w:r>
+        <w:rPr>
+          <w:rFonts w:cs="Times New Roman"/>
+          <w:color w:val="000000" w:themeColor="text1"/>
+        </w:rPr>
+        <w:t>hướng dẫn</w:t>
       </w:r>
       <w:r>
         <w:rPr>
@@ -1200,7 +1280,21 @@
           <w:rFonts w:cs="Times New Roman"/>
           <w:color w:val="000000" w:themeColor="text1"/>
         </w:rPr>
-        <w:t xml:space="preserve"> chia sẻ về kinh nghiệm chuyên môn ra, anh chị còn chia sẻ cho tôi về các kỹ năng mềm cần </w:t>
+        <w:t xml:space="preserve"> chia sẻ về </w:t>
+      </w:r>
+      <w:r>
+        <w:rPr>
+          <w:rFonts w:cs="Times New Roman"/>
+          <w:color w:val="000000" w:themeColor="text1"/>
+        </w:rPr>
+        <w:br/>
+      </w:r>
+      <w:r>
+        <w:rPr>
+          <w:rFonts w:cs="Times New Roman"/>
+          <w:color w:val="000000" w:themeColor="text1"/>
+        </w:rPr>
+        <w:t xml:space="preserve">kinh nghiệm chuyên môn ra, anh chị còn chia sẻ cho tôi về các kỹ năng mềm cần </w:t>
       </w:r>
       <w:r>
         <w:rPr>
@@ -1224,7 +1318,6 @@
         </w:tabs>
         <w:spacing w:after="240" w:line="360" w:lineRule="auto"/>
         <w:ind w:firstLine="567"/>
-        <w:jc w:val="left"/>
         <w:rPr>
           <w:rFonts w:cs="Times New Roman"/>
           <w:color w:val="000000" w:themeColor="text1"/>
@@ -1263,7 +1356,21 @@
           <w:rFonts w:cs="Times New Roman"/>
           <w:color w:val="000000" w:themeColor="text1"/>
         </w:rPr>
-        <w:t>ất mong nhận được sự thông cảm và những ý kiến đóng góp của thầy</w:t>
+        <w:t xml:space="preserve">ất mong nhận được </w:t>
+      </w:r>
+      <w:r>
+        <w:rPr>
+          <w:rFonts w:cs="Times New Roman"/>
+          <w:color w:val="000000" w:themeColor="text1"/>
+        </w:rPr>
+        <w:br/>
+      </w:r>
+      <w:r>
+        <w:rPr>
+          <w:rFonts w:cs="Times New Roman"/>
+          <w:color w:val="000000" w:themeColor="text1"/>
+        </w:rPr>
+        <w:t>sự thông cảm và những ý kiến đóng góp của thầy</w:t>
       </w:r>
       <w:r>
         <w:rPr>
@@ -1278,6 +1385,13 @@
           <w:color w:val="000000" w:themeColor="text1"/>
         </w:rPr>
         <w:t xml:space="preserve"> anh chị để có thể tiếp tục hoàn thiện và phát triển hơn trong tương lai</w:t>
+      </w:r>
+      <w:r>
+        <w:rPr>
+          <w:rFonts w:cs="Times New Roman"/>
+          <w:color w:val="000000" w:themeColor="text1"/>
+        </w:rPr>
+        <w:t>.</w:t>
       </w:r>
     </w:p>
     <w:p>
@@ -14702,7 +14816,7 @@
               </wp:anchor>
             </w:drawing>
           </mc:Choice>
-          <mc:Fallback xmlns:w16sdtfl="http://schemas.microsoft.com/office/word/2024/wordml/sdtformatlock" xmlns:w16du="http://schemas.microsoft.com/office/word/2023/wordml/word16du" xmlns:oel="http://schemas.microsoft.com/office/2019/extlst">
+          <mc:Fallback xmlns:oel="http://schemas.microsoft.com/office/2019/extlst" xmlns:w16du="http://schemas.microsoft.com/office/word/2023/wordml/word16du" xmlns:w16sdtfl="http://schemas.microsoft.com/office/word/2024/wordml/sdtformatlock">
             <w:pict>
               <v:line w14:anchorId="13502D3A" id="Straight Connector 23" o:spid="_x0000_s1026" style="position:absolute;z-index:251698176;visibility:visible;mso-wrap-style:square;mso-wrap-distance-left:9pt;mso-wrap-distance-top:0;mso-wrap-distance-right:9pt;mso-wrap-distance-bottom:0;mso-position-horizontal:absolute;mso-position-horizontal-relative:text;mso-position-vertical:absolute;mso-position-vertical-relative:text" from="-83.05pt,40.4pt" to="509.95pt,40.4pt" o:gfxdata="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" strokecolor="red" strokeweight="1.5pt">
                 <v:stroke joinstyle="miter"/>

</xml_diff>

<commit_message>
done 1.1, 1.2, 1.3
</commit_message>
<xml_diff>
--- a/BAO-CAO-THUC-TAP.docx
+++ b/BAO-CAO-THUC-TAP.docx
@@ -6005,7 +6005,19 @@
         <w:ind w:firstLine="567"/>
       </w:pPr>
       <w:r>
-        <w:t>Trong suốt quá trình thực tập tại Công ty TNHH Công nghệ MeU Solutions, các hoạt động và công việc của tôi được triển khai theo từng giai đoạn cụ thể, phù hợp với lộ trình thực tập và mức độ tiếp cận công việc thực tế.</w:t>
+        <w:t>Trong suốt quá trình thực tập tại Công ty TNHH Công nghệ MeU Solutions,</w:t>
+      </w:r>
+      <w:r>
+        <w:t xml:space="preserve"> tôi được hướng dẫn triển khia</w:t>
+      </w:r>
+      <w:r>
+        <w:t xml:space="preserve"> các hoạt động và công việc theo từng giai đoạn cụ thể, </w:t>
+      </w:r>
+      <w:r>
+        <w:br/>
+      </w:r>
+      <w:r>
+        <w:t>phù hợp với lộ trình thực tập và mức độ tiếp cận công việc thực tế.</w:t>
       </w:r>
     </w:p>
     <w:p>
@@ -6014,7 +6026,28 @@
         <w:ind w:firstLine="567"/>
       </w:pPr>
       <w:r>
-        <w:t>Ở giai đoạn đầu, tôi được hướng dẫn làm quen với môi trường làm việc, quy trình hoạt động của công ty cũng như các công cụ phục vụ cho quá trình phát triển phần mềm. Cụ thể, tôi được giới thiệu về quy trình làm việc theo mô hình Agile Scrum, cách quản lý công việc thông qua JIRA và quản lý mã nguồn bằng GitLab. Giai đoạn này giúp tôi xây dựng nền tảng ban đầu để có thể nhanh chóng thích nghi với môi trường làm việc doanh nghiệp.</w:t>
+        <w:t>Giai đoạn đầu</w:t>
+      </w:r>
+      <w:r>
+        <w:t xml:space="preserve">, tôi được hướng dẫn làm quen với môi trường làm việc, quy trình hoạt động của công ty cũng như các công cụ phục vụ cho quá trình phát triển phần mềm. Cụ thể, tôi được giới thiệu về quy trình làm việc theo mô hình Agile Scrum, cách </w:t>
+      </w:r>
+      <w:r>
+        <w:br/>
+      </w:r>
+      <w:r>
+        <w:t xml:space="preserve">quản lý công việc thông qua JIRA và quản lý mã nguồn bằng GitLab. </w:t>
+      </w:r>
+      <w:r>
+        <w:t>Đây là giai đoạn</w:t>
+      </w:r>
+      <w:r>
+        <w:t xml:space="preserve"> giúp tôi xây dựng nền tảng ban đầu để có thể nhanh chóng thích nghi với môi trường làm việc</w:t>
+      </w:r>
+      <w:r>
+        <w:t xml:space="preserve"> của</w:t>
+      </w:r>
+      <w:r>
+        <w:t xml:space="preserve"> doanh nghiệp.</w:t>
       </w:r>
     </w:p>
     <w:p>
@@ -6023,7 +6056,88 @@
         <w:ind w:firstLine="567"/>
       </w:pPr>
       <w:r>
-        <w:t>Sang giai đoạn tiếp theo, tôi bắt đầu tham gia vào các công việc chuyên môn trong dự án thực tế của công ty. Các nhiệm vụ được giao tập trung vào việc tìm hiểu kiến trúc hệ thống, tham gia phát triển và chỉnh sửa một số chức năng theo yêu cầu của dự án. Thông qua quá trình này, tôi có cơ hội vận dụng kiến thức lý thuyết đã học vào thực tiễn, đồng thời rèn luyện kỹ năng làm việc nhóm, giao tiếp và tuân thủ quy trình phát triển phần mềm.</w:t>
+        <w:t xml:space="preserve">Sang giai đoạn tiếp theo, tôi bắt đầu tham gia vào dự án thực tế của công ty. </w:t>
+      </w:r>
+      <w:r>
+        <w:br/>
+      </w:r>
+      <w:r>
+        <w:t>Các nhiệm vụ được giao tập trung vào việc</w:t>
+      </w:r>
+      <w:r>
+        <w:t xml:space="preserve"> </w:t>
+      </w:r>
+      <w:r>
+        <w:t>tham gia phát triển</w:t>
+      </w:r>
+      <w:r>
+        <w:t xml:space="preserve">, </w:t>
+      </w:r>
+      <w:r>
+        <w:t>chỉnh sửa</w:t>
+      </w:r>
+      <w:r>
+        <w:t>, kiểm tra</w:t>
+      </w:r>
+      <w:r>
+        <w:t xml:space="preserve"> </w:t>
+      </w:r>
+      <w:r>
+        <w:br/>
+      </w:r>
+      <w:r>
+        <w:t>một số chức năng theo yêu cầu của dự án</w:t>
+      </w:r>
+      <w:r>
+        <w:t xml:space="preserve"> và </w:t>
+      </w:r>
+      <w:r>
+        <w:t>tìm hiểu kiến trúc hệ thống</w:t>
+      </w:r>
+      <w:r>
+        <w:t xml:space="preserve">. Thông qua </w:t>
+      </w:r>
+      <w:r>
+        <w:br/>
+      </w:r>
+      <w:r>
+        <w:t xml:space="preserve">quá trình này, tôi </w:t>
+      </w:r>
+      <w:r>
+        <w:t xml:space="preserve">đã </w:t>
+      </w:r>
+      <w:r>
+        <w:t xml:space="preserve">có cơ hội vận dụng kiến thức đã học vào thực </w:t>
+      </w:r>
+      <w:r>
+        <w:t>tế</w:t>
+      </w:r>
+      <w:r>
+        <w:t xml:space="preserve">, đồng thời </w:t>
+      </w:r>
+      <w:r>
+        <w:br/>
+      </w:r>
+      <w:r>
+        <w:t xml:space="preserve">rèn luyện kỹ năng làm việc nhóm, </w:t>
+      </w:r>
+      <w:r>
+        <w:t xml:space="preserve">cách </w:t>
+      </w:r>
+      <w:r>
+        <w:t>giao tiếp và tuân thủ</w:t>
+      </w:r>
+      <w:r>
+        <w:t xml:space="preserve"> chặt chẽ</w:t>
+      </w:r>
+      <w:r>
+        <w:t xml:space="preserve"> quy trình </w:t>
+      </w:r>
+      <w:r>
+        <w:br/>
+      </w:r>
+      <w:r>
+        <w:t>phát triển phần mềm.</w:t>
       </w:r>
     </w:p>
     <w:p>
@@ -6033,7 +6147,25 @@
       </w:pPr>
       <w:r>
         <w:lastRenderedPageBreak/>
-        <w:t>Ở giai đoạn cuối của kỳ thực tập, tôi được định hướng nghiên cứu sâu hơn về các vấn đề liên quan đến thiết kế hệ thống và nền tảng Internal Developer Platform (IDP) trong môi trường enterprise. Bên cạnh việc hoàn thiện các công việc được giao, tôi còn tổng hợp lại kiến thức đã học, đánh giá kết quả đạt được và rút ra những kinh nghiệm cần thiết cho quá trình học tập và làm việc sau này.</w:t>
+        <w:t xml:space="preserve">Ở giai đoạn cuối của kỳ thực tập, tôi được định hướng nghiên cứu sâu hơn về các vấn đề liên quan đến thiết kế hệ thống và nền tảng Internal Developer Platform (IDP) trong môi trường </w:t>
+      </w:r>
+      <w:r>
+        <w:t>chuẩn doanh nghiệp</w:t>
+      </w:r>
+      <w:r>
+        <w:t xml:space="preserve">. Bên cạnh việc hoàn thiện các công việc </w:t>
+      </w:r>
+      <w:r>
+        <w:br/>
+      </w:r>
+      <w:r>
+        <w:t>được giao, tôi còn tổng hợp lại kiến thức đã học</w:t>
+      </w:r>
+      <w:r>
+        <w:t xml:space="preserve"> để có thể tự</w:t>
+      </w:r>
+      <w:r>
+        <w:t xml:space="preserve"> đánh giá kết quả đạt được và rút ra những kinh nghiệm cần thiết cho quá trình học tập và làm việc sau này</w:t>
       </w:r>
       <w:r>
         <w:t>.</w:t>
@@ -7056,7 +7188,7 @@
       </w:tr>
       <w:tr>
         <w:trPr>
-          <w:trHeight w:val="701"/>
+          <w:trHeight w:val="1270"/>
         </w:trPr>
         <w:tc>
           <w:tcPr>
@@ -7161,7 +7293,7 @@
       </w:tr>
       <w:tr>
         <w:trPr>
-          <w:trHeight w:val="839"/>
+          <w:trHeight w:val="988"/>
         </w:trPr>
         <w:tc>
           <w:tcPr>
@@ -7191,6 +7323,7 @@
                 <w:sz w:val="26"/>
                 <w:szCs w:val="26"/>
               </w:rPr>
+              <w:lastRenderedPageBreak/>
               <w:t>08</w:t>
             </w:r>
           </w:p>
@@ -7266,7 +7399,7 @@
       </w:tr>
       <w:tr>
         <w:trPr>
-          <w:trHeight w:val="1061"/>
+          <w:trHeight w:val="983"/>
         </w:trPr>
         <w:tc>
           <w:tcPr>
@@ -7296,7 +7429,6 @@
                 <w:sz w:val="26"/>
                 <w:szCs w:val="26"/>
               </w:rPr>
-              <w:lastRenderedPageBreak/>
               <w:t>09</w:t>
             </w:r>
           </w:p>

</xml_diff>

<commit_message>
fix source code and codebase define
</commit_message>
<xml_diff>
--- a/BAO-CAO-THUC-TAP.docx
+++ b/BAO-CAO-THUC-TAP.docx
@@ -6022,7 +6022,13 @@
         <w:br/>
       </w:r>
       <w:r>
-        <w:t xml:space="preserve">quản lý công việc thông qua JIRA và quản lý mã nguồn bằng GitLab. </w:t>
+        <w:t xml:space="preserve">quản lý công việc thông qua JIRA và quản lý </w:t>
+      </w:r>
+      <w:r>
+        <w:t>code base</w:t>
+      </w:r>
+      <w:r>
+        <w:t xml:space="preserve"> bằng GitLab. </w:t>
       </w:r>
       <w:r>
         <w:t>Đây là giai đoạn</w:t>
@@ -15196,7 +15202,13 @@
         <w:br/>
       </w:r>
       <w:r>
-        <w:t xml:space="preserve">Visual Studio hoặc Visual Studio Code để viết mã nguồn, DBeaver để quản trị và </w:t>
+        <w:t xml:space="preserve">Visual Studio hoặc Visual Studio Code để viết </w:t>
+      </w:r>
+      <w:r>
+        <w:t>code</w:t>
+      </w:r>
+      <w:r>
+        <w:t xml:space="preserve">, DBeaver để quản trị và </w:t>
       </w:r>
       <w:r>
         <w:br/>
@@ -15217,7 +15229,13 @@
         <w:ind w:firstLine="567"/>
       </w:pPr>
       <w:r>
-        <w:t>Bên cạnh đó, sinh viên được trực tiếp tham gia vào quy trình quản lý mã nguồn của dự án thông qua hệ thống Git</w:t>
+        <w:t>Bên cạnh đó, sinh viên được trực tiếp tham gia vào quy trình quản lý</w:t>
+      </w:r>
+      <w:r>
+        <w:t xml:space="preserve"> code base</w:t>
+      </w:r>
+      <w:r>
+        <w:t xml:space="preserve"> của dự án thông qua hệ thống Git</w:t>
       </w:r>
       <w:r>
         <w:t>Lab</w:t>
@@ -15235,7 +15253,13 @@
         <w:br/>
       </w:r>
       <w:r>
-        <w:t xml:space="preserve">Git Flow, sinh viên đã hiểu rõ cách tổ chức các nhánh mã nguồn, quy trình tạo </w:t>
+        <w:t xml:space="preserve">Git Flow, sinh viên đã hiểu rõ cách tổ chức các nhánh </w:t>
+      </w:r>
+      <w:r>
+        <w:t>code</w:t>
+      </w:r>
+      <w:r>
+        <w:t xml:space="preserve">, quy trình tạo </w:t>
       </w:r>
       <w:r>
         <w:br/>
@@ -15266,7 +15290,13 @@
         <w:ind w:firstLine="567"/>
       </w:pPr>
       <w:r>
-        <w:t xml:space="preserve">Ngoài việc viết mã, sinh viên còn được tham gia vào các buổi họp khởi động </w:t>
+        <w:t xml:space="preserve">Ngoài việc viết </w:t>
+      </w:r>
+      <w:r>
+        <w:t>code</w:t>
+      </w:r>
+      <w:r>
+        <w:t xml:space="preserve">, sinh viên còn được tham gia vào các buổi họp khởi động </w:t>
       </w:r>
       <w:r>
         <w:br/>
@@ -15290,7 +15320,13 @@
         <w:br/>
       </w:r>
       <w:r>
-        <w:t>tư duy phân tích hệ thống thay vì chỉ tập trung vào việc viết mã đơn lẻ.</w:t>
+        <w:t xml:space="preserve">tư duy phân tích hệ thống thay vì chỉ tập trung vào việc viết </w:t>
+      </w:r>
+      <w:r>
+        <w:t xml:space="preserve">code </w:t>
+      </w:r>
+      <w:r>
+        <w:t>đơn lẻ.</w:t>
       </w:r>
     </w:p>
     <w:p>
@@ -15342,7 +15378,16 @@
         <w:br/>
       </w:r>
       <w:r>
-        <w:t>mã nguồn. Thay vì xây dựng mới hoàn toàn, sinh viên được hướng dẫn cách tái cấu trúc mã nguồn nhằm nâng cao hiệu suất</w:t>
+        <w:t>code base</w:t>
+      </w:r>
+      <w:r>
+        <w:t xml:space="preserve">. Thay vì xây dựng mới hoàn toàn, sinh viên được hướng dẫn cách tái cấu trúc </w:t>
+      </w:r>
+      <w:r>
+        <w:t>code base</w:t>
+      </w:r>
+      <w:r>
+        <w:t xml:space="preserve"> nhằm nâng cao hiệu suất</w:t>
       </w:r>
       <w:r>
         <w:t xml:space="preserve"> </w:t>
@@ -15426,7 +15471,13 @@
         <w:br/>
       </w:r>
       <w:r>
-        <w:t>viết mã gọn gàng, dễ đọc và hiệu quả hơn.</w:t>
+        <w:t xml:space="preserve">viết </w:t>
+      </w:r>
+      <w:r>
+        <w:t>code</w:t>
+      </w:r>
+      <w:r>
+        <w:t xml:space="preserve"> gọn gàng, dễ đọc và hiệu quả hơn.</w:t>
       </w:r>
     </w:p>
     <w:p>
@@ -15457,7 +15508,13 @@
         <w:br/>
       </w:r>
       <w:r>
-        <w:t>từ đó hiểu được cách tổ chức mã nguồn theo hướng linh hoạt, dễ mở rộng và thuận tiện cho việc kiểm thử.</w:t>
+        <w:t xml:space="preserve">từ đó hiểu được cách tổ chức </w:t>
+      </w:r>
+      <w:r>
+        <w:t>code base</w:t>
+      </w:r>
+      <w:r>
+        <w:t xml:space="preserve"> theo hướng linh hoạt, dễ mở rộng và thuận tiện cho việc kiểm thử.</w:t>
       </w:r>
     </w:p>
     <w:p>
@@ -15759,19 +15816,25 @@
         <w:br/>
       </w:r>
       <w:r>
-        <w:t xml:space="preserve">quản lý mã nguồn tập trung, nơi lưu trữ toàn bộ </w:t>
-      </w:r>
-      <w:r>
-        <w:t>mã nguồn</w:t>
-      </w:r>
-      <w:r>
-        <w:t xml:space="preserve"> của dự án. Thông qua GitLab, sinh viên có thể truy cập repository, theo dõi lịch sử thay đổi mã nguồn, </w:t>
-      </w:r>
-      <w:r>
-        <w:br/>
-      </w:r>
-      <w:r>
-        <w:t>cũng như phối hợp làm việc với các thành viên khác trong nhóm phát triển.</w:t>
+        <w:t xml:space="preserve">quản lý </w:t>
+      </w:r>
+      <w:r>
+        <w:t>code base</w:t>
+      </w:r>
+      <w:r>
+        <w:t xml:space="preserve"> tập trung, nơi lưu trữ toàn bộ </w:t>
+      </w:r>
+      <w:r>
+        <w:t>source code</w:t>
+      </w:r>
+      <w:r>
+        <w:t xml:space="preserve"> của dự án. Thông qua GitLab, sinh viên có thể truy cập repository, theo dõi lịch sử thay đổi </w:t>
+      </w:r>
+      <w:r>
+        <w:t>code</w:t>
+      </w:r>
+      <w:r>
+        <w:t>, cũng như phối hợp làm việc với các thành viên khác trong nhóm phát triển.</w:t>
       </w:r>
     </w:p>
     <w:p>
@@ -15838,7 +15901,13 @@
         <w:br/>
       </w:r>
       <w:r>
-        <w:t xml:space="preserve">từ quản lý mã nguồn, quản lý công việc cho đến phối hợp giữa các thành viên </w:t>
+        <w:t xml:space="preserve">từ quản lý </w:t>
+      </w:r>
+      <w:r>
+        <w:t>codebase</w:t>
+      </w:r>
+      <w:r>
+        <w:t xml:space="preserve">, quản lý công việc cho đến phối hợp giữa các thành viên </w:t>
       </w:r>
       <w:r>
         <w:br/>
@@ -15874,13 +15943,31 @@
         <w:br/>
       </w:r>
       <w:r>
-        <w:t xml:space="preserve">chỉnh sửa nhanh mã nguồn, xem log hệ thống hoặc kiểm tra các file cấu hình. Sinh viên cũng cài đặt và sử dụng DBeaver để quản lý cơ sở dữ liệu, thực hiện các thao tác </w:t>
+        <w:t xml:space="preserve">chỉnh sửa nhanh </w:t>
+      </w:r>
+      <w:r>
+        <w:t>source code</w:t>
+      </w:r>
+      <w:r>
+        <w:t xml:space="preserve">, xem log hệ thống hoặc kiểm tra các file cấu hình. </w:t>
       </w:r>
       <w:r>
         <w:br/>
       </w:r>
       <w:r>
-        <w:t>truy vấn, kiểm tra dữ liệu và phân tích mối quan hệ giữa các bảng trong hệ thống.</w:t>
+        <w:t xml:space="preserve">Sinh viên cũng cài đặt và sử dụng DBeaver để quản lý cơ sở dữ liệu, thực hiện các </w:t>
+      </w:r>
+      <w:r>
+        <w:br/>
+      </w:r>
+      <w:r>
+        <w:t xml:space="preserve">thao tác truy vấn, kiểm tra dữ liệu và phân tích mối quan hệ giữa các bảng trong </w:t>
+      </w:r>
+      <w:r>
+        <w:br/>
+      </w:r>
+      <w:r>
+        <w:t>hệ thống.</w:t>
       </w:r>
     </w:p>
     <w:p>
@@ -15901,7 +15988,19 @@
         <w:br/>
       </w:r>
       <w:r>
-        <w:t>đúng đắn của dữ liệu trả về. Việc làm quen với các công cụ này giúp sinh viên hiểu rõ mối liên hệ giữa mã nguồn backend và dữ liệu thực tế được xử lý trong hệ thống.</w:t>
+        <w:t>đúng đắn của dữ liệu trả về. Việc làm quen với các công cụ này giúp sinh viên hiểu rõ mối liên hệ giữa</w:t>
+      </w:r>
+      <w:r>
+        <w:t xml:space="preserve"> source</w:t>
+      </w:r>
+      <w:r>
+        <w:t xml:space="preserve"> </w:t>
+      </w:r>
+      <w:r>
+        <w:t>code</w:t>
+      </w:r>
+      <w:r>
+        <w:t xml:space="preserve"> backend và dữ liệu thực tế được xử lý trong hệ thống.</w:t>
       </w:r>
     </w:p>
     <w:p>
@@ -15910,7 +16009,19 @@
         <w:ind w:firstLine="567"/>
       </w:pPr>
       <w:r>
-        <w:t>Trong suốt quá trình thực tập, sinh viên sử dụng Git như công cụ chính để quản lý phiên bản mã nguồn và phối hợp làm việc nhóm trong môi trường dự án thực tế. Khác với việc sử dụng Git ở mức cơ bản trong quá trình học tập tại trường, tại doanh nghiệp Git được áp dụng theo một quy trình chặt chẽ, có phân quyền rõ ràng theo vai trò và gắn liền với các môi trường triển khai khác nhau của hệ thống.</w:t>
+        <w:t xml:space="preserve">Trong suốt quá trình thực tập, sinh viên sử dụng Git như công cụ chính để quản lý phiên bản </w:t>
+      </w:r>
+      <w:r>
+        <w:t>source code</w:t>
+      </w:r>
+      <w:r>
+        <w:t xml:space="preserve"> và phối hợp làm việc nhóm trong môi trường dự án thực tế. </w:t>
+      </w:r>
+      <w:r>
+        <w:br/>
+      </w:r>
+      <w:r>
+        <w:t>Khác với việc sử dụng Git ở mức cơ bản trong quá trình học tập tại trường, tại doanh nghiệp Git được áp dụng theo một quy trình chặt chẽ, có phân quyền rõ ràng theo vai trò và gắn liền với các môi trường triển khai khác nhau của hệ thống.</w:t>
       </w:r>
     </w:p>
     <w:p>
@@ -15934,7 +16045,23 @@
         <w:rPr>
           <w:lang w:val="vi-VN"/>
         </w:rPr>
-        <w:t>(Role-based Permissions) trong nhóm phát triển. Mỗi vai trò trong dự án có phạm vi trách nhiệm và quyền hạn khác nhau nhằm đảm bảo tính an toàn, ổn định và kiểm soát chất lượng của mã nguồn. Ở vai trò Developer</w:t>
+        <w:t xml:space="preserve">(Role-based Permissions) trong nhóm phát triển. Mỗi vai trò trong dự án có phạm vi trách nhiệm và quyền hạn khác nhau nhằm đảm bảo tính an toàn, ổn định và kiểm soát </w:t>
+      </w:r>
+      <w:r>
+        <w:rPr>
+          <w:lang w:val="vi-VN"/>
+        </w:rPr>
+        <w:lastRenderedPageBreak/>
+        <w:t xml:space="preserve">chất lượng của </w:t>
+      </w:r>
+      <w:r>
+        <w:t>codebase</w:t>
+      </w:r>
+      <w:r>
+        <w:rPr>
+          <w:lang w:val="vi-VN"/>
+        </w:rPr>
+        <w:t>. Ở vai trò Developer</w:t>
       </w:r>
       <w:r>
         <w:t>,</w:t>
@@ -15943,14 +16070,61 @@
         <w:rPr>
           <w:lang w:val="vi-VN"/>
         </w:rPr>
-        <w:t xml:space="preserve"> sinh viên có quyền tạo và làm việc trên </w:t>
-      </w:r>
-      <w:r>
-        <w:rPr>
-          <w:lang w:val="vi-VN"/>
-        </w:rPr>
-        <w:lastRenderedPageBreak/>
-        <w:t xml:space="preserve">các nhánh chức năng (feature branch), nhánh sửa lỗi (bugfix), thực hiện commit và push mã nguồn, cũng như tạo Pull Request/Merge Request để đề xuất gộp mã vào nhánh </w:t>
+        <w:t xml:space="preserve"> sinh viên có quyền tạo và làm việc trên các nhánh chức năng (feature branch), nhánh sửa lỗi (bugfix), thực hiện commit và push </w:t>
+      </w:r>
+      <w:r>
+        <w:t>source code</w:t>
+      </w:r>
+      <w:r>
+        <w:rPr>
+          <w:lang w:val="vi-VN"/>
+        </w:rPr>
+        <w:t>, cũng như tạo Pull Request/Merge Request để đề xuất gộp</w:t>
+      </w:r>
+      <w:r>
+        <w:t xml:space="preserve"> source</w:t>
+      </w:r>
+      <w:r>
+        <w:rPr>
+          <w:lang w:val="vi-VN"/>
+        </w:rPr>
+        <w:t xml:space="preserve"> </w:t>
+      </w:r>
+      <w:r>
+        <w:t>code</w:t>
+      </w:r>
+      <w:r>
+        <w:rPr>
+          <w:lang w:val="vi-VN"/>
+        </w:rPr>
+        <w:t xml:space="preserve"> vào nhánh phát triển chung (dev). Tuy nhiên, sinh viên không được phép merge trực tiếp vào các nhánh môi trường như </w:t>
+      </w:r>
+      <w:r>
+        <w:t>UAT</w:t>
+      </w:r>
+      <w:r>
+        <w:rPr>
+          <w:lang w:val="vi-VN"/>
+        </w:rPr>
+        <w:t xml:space="preserve">, </w:t>
+      </w:r>
+      <w:r>
+        <w:t>S</w:t>
+      </w:r>
+      <w:r>
+        <w:rPr>
+          <w:lang w:val="vi-VN"/>
+        </w:rPr>
+        <w:t xml:space="preserve">taging hoặc </w:t>
+      </w:r>
+      <w:r>
+        <w:t>P</w:t>
+      </w:r>
+      <w:r>
+        <w:rPr>
+          <w:lang w:val="vi-VN"/>
+        </w:rPr>
+        <w:t xml:space="preserve">roduction nhằm tránh rủi ro </w:t>
       </w:r>
       <w:r>
         <w:br/>
@@ -15959,16 +16133,7 @@
         <w:rPr>
           <w:lang w:val="vi-VN"/>
         </w:rPr>
-        <w:t xml:space="preserve">phát triển chung (dev). Tuy nhiên, sinh viên không được phép merge trực tiếp vào các nhánh môi trường như uat, staging hoặc production nhằm tránh rủi ro ảnh hưởng đến </w:t>
-      </w:r>
-      <w:r>
-        <w:br/>
-      </w:r>
-      <w:r>
-        <w:rPr>
-          <w:lang w:val="vi-VN"/>
-        </w:rPr>
-        <w:t>hệ thống.</w:t>
+        <w:t>ảnh hưởng đến hệ thống.</w:t>
       </w:r>
     </w:p>
     <w:p>
@@ -15983,7 +16148,34 @@
         <w:rPr>
           <w:lang w:val="vi-VN"/>
         </w:rPr>
-        <w:t xml:space="preserve">Thông qua đó, sinh viên hiểu rõ hơn vai trò của Senior Developer và Tech Lead trong quy trình phát triển phần mềm. Senior Developer chịu trách nhiệm review mã nguồn, merge các thay đổi vào nhánh dev và uat, cũng như xử lý các hotfix ở mức độ hệ thống. Tech Lead là người có quyền cao nhất đối với mã nguồn, chịu trách nhiệm merge vào các nhánh staging và production, quản lý chiến lược branching, phát hành </w:t>
+        <w:t xml:space="preserve">Thông qua đó, sinh viên hiểu rõ hơn vai trò của Senior Developer và Tech Lead trong quy trình phát triển phần mềm. Senior Developer chịu trách nhiệm review </w:t>
+      </w:r>
+      <w:r>
+        <w:t>code</w:t>
+      </w:r>
+      <w:r>
+        <w:rPr>
+          <w:lang w:val="vi-VN"/>
+        </w:rPr>
+        <w:t xml:space="preserve"> nguồn, merge các thay đổi vào nhánh dev và </w:t>
+      </w:r>
+      <w:r>
+        <w:t>UAT</w:t>
+      </w:r>
+      <w:r>
+        <w:rPr>
+          <w:lang w:val="vi-VN"/>
+        </w:rPr>
+        <w:t xml:space="preserve">, cũng như xử lý các hotfix ở mức độ hệ thống. Tech Lead là người có quyền cao nhất đối với </w:t>
+      </w:r>
+      <w:r>
+        <w:t>codebase</w:t>
+      </w:r>
+      <w:r>
+        <w:rPr>
+          <w:lang w:val="vi-VN"/>
+        </w:rPr>
+        <w:t xml:space="preserve">, chịu trách nhiệm merge vào các nhánh staging và production, quản lý chiến lược branching, phát hành </w:t>
       </w:r>
       <w:r>
         <w:t xml:space="preserve">các </w:t>
@@ -15995,7 +16187,13 @@
         <w:t>phiên bản và xử lý các tình huống khẩn cấp. Việc phân quyền này giúp sinh viên nhận thức rõ tầm quan trọng của kiểm soát rủi ro trong các dự án phần mềm quy mô lớn</w:t>
       </w:r>
       <w:r>
-        <w:t xml:space="preserve"> và sức nặng của từng vai trò trong nhóm</w:t>
+        <w:t xml:space="preserve"> và vai trò</w:t>
+      </w:r>
+      <w:r>
+        <w:t xml:space="preserve"> của từng vị trí</w:t>
+      </w:r>
+      <w:r>
+        <w:t xml:space="preserve"> trong nhóm</w:t>
       </w:r>
       <w:r>
         <w:rPr>
@@ -16016,7 +16214,28 @@
         <w:rPr>
           <w:lang w:val="vi-VN"/>
         </w:rPr>
-        <w:t xml:space="preserve">Bên cạnh phân quyền, sinh viên được hướng dẫn chi tiết về cấu trúc các nhánh trong dự án. Hệ thống mã nguồn được tổ chức theo mô hình nhiều môi trường, bao gồm nhánh dev phục vụ phát triển và kiểm thử nội bộ, nhánh uat dùng cho kiểm thử, </w:t>
+        <w:t xml:space="preserve">Bên cạnh phân quyền, sinh viên được hướng dẫn chi tiết về cấu trúc các nhánh trong dự án. </w:t>
+      </w:r>
+      <w:r>
+        <w:t>Code</w:t>
+      </w:r>
+      <w:r>
+        <w:t>base</w:t>
+      </w:r>
+      <w:r>
+        <w:rPr>
+          <w:lang w:val="vi-VN"/>
+        </w:rPr>
+        <w:t xml:space="preserve"> được tổ chức theo mô hình nhiều môi trường, bao gồm nhánh dev phục vụ phát triển và kiểm thử nội bộ, nhánh </w:t>
+      </w:r>
+      <w:r>
+        <w:t>UAT</w:t>
+      </w:r>
+      <w:r>
+        <w:rPr>
+          <w:lang w:val="vi-VN"/>
+        </w:rPr>
+        <w:t xml:space="preserve"> dùng cho kiểm thử, </w:t>
       </w:r>
       <w:r>
         <w:br/>
@@ -16025,7 +16244,25 @@
         <w:rPr>
           <w:lang w:val="vi-VN"/>
         </w:rPr>
-        <w:t xml:space="preserve">nhánh staging cho kiểm thử tiền triển khai và nhánh production cho hệ thống đang </w:t>
+        <w:t xml:space="preserve">nhánh </w:t>
+      </w:r>
+      <w:r>
+        <w:t>S</w:t>
+      </w:r>
+      <w:r>
+        <w:rPr>
+          <w:lang w:val="vi-VN"/>
+        </w:rPr>
+        <w:t xml:space="preserve">taging cho kiểm thử tiền triển khai và nhánh </w:t>
+      </w:r>
+      <w:r>
+        <w:t>P</w:t>
+      </w:r>
+      <w:r>
+        <w:rPr>
+          <w:lang w:val="vi-VN"/>
+        </w:rPr>
+        <w:t xml:space="preserve">roduction cho hệ thống đang </w:t>
       </w:r>
       <w:r>
         <w:br/>
@@ -16034,7 +16271,16 @@
         <w:rPr>
           <w:lang w:val="vi-VN"/>
         </w:rPr>
-        <w:t>vận hành thực tế. Ngoài ra, các nhánh làm việc như feature, bugfix, hotfix và refactor được sử dụng để phát triển các chức năng cụ thể, sửa lỗi hoặc cải tiến mã nguồn mà không ảnh hưởng trực tiếp đến các nhánh môi trường.</w:t>
+        <w:t xml:space="preserve">vận hành thực tế. Ngoài ra, các nhánh làm việc như feature, bugfix, hotfix và refactor được sử dụng để phát triển các chức năng cụ thể, sửa lỗi hoặc cải tiến </w:t>
+      </w:r>
+      <w:r>
+        <w:t>source code</w:t>
+      </w:r>
+      <w:r>
+        <w:rPr>
+          <w:lang w:val="vi-VN"/>
+        </w:rPr>
+        <w:t xml:space="preserve"> mà không ảnh hưởng trực tiếp đến các nhánh môi trường.</w:t>
       </w:r>
     </w:p>
     <w:p>
@@ -16058,13 +16304,13 @@
         <w:t>Tên nhánh bao gồm loại công việc</w:t>
       </w:r>
       <w:r>
-        <w:t xml:space="preserve"> (type)</w:t>
-      </w:r>
-      <w:r>
-        <w:rPr>
-          <w:lang w:val="vi-VN"/>
-        </w:rPr>
-        <w:t xml:space="preserve">, mã </w:t>
+        <w:t>,</w:t>
+      </w:r>
+      <w:r>
+        <w:rPr>
+          <w:lang w:val="vi-VN"/>
+        </w:rPr>
+        <w:t xml:space="preserve"> mã </w:t>
       </w:r>
       <w:r>
         <w:t>nhiệm vụ</w:t>
@@ -16091,16 +16337,7 @@
         <w:rPr>
           <w:lang w:val="vi-VN"/>
         </w:rPr>
-        <w:t xml:space="preserve">Quy ước này giúp toàn bộ nhóm dễ dàng nhận biết mục đích của từng nhánh, truy vết nhiệm vụ liên quan và nâng cao tính minh bạch trong quá trình làm việc nhóm. </w:t>
-      </w:r>
-      <w:r>
-        <w:t xml:space="preserve">Từ đây, sinh viên có thể hiểu được vai trò của tính đồng bộ từ các nhiệm vụ sang quản lý </w:t>
-      </w:r>
-      <w:r>
-        <w:br/>
-      </w:r>
-      <w:r>
-        <w:t>mã nguồn khi có nhiều thành viên.</w:t>
+        <w:t>Quy ước này giúp toàn bộ nhóm dễ dàng nhận biết mục đích của từng nhánh, truy vết nhiệm vụ liên quan và nâng cao tính minh bạch trong quá trình làm việc nhóm.</w:t>
       </w:r>
     </w:p>
     <w:p>
@@ -16142,7 +16379,16 @@
         <w:rPr>
           <w:lang w:val="vi-VN"/>
         </w:rPr>
-        <w:t xml:space="preserve"> thêm chức năng, sửa lỗi, refactor, cập nhật tài liệu…, phạm vi ảnh hưởng và liên kết với </w:t>
+        <w:t xml:space="preserve"> thêm chức năng, sửa lỗi, refactor, cập nhật tài liệ</w:t>
+      </w:r>
+      <w:r>
+        <w:t>u</w:t>
+      </w:r>
+      <w:r>
+        <w:rPr>
+          <w:lang w:val="vi-VN"/>
+        </w:rPr>
+        <w:t xml:space="preserve">, phạm vi ảnh hưởng và liên kết với </w:t>
       </w:r>
       <w:r>
         <w:t>mã JIRA</w:t>
@@ -16158,7 +16404,16 @@
           <w:lang w:val="vi-VN"/>
         </w:rPr>
         <w:lastRenderedPageBreak/>
-        <w:t xml:space="preserve">chuẩn commit giúp lịch sử mã nguồn trở nên rõ ràng, dễ đọc và hỗ trợ hiệu quả cho </w:t>
+        <w:t xml:space="preserve">chuẩn commit giúp lịch sử </w:t>
+      </w:r>
+      <w:r>
+        <w:t>source code</w:t>
+      </w:r>
+      <w:r>
+        <w:rPr>
+          <w:lang w:val="vi-VN"/>
+        </w:rPr>
+        <w:t xml:space="preserve"> trở nên rõ ràng, dễ đọc và hỗ trợ hiệu quả cho </w:t>
       </w:r>
       <w:r>
         <w:br/>
@@ -16182,7 +16437,25 @@
         <w:rPr>
           <w:lang w:val="vi-VN"/>
         </w:rPr>
-        <w:t>Trong quá trình làm việc, sinh viên thực hiện đầy đủ quy trình chuẩn từ việc đồng bộ mã nguồn mới nhất từ nhánh dev, tạo nhánh chức năng riêng</w:t>
+        <w:t xml:space="preserve">Trong quá trình làm việc, sinh viên thực hiện đầy đủ quy trình chuẩn từ việc </w:t>
+      </w:r>
+      <w:r>
+        <w:br/>
+      </w:r>
+      <w:r>
+        <w:rPr>
+          <w:lang w:val="vi-VN"/>
+        </w:rPr>
+        <w:t xml:space="preserve">đồng bộ </w:t>
+      </w:r>
+      <w:r>
+        <w:t>source code</w:t>
+      </w:r>
+      <w:r>
+        <w:rPr>
+          <w:lang w:val="vi-VN"/>
+        </w:rPr>
+        <w:t xml:space="preserve"> mới nhất từ nhánh dev, tạo nhánh chức năng riêng</w:t>
       </w:r>
       <w:r>
         <w:t xml:space="preserve"> để</w:t>
@@ -16191,7 +16464,19 @@
         <w:rPr>
           <w:lang w:val="vi-VN"/>
         </w:rPr>
-        <w:t xml:space="preserve"> phát triển và commit mã nguồn theo từng phần nhỏ, sau đó push lên repository và tạo </w:t>
+        <w:t xml:space="preserve"> phát triển và commit </w:t>
+      </w:r>
+      <w:r>
+        <w:t>source code</w:t>
+      </w:r>
+      <w:r>
+        <w:rPr>
+          <w:lang w:val="vi-VN"/>
+        </w:rPr>
+        <w:t xml:space="preserve"> theo từng phần nhỏ, sau đó push lên repository và tạo </w:t>
+      </w:r>
+      <w:r>
+        <w:br/>
       </w:r>
       <w:r>
         <w:t>Merge</w:t>
@@ -16203,13 +16488,46 @@
         <w:t xml:space="preserve"> Request để được review. </w:t>
       </w:r>
       <w:r>
-        <w:t>Sau đó là</w:t>
-      </w:r>
-      <w:r>
-        <w:rPr>
-          <w:lang w:val="vi-VN"/>
-        </w:rPr>
-        <w:t xml:space="preserve"> cách rebase nhánh làm việc với nhánh dev nhằm hạn chế xung đột </w:t>
+        <w:t>Sau đó</w:t>
+      </w:r>
+      <w:r>
+        <w:t>, sinh viên cũng được hướng dẫn thực hiện</w:t>
+      </w:r>
+      <w:r>
+        <w:rPr>
+          <w:lang w:val="vi-VN"/>
+        </w:rPr>
+        <w:t xml:space="preserve"> rebase nhánh làm việc với nhánh dev nhằm hạn chế xung đột </w:t>
+      </w:r>
+      <w:r>
+        <w:t>source code</w:t>
+      </w:r>
+      <w:r>
+        <w:rPr>
+          <w:lang w:val="vi-VN"/>
+        </w:rPr>
+        <w:t xml:space="preserve"> và giữ lịch sử commit gọn gàng</w:t>
+      </w:r>
+      <w:r>
+        <w:t xml:space="preserve">, </w:t>
+      </w:r>
+      <w:r>
+        <w:t>nhất quán</w:t>
+      </w:r>
+      <w:r>
+        <w:rPr>
+          <w:lang w:val="vi-VN"/>
+        </w:rPr>
+        <w:t xml:space="preserve">. Thông qua quá trình </w:t>
+      </w:r>
+      <w:r>
+        <w:t>review code</w:t>
+      </w:r>
+      <w:r>
+        <w:rPr>
+          <w:lang w:val="vi-VN"/>
+        </w:rPr>
+        <w:t xml:space="preserve">, sinh viên tiếp thu được </w:t>
       </w:r>
       <w:r>
         <w:br/>
@@ -16218,28 +16536,10 @@
         <w:rPr>
           <w:lang w:val="vi-VN"/>
         </w:rPr>
-        <w:t>mã nguồn và giữ lịch sử commit gọn gàng</w:t>
-      </w:r>
-      <w:r>
-        <w:t>, thông suốt</w:t>
-      </w:r>
-      <w:r>
-        <w:rPr>
-          <w:lang w:val="vi-VN"/>
-        </w:rPr>
-        <w:t xml:space="preserve">. Thông qua quá trình </w:t>
-      </w:r>
-      <w:r>
-        <w:t>kiểm tra mã</w:t>
-      </w:r>
-      <w:r>
-        <w:rPr>
-          <w:lang w:val="vi-VN"/>
-        </w:rPr>
-        <w:t xml:space="preserve">, sinh viên tiếp thu được nhiều kinh nghiệm về cách viết </w:t>
-      </w:r>
-      <w:r>
-        <w:t>mã</w:t>
+        <w:t xml:space="preserve">nhiều kinh nghiệm về cách viết </w:t>
+      </w:r>
+      <w:r>
+        <w:t>code</w:t>
       </w:r>
       <w:r>
         <w:rPr>
@@ -16323,7 +16623,17 @@
         <w:t>thực hiện việc xây dựng</w:t>
       </w:r>
       <w:r>
-        <w:t xml:space="preserve">, chỉnh sửa và kiểm tra mã khi xây dựng hoặc </w:t>
+        <w:t xml:space="preserve">, chỉnh sửa và kiểm tra </w:t>
+      </w:r>
+      <w:r>
+        <w:br/>
+        <w:t xml:space="preserve">source </w:t>
+      </w:r>
+      <w:r>
+        <w:t>code</w:t>
+      </w:r>
+      <w:r>
+        <w:t xml:space="preserve"> khi xây dựng hoặc </w:t>
       </w:r>
       <w:r>
         <w:t>khắc phục</w:t>
@@ -16347,67 +16657,82 @@
         <w:t xml:space="preserve"> hỗ trợ</w:t>
       </w:r>
       <w:r>
-        <w:t xml:space="preserve"> debug để có thể </w:t>
+        <w:t xml:space="preserve"> debug để có thể phát hiện sớm các lỗi đang tồn tại trong ứng dụng. </w:t>
+      </w:r>
+      <w:r>
+        <w:t xml:space="preserve">Việc </w:t>
+      </w:r>
+      <w:r>
+        <w:t xml:space="preserve">kiểm soát môi trường dev </w:t>
+      </w:r>
+      <w:r>
+        <w:t>được kiểm soát qua hệ thống</w:t>
+      </w:r>
+      <w:r>
+        <w:t xml:space="preserve"> </w:t>
+      </w:r>
+      <w:r>
+        <w:t xml:space="preserve">quản lý </w:t>
+      </w:r>
+      <w:r>
+        <w:t>codebase</w:t>
+      </w:r>
+      <w:r>
+        <w:t xml:space="preserve"> bằng</w:t>
+      </w:r>
+      <w:r>
+        <w:t xml:space="preserve"> </w:t>
+      </w:r>
+      <w:r>
+        <w:t>Git</w:t>
+      </w:r>
+      <w:r>
+        <w:t xml:space="preserve">, kết hợp với quy trình </w:t>
       </w:r>
       <w:r>
         <w:br/>
       </w:r>
       <w:r>
-        <w:t xml:space="preserve">phát hiện sớm các lỗi đang tồn tại trong ứng dụng. </w:t>
-      </w:r>
-      <w:r>
-        <w:t xml:space="preserve">Việc </w:t>
-      </w:r>
-      <w:r>
-        <w:t xml:space="preserve">kiểm soát môi trường dev </w:t>
+        <w:t>Continuo</w:t>
+      </w:r>
+      <w:r>
+        <w:t>u</w:t>
+      </w:r>
+      <w:r>
+        <w:t>s Integration</w:t>
+      </w:r>
+      <w:r>
+        <w:t xml:space="preserve"> </w:t>
+      </w:r>
+      <w:r>
+        <w:t>(</w:t>
+      </w:r>
+      <w:r>
+        <w:t>CI</w:t>
+      </w:r>
+      <w:r>
+        <w:t>)</w:t>
+      </w:r>
+      <w:r>
+        <w:t xml:space="preserve"> </w:t>
+      </w:r>
+      <w:r>
+        <w:t>nhằm</w:t>
+      </w:r>
+      <w:r>
+        <w:t xml:space="preserve"> tự động kiểm tra những gì đã thay đổi</w:t>
+      </w:r>
+      <w:r>
+        <w:t xml:space="preserve">, đảm bảo </w:t>
       </w:r>
       <w:r>
         <w:br/>
       </w:r>
       <w:r>
-        <w:t>được kiểm soát qua hệ thống</w:t>
-      </w:r>
-      <w:r>
-        <w:t xml:space="preserve"> </w:t>
-      </w:r>
-      <w:r>
-        <w:t xml:space="preserve">quản lý mã nguồn </w:t>
-      </w:r>
-      <w:r>
-        <w:t>Git</w:t>
-      </w:r>
-      <w:r>
-        <w:t xml:space="preserve">, kết hợp với quy trình </w:t>
-      </w:r>
-      <w:r>
-        <w:br/>
-      </w:r>
-      <w:r>
-        <w:t>Continuos Integration</w:t>
-      </w:r>
-      <w:r>
-        <w:t xml:space="preserve"> </w:t>
-      </w:r>
-      <w:r>
-        <w:t>(</w:t>
-      </w:r>
-      <w:r>
-        <w:t>CI</w:t>
-      </w:r>
-      <w:r>
-        <w:t>)</w:t>
-      </w:r>
-      <w:r>
-        <w:t xml:space="preserve"> để có thể tự động kiểm tra những gì đã thay đổi</w:t>
-      </w:r>
-      <w:r>
-        <w:t xml:space="preserve">, đảm bảo </w:t>
-      </w:r>
-      <w:r>
-        <w:br/>
-      </w:r>
-      <w:r>
-        <w:t>mã nguồn mới được tích hợp một cách an toàn và nhất quán vào hệ thống chung</w:t>
+        <w:t>source code</w:t>
+      </w:r>
+      <w:r>
+        <w:t xml:space="preserve"> mới được tích hợp một cách an toàn và nhất quán</w:t>
       </w:r>
       <w:r>
         <w:t>.</w:t>
@@ -16449,14 +16774,23 @@
         <w:rPr>
           <w:lang w:val="vi-VN"/>
         </w:rPr>
-        <w:t xml:space="preserve">trước khi triển khai chính thức. Môi trường này có cấu hình và kiến trúc gần tương đồng với môi trường Production, giúp kiểm tra toàn diện hệ thống trong các điều kiện gần với </w:t>
+        <w:t xml:space="preserve">trước khi triển khai chính thức. Môi trường này có cấu hình và kiến trúc gần tương đồng với môi trường Production, </w:t>
+      </w:r>
+      <w:r>
+        <w:t>cho phép</w:t>
+      </w:r>
+      <w:r>
+        <w:rPr>
+          <w:lang w:val="vi-VN"/>
+        </w:rPr>
+        <w:t xml:space="preserve"> kiểm tra toàn diện hệ thống trong các điều kiện </w:t>
       </w:r>
       <w:r>
         <w:rPr>
           <w:lang w:val="vi-VN"/>
         </w:rPr>
         <w:lastRenderedPageBreak/>
-        <w:t xml:space="preserve">thực tế. Tại đây, các tình huống vận hành thực tế được áp dụng để kiểm thử, bao gồm kiểm tra hiệu năng, độ ổn định và khả năng chịu tải của hệ thống. Đồng thời, lập trình viên và đội ngũ kỹ thuật có thể thực hiện các điều chỉnh cuối cùng nhằm đảm bảo </w:t>
+        <w:t xml:space="preserve">gần với thực tế. Tại đây, các tình huống vận hành thực tế được áp dụng để kiểm thử, </w:t>
       </w:r>
       <w:r>
         <w:br/>
@@ -16465,7 +16799,16 @@
         <w:rPr>
           <w:lang w:val="vi-VN"/>
         </w:rPr>
-        <w:t>phần mềm sẵn sàng cho giai đoạn triển khai.</w:t>
+        <w:t xml:space="preserve">bao gồm kiểm tra hiệu năng, độ ổn định và khả năng chịu tải của hệ thống. Đồng thời, lập trình viên và đội ngũ kỹ thuật có thể thực hiện các điều chỉnh cuối cùng nhằm </w:t>
+      </w:r>
+      <w:r>
+        <w:br/>
+      </w:r>
+      <w:r>
+        <w:rPr>
+          <w:lang w:val="vi-VN"/>
+        </w:rPr>
+        <w:t>đảm bảo phần mềm sẵn sàng cho giai đoạn triển khai.</w:t>
       </w:r>
     </w:p>
     <w:p>
@@ -16486,7 +16829,13 @@
         <w:ind w:firstLine="567"/>
       </w:pPr>
       <w:r>
-        <w:t xml:space="preserve">Trên cơ sở đó, sinh viên được hướng dẫn về quy trình luân chuyển mã nguồn giữa các môi trường, bắt đầu từ dev sang </w:t>
+        <w:t xml:space="preserve">Trên cơ sở đó, sinh viên được hướng dẫn về quy trình luân chuyển </w:t>
+      </w:r>
+      <w:r>
+        <w:t>code base</w:t>
+      </w:r>
+      <w:r>
+        <w:t xml:space="preserve"> giữa các môi trường, bắt đầu từ dev sang </w:t>
       </w:r>
       <w:r>
         <w:t>UAT</w:t>
@@ -16544,6 +16893,7 @@
     <w:p>
       <w:pPr>
         <w:spacing w:after="240" w:line="360" w:lineRule="auto"/>
+        <w:ind w:firstLine="567"/>
       </w:pPr>
       <w:r>
         <w:t>Sinh viên tham gia buổi kick-off của dự án nhằm nắm bắt tổng quan về hệ thống, mục tiêu phát triển, phạm vi triển khai và các yêu cầu nghiệp vụ chính. Thông qua buổi họp này, sinh viên hiểu được bối cảnh của dự án, đối tượng người dùng và vai trò của hệ thống trong hoạt động của doanh nghiệp.</w:t>
@@ -16552,6 +16902,7 @@
     <w:p>
       <w:pPr>
         <w:spacing w:after="240" w:line="360" w:lineRule="auto"/>
+        <w:ind w:firstLine="567"/>
       </w:pPr>
       <w:r>
         <w:t>Sau khi nắm bắt yêu cầu, sinh viên tiếp nhận các nhiệm vụ cụ thể được phân công từ nhóm trưởng hoặc mentor. Trong quá trình tiếp nhận nhiệm vụ, sinh viên chủ động trao đổi, đặt câu hỏi để làm rõ các yêu cầu chưa cụ thể, từ đó hạn chế sai sót trong quá trình triển khai.</w:t>
@@ -16560,49 +16911,39 @@
     <w:p>
       <w:pPr>
         <w:spacing w:after="240" w:line="360" w:lineRule="auto"/>
-      </w:pPr>
+        <w:ind w:firstLine="567"/>
+      </w:pPr>
+      <w:r>
+        <w:lastRenderedPageBreak/>
+        <w:t>Sinh viên được giao nhiệm vụ rà soát và kiểm tra các API đã được xây dựng từ các dự án trước đó. Công việc này bao gồm việc phân tích cấu trúc API, cách xử lý request/response, cũng như đánh giá khả năng tái sử dụng của các API trong bối cảnh dự án mới.</w:t>
+      </w:r>
     </w:p>
     <w:p>
       <w:pPr>
         <w:spacing w:after="240" w:line="360" w:lineRule="auto"/>
-      </w:pPr>
-      <w:r>
-        <w:t>Sinh viên được giao nhiệm vụ rà soát và kiểm tra các API đã được xây dựng từ các dự án trước đó. Công việc này bao gồm việc phân tích cấu trúc API, cách xử lý request/response, cũng như đánh giá khả năng tái sử dụng của các API trong bối cảnh dự án mới.</w:t>
+        <w:ind w:firstLine="567"/>
+      </w:pPr>
+      <w:r>
+        <w:t>Thông qua quá trình này, sinh viên hiểu rõ hơn cách thiết kế API theo chuẩn RESTful, cách đặt tên endpoint, cách truyền và nhận dữ liệu giữa client và server. Việc tái sử dụng các API sẵn có giúp sinh viên nhận thức được tầm quan trọng của việc viết mã nguồn có tính mở rộng và dễ bảo trì trong các dự án thực tế.</w:t>
       </w:r>
     </w:p>
     <w:p>
       <w:pPr>
         <w:spacing w:after="240" w:line="360" w:lineRule="auto"/>
-      </w:pPr>
-      <w:r>
-        <w:t>Thông qua quá trình này, sinh viên hiểu rõ hơn cách thiết kế API theo chuẩn RESTful, cách đặt tên endpoint, cách truyền và nhận dữ liệu giữa client và server. Việc tái sử dụng các API sẵn có giúp sinh viên nhận thức được tầm quan trọng của việc viết mã nguồn có tính mở rộng và dễ bảo trì trong các dự án thực tế.</w:t>
+        <w:ind w:firstLine="567"/>
+      </w:pPr>
+      <w:r>
+        <w:t>Trong quá trình thực tập, sinh viên thực hiện công việc theo deadline được giao và thường xuyên cập nhật tiến độ trên hệ thống quản lý công việc. Sinh viên học cách chia nhỏ nhiệm vụ, sắp xếp thứ tự ưu tiên và phân bổ thời gian hợp lý giữa các công việc khác nhau.</w:t>
       </w:r>
     </w:p>
     <w:p>
       <w:pPr>
         <w:spacing w:after="240" w:line="360" w:lineRule="auto"/>
-      </w:pPr>
-    </w:p>
-    <w:p>
-      <w:pPr>
-        <w:spacing w:after="240" w:line="360" w:lineRule="auto"/>
-      </w:pPr>
-      <w:r>
-        <w:t>Trong quá trình thực tập, sinh viên thực hiện công việc theo deadline được giao và thường xuyên cập nhật tiến độ trên hệ thống quản lý công việc. Sinh viên học cách chia nhỏ nhiệm vụ, sắp xếp thứ tự ưu tiên và phân bổ thời gian hợp lý giữa các công việc khác nhau.</w:t>
-      </w:r>
-    </w:p>
-    <w:p>
-      <w:pPr>
-        <w:spacing w:after="240" w:line="360" w:lineRule="auto"/>
+        <w:ind w:firstLine="567"/>
       </w:pPr>
       <w:r>
         <w:t>Kỹ năng quản lý thời gian này giúp sinh viên làm việc hiệu quả hơn, đồng thời đảm bảo tiến độ chung của nhóm phát triển không bị ảnh hưởng.</w:t>
       </w:r>
-    </w:p>
-    <w:p>
-      <w:pPr>
-        <w:spacing w:after="240" w:line="360" w:lineRule="auto"/>
-      </w:pPr>
     </w:p>
     <w:p>
       <w:pPr>
@@ -16656,6 +16997,7 @@
         <w:spacing w:after="240" w:line="360" w:lineRule="auto"/>
       </w:pPr>
       <w:r>
+        <w:lastRenderedPageBreak/>
         <w:t>Sinh viên tiến hành nghiên cứu các mô hình xác thực OTP đang được sử dụng phổ biến trong các hệ thống lớn. Từ đó, sinh viên phân tích ưu và nhược điểm của từng giải pháp, đặc biệt là về tính bảo mật, khả năng mở rộng và mức độ phù hợp với hệ thống hiện tại.</w:t>
       </w:r>
     </w:p>
@@ -16749,18 +17091,15 @@
         <w:spacing w:after="240" w:line="360" w:lineRule="auto"/>
       </w:pPr>
       <w:r>
-        <w:t xml:space="preserve">Cuối mỗi giai đoạn, sinh viên tổng hợp toàn bộ các công việc đã thực hiện, bao gồm các API đã hoàn thành, các chức năng đã kiểm thử và các nội dung chưa hoàn thiện. Sinh </w:t>
-      </w:r>
+        <w:t>Cuối mỗi giai đoạn, sinh viên tổng hợp toàn bộ các công việc đã thực hiện, bao gồm các API đã hoàn thành, các chức năng đã kiểm thử và các nội dung chưa hoàn thiện. Sinh viên báo cáo kết quả với mentor và tiếp nhận các góp ý để cải thiện chất lượng công việc trong các giai đoạn tiếp theo.</w:t>
+      </w:r>
+    </w:p>
+    <w:p>
+      <w:pPr>
+        <w:spacing w:after="240" w:line="360" w:lineRule="auto"/>
+      </w:pPr>
       <w:r>
         <w:lastRenderedPageBreak/>
-        <w:t>viên báo cáo kết quả với mentor và tiếp nhận các góp ý để cải thiện chất lượng công việc trong các giai đoạn tiếp theo.</w:t>
-      </w:r>
-    </w:p>
-    <w:p>
-      <w:pPr>
-        <w:spacing w:after="240" w:line="360" w:lineRule="auto"/>
-      </w:pPr>
-      <w:r>
         <w:t>Thông qua quá trình tổng hợp và báo cáo, sinh viên đánh giá được mức độ hoàn thành công việc của bản thân, đồng thời rút ra nhiều kinh nghiệm thực tế quý báu cho quá trình học tập và làm việc sau này.</w:t>
       </w:r>
     </w:p>
@@ -17122,7 +17461,6 @@
         <w:rPr>
           <w:lang w:val="vi-VN"/>
         </w:rPr>
-        <w:lastRenderedPageBreak/>
         <w:t>Cài đặt và cấu hình các tiện ích mở rộng (extensions) cần thiết cho Visual Studio và Visual Studio Code</w:t>
       </w:r>
     </w:p>
@@ -17174,6 +17512,7 @@
         <w:rPr>
           <w:lang w:val="vi-VN"/>
         </w:rPr>
+        <w:lastRenderedPageBreak/>
         <w:t>Sử dụng Git để quản lý phiên bản mã nguồn</w:t>
       </w:r>
     </w:p>
@@ -17797,7 +18136,6 @@
         <w:rPr>
           <w:lang w:val="vi-VN"/>
         </w:rPr>
-        <w:lastRenderedPageBreak/>
         <w:t>Tham khảo các mô hình OTP của các hệ thống lớn</w:t>
       </w:r>
       <w:r>
@@ -17869,6 +18207,7 @@
         <w:rPr>
           <w:lang w:val="vi-VN"/>
         </w:rPr>
+        <w:lastRenderedPageBreak/>
         <w:t>Thiết kế luồng đăng nhập bằng OTP</w:t>
       </w:r>
     </w:p>
@@ -18424,7 +18763,6 @@
           <w:bCs/>
           <w:lang w:val="vi-VN"/>
         </w:rPr>
-        <w:lastRenderedPageBreak/>
         <w:t>7.2. .NET Runtime Foundations</w:t>
       </w:r>
     </w:p>
@@ -18510,6 +18848,7 @@
         <w:rPr>
           <w:lang w:val="vi-VN"/>
         </w:rPr>
+        <w:lastRenderedPageBreak/>
         <w:t>Common Type System (CTS)</w:t>
       </w:r>
     </w:p>
@@ -19135,7 +19474,6 @@
         <w:rPr>
           <w:lang w:val="vi-VN"/>
         </w:rPr>
-        <w:lastRenderedPageBreak/>
         <w:t>Observer</w:t>
       </w:r>
     </w:p>
@@ -19221,6 +19559,7 @@
           <w:bCs/>
           <w:lang w:val="vi-VN"/>
         </w:rPr>
+        <w:lastRenderedPageBreak/>
         <w:t>9.3. CQRS</w:t>
       </w:r>
     </w:p>
@@ -19846,7 +20185,6 @@
         <w:rPr>
           <w:lang w:val="vi-VN"/>
         </w:rPr>
-        <w:lastRenderedPageBreak/>
         <w:t>Lý do lựa chọn Proxmox Bare-metal</w:t>
       </w:r>
     </w:p>
@@ -19932,6 +20270,7 @@
         <w:rPr>
           <w:lang w:val="vi-VN"/>
         </w:rPr>
+        <w:lastRenderedPageBreak/>
         <w:t>NIC</w:t>
       </w:r>
     </w:p>
@@ -20555,7 +20894,6 @@
         <w:rPr>
           <w:lang w:val="vi-VN"/>
         </w:rPr>
-        <w:lastRenderedPageBreak/>
         <w:t>Backend Development</w:t>
       </w:r>
     </w:p>
@@ -20778,7 +21116,7 @@
           <w:i/>
           <w:iCs/>
         </w:rPr>
-        <w:t xml:space="preserve">Như vậy, trong mục này sinh viên có thể chia thành 5 phần nhỏ với 5 nhiệm vụ chính ở trên. Trong mỗi chương sinh viên chỉ cần trình bày lại các hoạt động sinh viên đã thực hiện/tham gia, các mục tiêu của mỗi công việc và các kết quả thu được từ mỗi công việc đó. Trong báo cáo sinh viên có thể đưa các phụ lục về hình ảnh buổi đón tiếp sinh viên, bảng câu hỏi phỏng vấn, các bảng thống kê từ việc phân tích kết quả khảo sát thị trường, </w:t>
+        <w:t xml:space="preserve">Như vậy, trong mục này sinh viên có thể chia thành 5 phần nhỏ với 5 nhiệm vụ chính ở trên. Trong mỗi chương sinh viên chỉ cần trình bày lại các hoạt động sinh viên đã thực hiện/tham gia, các mục tiêu của mỗi công việc và các kết quả thu được từ mỗi công việc đó. Trong báo cáo sinh viên có thể đưa các phụ lục về hình ảnh buổi đón tiếp sinh viên, bảng câu hỏi phỏng vấn, các bảng thống kê từ việc phân tích kết quả khảo sát thị trường, và hình ảnh về hoạt đồng trồng cây, để làm minh chứng. • Nếu sinh viên đã tham gia 20 công việc thì sinh viên chỉ cần trình bày các công việc quan trọng nhất, có ý nghĩa nhất và có liên quan nhất đến các kết quả/mục tiêu học tập mà sinh viên đã đưa ra khi bắt đầu thực tập. Các công việc khác (nếu liên quan đến các kết quả/mục tiêu học tập) thì </w:t>
       </w:r>
       <w:r>
         <w:rPr>
@@ -20786,7 +21124,7 @@
           <w:iCs/>
         </w:rPr>
         <w:lastRenderedPageBreak/>
-        <w:t>và hình ảnh về hoạt đồng trồng cây, để làm minh chứng. • Nếu sinh viên đã tham gia 20 công việc thì sinh viên chỉ cần trình bày các công việc quan trọng nhất, có ý nghĩa nhất và có liên quan nhất đến các kết quả/mục tiêu học tập mà sinh viên đã đưa ra khi bắt đầu thực tập. Các công việc khác (nếu liên quan đến các kết quả/mục tiêu học tập) thì sinh viên có thể đưa vào phụ lục của báo cáo thực tập. • Cấu trúc của phần còn lại của một báo cáo sản phẩm theo hướng công việc thường không có cấu trúc cụ thể, bởi vì mỗi sinh viên có thể tham gia các công việc và các hoạt động rất khác nhau. Nếu một sinh viên năng động và có năng lực thì báo cáo sản phẩm sẽ rất phong phú. Ngược lại, nếu sinh viên chỉ ngồi nhà chơi games thì sẽ không có câu chuyện nào thú vị để thuật lại sau 14 tuần thực tập.</w:t>
+        <w:t>sinh viên có thể đưa vào phụ lục của báo cáo thực tập. • Cấu trúc của phần còn lại của một báo cáo sản phẩm theo hướng công việc thường không có cấu trúc cụ thể, bởi vì mỗi sinh viên có thể tham gia các công việc và các hoạt động rất khác nhau. Nếu một sinh viên năng động và có năng lực thì báo cáo sản phẩm sẽ rất phong phú. Ngược lại, nếu sinh viên chỉ ngồi nhà chơi games thì sẽ không có câu chuyện nào thú vị để thuật lại sau 14 tuần thực tập.</w:t>
       </w:r>
     </w:p>
     <w:p>

</xml_diff>

<commit_message>
done 3.3.9.2 and refactor format
</commit_message>
<xml_diff>
--- a/BAO-CAO-THUC-TAP.docx
+++ b/BAO-CAO-THUC-TAP.docx
@@ -8541,10 +8541,9 @@
         </w:numPr>
         <w:tabs>
           <w:tab w:val="clear" w:pos="720"/>
-          <w:tab w:val="num" w:pos="851"/>
-        </w:tabs>
-        <w:spacing w:before="0" w:beforeAutospacing="0" w:after="240" w:afterAutospacing="0" w:line="360" w:lineRule="auto"/>
-        <w:ind w:left="851" w:hanging="284"/>
+        </w:tabs>
+        <w:spacing w:before="0" w:beforeAutospacing="0" w:after="0" w:afterAutospacing="0" w:line="360" w:lineRule="auto"/>
+        <w:ind w:left="1134" w:hanging="284"/>
         <w:jc w:val="both"/>
         <w:rPr>
           <w:b/>
@@ -8561,7 +8560,7 @@
           <w:sz w:val="26"/>
           <w:szCs w:val="26"/>
         </w:rPr>
-        <w:t xml:space="preserve">Công ty MeU Solutions được thành lập vào năm 2016 bởi đội ngũ chuyên gia công nghệ dày dặn kinh nghiệm trong lĩnh vực phát triển phần mềm và </w:t>
+        <w:t xml:space="preserve">Công ty MeU Solutions được thành lập vào năm 2016 bởi đội ngũ </w:t>
       </w:r>
       <w:r>
         <w:rPr>
@@ -8581,7 +8580,7 @@
           <w:sz w:val="26"/>
           <w:szCs w:val="26"/>
         </w:rPr>
-        <w:t xml:space="preserve">chuyển đổi số, với sứ mệnh “cùng với đối tác kiến tạo nên giải pháp </w:t>
+        <w:t xml:space="preserve">chuyên gia công nghệ dày dặn kinh nghiệm trong lĩnh vực phát triển </w:t>
       </w:r>
       <w:r>
         <w:rPr>
@@ -8601,7 +8600,7 @@
           <w:sz w:val="26"/>
           <w:szCs w:val="26"/>
         </w:rPr>
-        <w:t>phù hợp nhất và trải nghiệm vẻ đẹp cùng nhau</w:t>
+        <w:t xml:space="preserve">phần mềm và chuyển đổi số, với sứ mệnh “cùng với đối tác kiến tạo nên </w:t>
       </w:r>
       <w:r>
         <w:rPr>
@@ -8611,7 +8610,7 @@
           <w:sz w:val="26"/>
           <w:szCs w:val="26"/>
         </w:rPr>
-        <w:t>”</w:t>
+        <w:br/>
       </w:r>
       <w:r>
         <w:rPr>
@@ -8621,6 +8620,26 @@
           <w:sz w:val="26"/>
           <w:szCs w:val="26"/>
         </w:rPr>
+        <w:t>giải pháp phù hợp nhất và trải nghiệm vẻ đẹp cùng nhau</w:t>
+      </w:r>
+      <w:r>
+        <w:rPr>
+          <w:rStyle w:val="Strong"/>
+          <w:b w:val="0"/>
+          <w:bCs w:val="0"/>
+          <w:sz w:val="26"/>
+          <w:szCs w:val="26"/>
+        </w:rPr>
+        <w:t>”</w:t>
+      </w:r>
+      <w:r>
+        <w:rPr>
+          <w:rStyle w:val="Strong"/>
+          <w:b w:val="0"/>
+          <w:bCs w:val="0"/>
+          <w:sz w:val="26"/>
+          <w:szCs w:val="26"/>
+        </w:rPr>
         <w:t>, hướng tới mục tiêu trở thành đơn vị cung cấp các giải pháp chuyển đổi số uy tín hàng đầu trên thị trường</w:t>
       </w:r>
       <w:r>
@@ -8642,11 +8661,10 @@
         </w:numPr>
         <w:tabs>
           <w:tab w:val="clear" w:pos="720"/>
-          <w:tab w:val="num" w:pos="851"/>
           <w:tab w:val="num" w:pos="1418"/>
         </w:tabs>
-        <w:spacing w:after="240" w:afterAutospacing="0" w:line="360" w:lineRule="auto"/>
-        <w:ind w:left="851" w:hanging="284"/>
+        <w:spacing w:after="0" w:afterAutospacing="0" w:line="360" w:lineRule="auto"/>
+        <w:ind w:left="1134" w:hanging="284"/>
         <w:jc w:val="both"/>
         <w:rPr>
           <w:b/>
@@ -8670,7 +8688,7 @@
           <w:sz w:val="26"/>
           <w:szCs w:val="26"/>
         </w:rPr>
-        <w:t xml:space="preserve">: Công ty thực hiện các dự án đầu tiên như kiểm định bảo mật </w:t>
+        <w:t xml:space="preserve">: Công ty thực hiện các dự án đầu tiên như kiểm định bảo mật hệ thống Visa và dự án Forbes Travel Guides, góp phần khẳng định năng lực chuyên môn, uy tín và định hướng đúng đắn trong lĩnh vực công nghệ </w:t>
       </w:r>
       <w:r>
         <w:rPr>
@@ -8684,7 +8702,7 @@
           <w:sz w:val="26"/>
           <w:szCs w:val="26"/>
         </w:rPr>
-        <w:t>hệ thống Visa và dự án Forbes Travel Guides, góp phần khẳng định năng lực chuyên môn, uy tín và định hướng đúng đắn trong lĩnh vực công nghệ thông tin.</w:t>
+        <w:t>thông tin.</w:t>
       </w:r>
     </w:p>
     <w:p>
@@ -8696,10 +8714,9 @@
         </w:numPr>
         <w:tabs>
           <w:tab w:val="clear" w:pos="720"/>
-          <w:tab w:val="num" w:pos="851"/>
-        </w:tabs>
-        <w:spacing w:after="240" w:afterAutospacing="0" w:line="360" w:lineRule="auto"/>
-        <w:ind w:left="851" w:hanging="284"/>
+        </w:tabs>
+        <w:spacing w:after="0" w:afterAutospacing="0" w:line="360" w:lineRule="auto"/>
+        <w:ind w:left="1134" w:hanging="284"/>
         <w:jc w:val="both"/>
         <w:rPr>
           <w:b/>
@@ -8756,7 +8773,7 @@
           <w:sz w:val="26"/>
           <w:szCs w:val="26"/>
         </w:rPr>
-        <w:t xml:space="preserve">Group, hệ thống mạng nội bộ (intranet), hệ thống quản lý tài nguyên </w:t>
+        <w:t xml:space="preserve">Group, hệ thống mạng nội bộ (intranet), hệ thống quản lý tài nguyên nhân sự, chấm công, tính lương và tuyển dụng. Bên cạnh đó, MeU Solutions còn tham gia các dự án mang tính quốc tế như Medochemie và </w:t>
       </w:r>
       <w:r>
         <w:rPr>
@@ -8776,7 +8793,7 @@
           <w:sz w:val="26"/>
           <w:szCs w:val="26"/>
         </w:rPr>
-        <w:t>nhân sự, chấm công, tính lương và tuyển dụng. Bên cạnh đó, MeU Solutions còn tham gia các dự án mang tính quốc tế như Medochemie và Confast Network. Các dự án này đã mở ra cơ hội tiếp cận nhiều thị trường mới và khách hàng mới</w:t>
+        <w:t>Confast Network. Các dự án này đã mở ra cơ hội tiếp cận nhiều thị trường mới và khách hàng mới</w:t>
       </w:r>
       <w:r>
         <w:rPr>
@@ -8797,10 +8814,9 @@
         </w:numPr>
         <w:tabs>
           <w:tab w:val="clear" w:pos="720"/>
-          <w:tab w:val="num" w:pos="851"/>
-        </w:tabs>
-        <w:spacing w:after="240" w:afterAutospacing="0" w:line="360" w:lineRule="auto"/>
-        <w:ind w:left="851" w:hanging="284"/>
+        </w:tabs>
+        <w:spacing w:after="0" w:afterAutospacing="0" w:line="360" w:lineRule="auto"/>
+        <w:ind w:left="1134" w:hanging="284"/>
         <w:jc w:val="both"/>
         <w:rPr>
           <w:b/>
@@ -8817,6 +8833,7 @@
           <w:sz w:val="26"/>
           <w:szCs w:val="26"/>
         </w:rPr>
+        <w:lastRenderedPageBreak/>
         <w:t xml:space="preserve">Đến năm 2019: công ty đã thực hiện nhiều dự án cho các đối tác lớn như </w:t>
       </w:r>
       <w:r>
@@ -8877,7 +8894,6 @@
           <w:sz w:val="26"/>
           <w:szCs w:val="26"/>
         </w:rPr>
-        <w:lastRenderedPageBreak/>
         <w:t>thích ứng linh hoạt cũng như thể hiện được năng lực triển khai các giải pháp công nghệ trong đa dạng lĩnh vực</w:t>
       </w:r>
       <w:r>
@@ -8899,10 +8915,9 @@
         </w:numPr>
         <w:tabs>
           <w:tab w:val="clear" w:pos="720"/>
-          <w:tab w:val="num" w:pos="851"/>
-        </w:tabs>
-        <w:spacing w:after="240" w:afterAutospacing="0" w:line="360" w:lineRule="auto"/>
-        <w:ind w:left="851" w:hanging="284"/>
+        </w:tabs>
+        <w:spacing w:after="0" w:afterAutospacing="0" w:line="360" w:lineRule="auto"/>
+        <w:ind w:left="1134" w:hanging="284"/>
         <w:jc w:val="both"/>
         <w:rPr>
           <w:b/>
@@ -8979,8 +8994,38 @@
           <w:sz w:val="26"/>
           <w:szCs w:val="26"/>
         </w:rPr>
-        <w:t xml:space="preserve">quản trị nhân sự và quản lý tài sản. Đồng thời, công ty cũng không ngừng </w:t>
-      </w:r>
+        <w:t>quản trị nhân sự và quản lý tài sản. Đồng thời, công ty cũng không ngừng nâng cấp và mở rộng các hệ thống hiện có nhằm đáp ứng tốt hơn với nhu cầu ngày càng đa dạng của nhiều nhóm khách hàng</w:t>
+      </w:r>
+      <w:r>
+        <w:rPr>
+          <w:b/>
+          <w:bCs/>
+          <w:sz w:val="26"/>
+          <w:szCs w:val="26"/>
+        </w:rPr>
+        <w:t>.</w:t>
+      </w:r>
+    </w:p>
+    <w:p>
+      <w:pPr>
+        <w:pStyle w:val="NormalWeb"/>
+        <w:numPr>
+          <w:ilvl w:val="0"/>
+          <w:numId w:val="11"/>
+        </w:numPr>
+        <w:tabs>
+          <w:tab w:val="clear" w:pos="720"/>
+        </w:tabs>
+        <w:spacing w:after="0" w:afterAutospacing="0" w:line="360" w:lineRule="auto"/>
+        <w:ind w:left="1134" w:hanging="284"/>
+        <w:jc w:val="both"/>
+        <w:rPr>
+          <w:b/>
+          <w:bCs/>
+          <w:sz w:val="26"/>
+          <w:szCs w:val="26"/>
+        </w:rPr>
+      </w:pPr>
       <w:r>
         <w:rPr>
           <w:rStyle w:val="Strong"/>
@@ -8989,7 +9034,7 @@
           <w:sz w:val="26"/>
           <w:szCs w:val="26"/>
         </w:rPr>
-        <w:br/>
+        <w:t>Từ năm 2022</w:t>
       </w:r>
       <w:r>
         <w:rPr>
@@ -8999,7 +9044,77 @@
           <w:sz w:val="26"/>
           <w:szCs w:val="26"/>
         </w:rPr>
-        <w:t>nâng cấp và mở rộng các hệ thống hiện có nhằm đáp ứng tốt hơn với nhu cầu ngày càng đa dạng của nhiều nhóm khách hàng</w:t>
+        <w:t xml:space="preserve"> </w:t>
+      </w:r>
+      <w:r>
+        <w:rPr>
+          <w:rStyle w:val="Strong"/>
+          <w:b w:val="0"/>
+          <w:bCs w:val="0"/>
+          <w:sz w:val="26"/>
+          <w:szCs w:val="26"/>
+        </w:rPr>
+        <w:t xml:space="preserve">đến năm 2023, công ty tiếp tục khẳng định vị thế của mình trên thị trường công nghệ số thông qua việc tham gia các dự án quản lý học liệu trực tuyến, tổ chức hội thảo quốc tế và cung cấp dịch vụ outsourcing cho nhiều tổ chức, doanh nghiệp lớn. Đặc biệt, sự hợp tác với Tạp chí </w:t>
+      </w:r>
+      <w:r>
+        <w:rPr>
+          <w:rStyle w:val="Strong"/>
+          <w:b w:val="0"/>
+          <w:bCs w:val="0"/>
+          <w:sz w:val="26"/>
+          <w:szCs w:val="26"/>
+        </w:rPr>
+        <w:br/>
+      </w:r>
+      <w:r>
+        <w:rPr>
+          <w:rStyle w:val="Strong"/>
+          <w:b w:val="0"/>
+          <w:bCs w:val="0"/>
+          <w:sz w:val="26"/>
+          <w:szCs w:val="26"/>
+        </w:rPr>
+        <w:t xml:space="preserve">Doanh nhân Sài Gòn trong việc phát triển hệ thống quản lý hội viên đã </w:t>
+      </w:r>
+      <w:r>
+        <w:rPr>
+          <w:rStyle w:val="Strong"/>
+          <w:b w:val="0"/>
+          <w:bCs w:val="0"/>
+          <w:sz w:val="26"/>
+          <w:szCs w:val="26"/>
+        </w:rPr>
+        <w:br/>
+      </w:r>
+      <w:r>
+        <w:rPr>
+          <w:rStyle w:val="Strong"/>
+          <w:b w:val="0"/>
+          <w:bCs w:val="0"/>
+          <w:sz w:val="26"/>
+          <w:szCs w:val="26"/>
+        </w:rPr>
+        <w:t xml:space="preserve">tạo nên một tiền đề quan trọng cho việc kết nối giữa các thương hội, </w:t>
+      </w:r>
+      <w:r>
+        <w:rPr>
+          <w:rStyle w:val="Strong"/>
+          <w:b w:val="0"/>
+          <w:bCs w:val="0"/>
+          <w:sz w:val="26"/>
+          <w:szCs w:val="26"/>
+        </w:rPr>
+        <w:br/>
+      </w:r>
+      <w:r>
+        <w:rPr>
+          <w:rStyle w:val="Strong"/>
+          <w:b w:val="0"/>
+          <w:bCs w:val="0"/>
+          <w:sz w:val="26"/>
+          <w:szCs w:val="26"/>
+        </w:rPr>
+        <w:t>câu lạc bộ và doanh nghiệp</w:t>
       </w:r>
       <w:r>
         <w:rPr>
@@ -9020,10 +9135,9 @@
         </w:numPr>
         <w:tabs>
           <w:tab w:val="clear" w:pos="720"/>
-          <w:tab w:val="num" w:pos="851"/>
         </w:tabs>
         <w:spacing w:after="240" w:afterAutospacing="0" w:line="360" w:lineRule="auto"/>
-        <w:ind w:left="851" w:hanging="284"/>
+        <w:ind w:left="1134" w:hanging="284"/>
         <w:jc w:val="both"/>
         <w:rPr>
           <w:b/>
@@ -9040,7 +9154,7 @@
           <w:sz w:val="26"/>
           <w:szCs w:val="26"/>
         </w:rPr>
-        <w:t>Từ năm 2022</w:t>
+        <w:t>Từ năm 2023 đến nay, MeU</w:t>
       </w:r>
       <w:r>
         <w:rPr>
@@ -9060,7 +9174,7 @@
           <w:sz w:val="26"/>
           <w:szCs w:val="26"/>
         </w:rPr>
-        <w:t xml:space="preserve">đến năm 2023, công ty tiếp tục khẳng định vị thế của mình trên thị trường công nghệ số thông qua việc tham gia các dự án quản lý học liệu </w:t>
+        <w:t xml:space="preserve">Solutions chuyên tâm tập trung nghiên cứu và phát triển các giải pháp công nghệ tiên tiến dựa trên trí tuệ nhân tạo (AI) và dữ liệu lớn (Big Data). Công ty đã nhận được sự tin cậy của Tập đoàn </w:t>
       </w:r>
       <w:r>
         <w:rPr>
@@ -9080,7 +9194,7 @@
           <w:sz w:val="26"/>
           <w:szCs w:val="26"/>
         </w:rPr>
-        <w:t xml:space="preserve">trực tuyến, tổ chức hội thảo quốc tế và cung cấp dịch vụ outsourcing cho </w:t>
+        <w:t>Hóa dầu Long Sơn (Long Son Petrochemical) trong việc xây dựng, phát triển hệ thống quản lý quy trình khách hàng. Bên cạnh đó, sự hợp tác giữa VCCI</w:t>
       </w:r>
       <w:r>
         <w:rPr>
@@ -9090,7 +9204,7 @@
           <w:sz w:val="26"/>
           <w:szCs w:val="26"/>
         </w:rPr>
-        <w:br/>
+        <w:t xml:space="preserve"> - </w:t>
       </w:r>
       <w:r>
         <w:rPr>
@@ -9100,39 +9214,8 @@
           <w:sz w:val="26"/>
           <w:szCs w:val="26"/>
         </w:rPr>
-        <w:t>nhiều tổ chức, doanh nghiệp lớn. Đặc biệt, sự hợp tác với Tạp chí Doanh nhân Sài Gòn trong việc phát triển hệ thống quản lý hội viên đã tạo nên một tiền đề quan trọng cho việc kết nối giữa các thương hội, câu lạc bộ và doanh nghiệp</w:t>
-      </w:r>
-      <w:r>
-        <w:rPr>
-          <w:b/>
-          <w:bCs/>
-          <w:sz w:val="26"/>
-          <w:szCs w:val="26"/>
-        </w:rPr>
-        <w:t>.</w:t>
-      </w:r>
-    </w:p>
-    <w:p>
-      <w:pPr>
-        <w:pStyle w:val="NormalWeb"/>
-        <w:numPr>
-          <w:ilvl w:val="0"/>
-          <w:numId w:val="11"/>
-        </w:numPr>
-        <w:tabs>
-          <w:tab w:val="clear" w:pos="720"/>
-          <w:tab w:val="num" w:pos="851"/>
-        </w:tabs>
-        <w:spacing w:after="240" w:afterAutospacing="0" w:line="360" w:lineRule="auto"/>
-        <w:ind w:left="851" w:hanging="284"/>
-        <w:jc w:val="both"/>
-        <w:rPr>
-          <w:b/>
-          <w:bCs/>
-          <w:sz w:val="26"/>
-          <w:szCs w:val="26"/>
-        </w:rPr>
-      </w:pPr>
+        <w:t xml:space="preserve">Liên đoàn Thương mại và Công nghiệp Việt Nam chi nhánh </w:t>
+      </w:r>
       <w:r>
         <w:rPr>
           <w:rStyle w:val="Strong"/>
@@ -9141,7 +9224,7 @@
           <w:sz w:val="26"/>
           <w:szCs w:val="26"/>
         </w:rPr>
-        <w:t>Từ năm 2023 đến nay, MeU</w:t>
+        <w:br/>
       </w:r>
       <w:r>
         <w:rPr>
@@ -9151,137 +9234,7 @@
           <w:sz w:val="26"/>
           <w:szCs w:val="26"/>
         </w:rPr>
-        <w:t xml:space="preserve"> </w:t>
-      </w:r>
-      <w:r>
-        <w:rPr>
-          <w:rStyle w:val="Strong"/>
-          <w:b w:val="0"/>
-          <w:bCs w:val="0"/>
-          <w:sz w:val="26"/>
-          <w:szCs w:val="26"/>
-        </w:rPr>
-        <w:t xml:space="preserve">Solutions chuyên tâm tập trung nghiên cứu và </w:t>
-      </w:r>
-      <w:r>
-        <w:rPr>
-          <w:rStyle w:val="Strong"/>
-          <w:b w:val="0"/>
-          <w:bCs w:val="0"/>
-          <w:sz w:val="26"/>
-          <w:szCs w:val="26"/>
-        </w:rPr>
-        <w:br/>
-      </w:r>
-      <w:r>
-        <w:rPr>
-          <w:rStyle w:val="Strong"/>
-          <w:b w:val="0"/>
-          <w:bCs w:val="0"/>
-          <w:sz w:val="26"/>
-          <w:szCs w:val="26"/>
-        </w:rPr>
-        <w:t xml:space="preserve">phát triển các giải pháp công nghệ tiên tiến dựa trên trí tuệ nhân tạo (AI) và </w:t>
-      </w:r>
-      <w:r>
-        <w:rPr>
-          <w:rStyle w:val="Strong"/>
-          <w:b w:val="0"/>
-          <w:bCs w:val="0"/>
-          <w:sz w:val="26"/>
-          <w:szCs w:val="26"/>
-        </w:rPr>
-        <w:br/>
-      </w:r>
-      <w:r>
-        <w:rPr>
-          <w:rStyle w:val="Strong"/>
-          <w:b w:val="0"/>
-          <w:bCs w:val="0"/>
-          <w:sz w:val="26"/>
-          <w:szCs w:val="26"/>
-        </w:rPr>
-        <w:t>dữ liệu lớn (Big Data). Công ty đã nhận được sự tin cậy của Tập đoàn Hóa dầu Long Sơn (Long Son Petrochemical) trong việc xây dựng, phát triển hệ thống quản lý quy trình khách hàng. Bên cạnh đó, sự hợp tác giữa VCCI</w:t>
-      </w:r>
-      <w:r>
-        <w:rPr>
-          <w:rStyle w:val="Strong"/>
-          <w:b w:val="0"/>
-          <w:bCs w:val="0"/>
-          <w:sz w:val="26"/>
-          <w:szCs w:val="26"/>
-        </w:rPr>
-        <w:t xml:space="preserve"> - </w:t>
-      </w:r>
-      <w:r>
-        <w:rPr>
-          <w:rStyle w:val="Strong"/>
-          <w:b w:val="0"/>
-          <w:bCs w:val="0"/>
-          <w:sz w:val="26"/>
-          <w:szCs w:val="26"/>
-        </w:rPr>
-        <w:t xml:space="preserve">Liên đoàn Thương mại và Công nghiệp Việt Nam chi nhánh TP. Hồ Chí Minh và </w:t>
-      </w:r>
-      <w:r>
-        <w:rPr>
-          <w:rStyle w:val="Strong"/>
-          <w:b w:val="0"/>
-          <w:bCs w:val="0"/>
-          <w:sz w:val="26"/>
-          <w:szCs w:val="26"/>
-        </w:rPr>
-        <w:br/>
-      </w:r>
-      <w:r>
-        <w:rPr>
-          <w:rStyle w:val="Strong"/>
-          <w:b w:val="0"/>
-          <w:bCs w:val="0"/>
-          <w:sz w:val="26"/>
-          <w:szCs w:val="26"/>
-        </w:rPr>
-        <w:t xml:space="preserve">MeU Solutions trong việc phát triển nền tảng quản lý hội viên cho các </w:t>
-      </w:r>
-      <w:r>
-        <w:rPr>
-          <w:rStyle w:val="Strong"/>
-          <w:b w:val="0"/>
-          <w:bCs w:val="0"/>
-          <w:sz w:val="26"/>
-          <w:szCs w:val="26"/>
-        </w:rPr>
-        <w:br/>
-      </w:r>
-      <w:r>
-        <w:rPr>
-          <w:rStyle w:val="Strong"/>
-          <w:b w:val="0"/>
-          <w:bCs w:val="0"/>
-          <w:sz w:val="26"/>
-          <w:szCs w:val="26"/>
-        </w:rPr>
-        <w:t xml:space="preserve">thương hội được xem là một dấu mốc quan trọng, điều này khẳng định năng lực và uy tín của công ty trong lĩnh vực cung cấp giải pháp công nghệ tiên tiến, </w:t>
-      </w:r>
-      <w:r>
-        <w:rPr>
-          <w:rStyle w:val="Strong"/>
-          <w:b w:val="0"/>
-          <w:bCs w:val="0"/>
-          <w:sz w:val="26"/>
-          <w:szCs w:val="26"/>
-        </w:rPr>
-        <w:br/>
-      </w:r>
-      <w:r>
-        <w:rPr>
-          <w:rStyle w:val="Strong"/>
-          <w:b w:val="0"/>
-          <w:bCs w:val="0"/>
-          <w:sz w:val="26"/>
-          <w:szCs w:val="26"/>
-        </w:rPr>
-        <w:t>hiện đại cho các doanh nghiệp và tổ chức hiện nay</w:t>
+        <w:t>TP. Hồ Chí Minh và MeU Solutions trong việc phát triển nền tảng quản lý hội viên cho các thương hội được xem là một dấu mốc quan trọng, điều này khẳng định năng lực và uy tín của công ty trong lĩnh vực cung cấp giải pháp công nghệ tiên tiến, hiện đại cho các doanh nghiệp và tổ chức hiện nay</w:t>
       </w:r>
       <w:r>
         <w:rPr>
@@ -9585,7 +9538,7 @@
           <w:numId w:val="12"/>
         </w:numPr>
         <w:spacing w:line="360" w:lineRule="auto"/>
-        <w:ind w:left="851" w:hanging="284"/>
+        <w:ind w:left="1134" w:hanging="284"/>
         <w:contextualSpacing w:val="0"/>
         <w:rPr>
           <w:b/>
@@ -9613,12 +9566,13 @@
         </w:rPr>
         <w:t>Doanh nghiệp Tư nhân</w:t>
       </w:r>
-    </w:p>
-    <w:p>
-      <w:pPr>
-        <w:spacing w:line="360" w:lineRule="auto"/>
-        <w:ind w:left="851"/>
-      </w:pPr>
+      <w:r>
+        <w:rPr>
+          <w:b/>
+          <w:bCs/>
+        </w:rPr>
+        <w:t xml:space="preserve">: </w:t>
+      </w:r>
       <w:r>
         <w:t>Hai khối này được tổ chúc theo từng nhóm khách hàng cụ thể, mục tiêu nhằm đáp ứng yêu cầu đặc thù của từng phân khúc. Mỗi khối đều có:</w:t>
       </w:r>
@@ -9631,6 +9585,7 @@
           <w:numId w:val="12"/>
         </w:numPr>
         <w:spacing w:after="240" w:line="360" w:lineRule="auto"/>
+        <w:ind w:hanging="306"/>
       </w:pPr>
       <w:r>
         <w:rPr>
@@ -9657,6 +9612,7 @@
           <w:numId w:val="12"/>
         </w:numPr>
         <w:spacing w:after="240" w:line="360" w:lineRule="auto"/>
+        <w:ind w:hanging="306"/>
       </w:pPr>
       <w:r>
         <w:rPr>
@@ -9677,7 +9633,7 @@
           <w:numId w:val="12"/>
         </w:numPr>
         <w:spacing w:line="360" w:lineRule="auto"/>
-        <w:ind w:left="851" w:hanging="284"/>
+        <w:ind w:left="1134" w:hanging="284"/>
         <w:rPr>
           <w:b/>
           <w:bCs/>
@@ -9691,20 +9647,33 @@
         <w:lastRenderedPageBreak/>
         <w:t>Khối Marketing – Public Relations (PR)</w:t>
       </w:r>
-    </w:p>
-    <w:p>
-      <w:pPr>
-        <w:spacing w:line="360" w:lineRule="auto"/>
-        <w:ind w:left="851"/>
-      </w:pPr>
-      <w:r>
-        <w:t xml:space="preserve">Khối này chịu trách nhiệm xây dựng hình ảnh thương hiệu, nghiên cứu </w:t>
+      <w:r>
+        <w:rPr>
+          <w:b/>
+          <w:bCs/>
+        </w:rPr>
+        <w:t xml:space="preserve">: </w:t>
+      </w:r>
+      <w:r>
+        <w:t xml:space="preserve">Khối này chịu trách nhiệm </w:t>
       </w:r>
       <w:r>
         <w:br/>
       </w:r>
       <w:r>
-        <w:t>thị trường và triển khai các chiến lược truyền thông phù hợp với định hướng phát triển của công ty. Các bộ phận trực thuộc bao gồm:</w:t>
+        <w:t xml:space="preserve">xây dựng hình ảnh thương hiệu, nghiên cứu thị trường và triển khai các </w:t>
+      </w:r>
+      <w:r>
+        <w:br/>
+      </w:r>
+      <w:r>
+        <w:t xml:space="preserve">chiến lược truyền thông phù hợp với định hướng phát triển của công ty. </w:t>
+      </w:r>
+      <w:r>
+        <w:br/>
+      </w:r>
+      <w:r>
+        <w:t>Các bộ phận trực thuộc bao gồm:</w:t>
       </w:r>
     </w:p>
     <w:p>
@@ -9806,7 +9775,7 @@
           <w:numId w:val="12"/>
         </w:numPr>
         <w:spacing w:line="360" w:lineRule="auto"/>
-        <w:ind w:left="851" w:hanging="284"/>
+        <w:ind w:left="1134" w:hanging="284"/>
         <w:rPr>
           <w:b/>
           <w:bCs/>
@@ -9819,20 +9788,15 @@
         </w:rPr>
         <w:t>Khối Tài chính – Kế toán</w:t>
       </w:r>
-    </w:p>
-    <w:p>
-      <w:pPr>
-        <w:spacing w:line="360" w:lineRule="auto"/>
-        <w:ind w:left="851"/>
-      </w:pPr>
-      <w:r>
-        <w:t xml:space="preserve">Khối Tài chính – Kế toán có nhiệm vụ đảm bảo hoạt động tài chính của </w:t>
-      </w:r>
-      <w:r>
-        <w:br/>
-      </w:r>
-      <w:r>
-        <w:t>MeU Solutions minh bạch, hiệu quả và tuân thủ đúng các quy định pháp luật Việt Nam. Trong đó:</w:t>
+      <w:r>
+        <w:rPr>
+          <w:b/>
+          <w:bCs/>
+        </w:rPr>
+        <w:t xml:space="preserve">: </w:t>
+      </w:r>
+      <w:r>
+        <w:t>Khối Tài chính – Kế toán có nhiệm vụ đảm bảo hoạt động tài chính của MeU Solutions minh bạch, hiệu quả và tuân thủ đúng các quy định pháp luật Việt Nam. Trong đó:</w:t>
       </w:r>
     </w:p>
     <w:p>
@@ -9875,7 +9839,13 @@
         <w:t>Phòng Kế toán</w:t>
       </w:r>
       <w:r>
-        <w:t>: Ghi nhận, báo cáo tài chính và kiểm soát chi phí theo chuẩn mực kế toán hiện hành</w:t>
+        <w:t xml:space="preserve">: Ghi nhận, báo cáo tài chính và kiểm soát chi phí </w:t>
+      </w:r>
+      <w:r>
+        <w:br/>
+      </w:r>
+      <w:r>
+        <w:t>theo chuẩn mực kế toán hiện hành</w:t>
       </w:r>
       <w:r>
         <w:t xml:space="preserve"> của công ty</w:t>
@@ -9892,7 +9862,7 @@
           <w:numId w:val="12"/>
         </w:numPr>
         <w:spacing w:line="360" w:lineRule="auto"/>
-        <w:ind w:left="851" w:hanging="284"/>
+        <w:ind w:left="1134" w:hanging="284"/>
         <w:rPr>
           <w:b/>
           <w:bCs/>
@@ -9905,14 +9875,21 @@
         </w:rPr>
         <w:t>Khối Hành chính – Nhân sự</w:t>
       </w:r>
-    </w:p>
-    <w:p>
-      <w:pPr>
-        <w:spacing w:line="360" w:lineRule="auto"/>
-        <w:ind w:left="851"/>
-      </w:pPr>
-      <w:r>
-        <w:t>Khối này đóng vai trò quan trọng trong việc xây dựng văn hóa doanh nghiệp và phát triển nguồn nhân lực. Bao gồm:</w:t>
+      <w:r>
+        <w:rPr>
+          <w:b/>
+          <w:bCs/>
+        </w:rPr>
+        <w:t xml:space="preserve">: </w:t>
+      </w:r>
+      <w:r>
+        <w:t xml:space="preserve">Khối này đóng vai trò quan trọng trong việc </w:t>
+      </w:r>
+      <w:r>
+        <w:br/>
+      </w:r>
+      <w:r>
+        <w:t>xây dựng văn hóa doanh nghiệp và phát triển nguồn nhân lực. Bao gồm:</w:t>
       </w:r>
     </w:p>
     <w:p>
@@ -9972,7 +9949,7 @@
           <w:numId w:val="12"/>
         </w:numPr>
         <w:spacing w:after="0" w:afterAutospacing="0" w:line="360" w:lineRule="auto"/>
-        <w:ind w:left="851" w:hanging="284"/>
+        <w:ind w:left="1134" w:hanging="284"/>
         <w:jc w:val="both"/>
         <w:rPr>
           <w:sz w:val="26"/>
@@ -9987,24 +9964,19 @@
         </w:rPr>
         <w:t>Khối Kỹ thuật</w:t>
       </w:r>
-    </w:p>
-    <w:p>
-      <w:pPr>
-        <w:pStyle w:val="NormalWeb"/>
-        <w:spacing w:before="0" w:beforeAutospacing="0" w:after="0" w:afterAutospacing="0" w:line="360" w:lineRule="auto"/>
-        <w:ind w:left="851"/>
-        <w:jc w:val="both"/>
+      <w:r>
         <w:rPr>
           <w:sz w:val="26"/>
           <w:szCs w:val="26"/>
         </w:rPr>
-      </w:pPr>
+        <w:t xml:space="preserve">: </w:t>
+      </w:r>
       <w:r>
         <w:rPr>
           <w:sz w:val="26"/>
           <w:szCs w:val="26"/>
         </w:rPr>
-        <w:t xml:space="preserve">Khối Kỹ thuật giữ vai trò cốt lõi, là trung tâm sáng tạo công nghệ, </w:t>
+        <w:t xml:space="preserve">Khối Kỹ thuật giữ vai trò cốt lõi, là trung tâm sáng tạo </w:t>
       </w:r>
       <w:r>
         <w:rPr>
@@ -10018,7 +9990,21 @@
           <w:sz w:val="26"/>
           <w:szCs w:val="26"/>
         </w:rPr>
-        <w:t>chịu trách nhiệm đảm bảo chất lượng và tiến độ của các dự án phần mềm. Các phòng ban trực thuộc gồm:</w:t>
+        <w:t xml:space="preserve">công nghệ, chịu trách nhiệm đảm bảo chất lượng và tiến độ của các dự án </w:t>
+      </w:r>
+      <w:r>
+        <w:rPr>
+          <w:sz w:val="26"/>
+          <w:szCs w:val="26"/>
+        </w:rPr>
+        <w:br/>
+      </w:r>
+      <w:r>
+        <w:rPr>
+          <w:sz w:val="26"/>
+          <w:szCs w:val="26"/>
+        </w:rPr>
+        <w:t>phần mềm. Các phòng ban trực thuộc gồm:</w:t>
       </w:r>
     </w:p>
     <w:p>
@@ -10087,7 +10073,6 @@
           <w:sz w:val="26"/>
           <w:szCs w:val="26"/>
         </w:rPr>
-        <w:lastRenderedPageBreak/>
         <w:t>UI/UX</w:t>
       </w:r>
       <w:r>
@@ -10179,6 +10164,7 @@
           <w:sz w:val="26"/>
           <w:szCs w:val="26"/>
         </w:rPr>
+        <w:lastRenderedPageBreak/>
         <w:t>Quality Control (QC)</w:t>
       </w:r>
       <w:r>
@@ -10961,7 +10947,6 @@
         <w:br/>
       </w:r>
       <w:r>
-        <w:lastRenderedPageBreak/>
         <w:t>nhân sự trẻ, năng động</w:t>
       </w:r>
       <w:r>
@@ -10997,6 +10982,7 @@
         <w:contextualSpacing w:val="0"/>
       </w:pPr>
       <w:r>
+        <w:lastRenderedPageBreak/>
         <w:t>Ngược lại, tỷ lệ lao động dưới 25 tuổi có xu hướng giảm dần qua các năm, từ 15% năm 2022 xuống còn 12% năm 2023 và</w:t>
       </w:r>
       <w:r>
@@ -12327,6 +12313,7 @@
       <w:tblPr>
         <w:tblStyle w:val="TableGrid"/>
         <w:tblW w:w="0" w:type="auto"/>
+        <w:jc w:val="center"/>
         <w:tblLook w:val="04A0" w:firstRow="1" w:lastRow="0" w:firstColumn="1" w:lastColumn="0" w:noHBand="0" w:noVBand="1"/>
       </w:tblPr>
       <w:tblGrid>
@@ -12336,6 +12323,9 @@
         <w:gridCol w:w="736"/>
       </w:tblGrid>
       <w:tr>
+        <w:trPr>
+          <w:jc w:val="center"/>
+        </w:trPr>
         <w:tc>
           <w:tcPr>
             <w:tcW w:w="0" w:type="auto"/>
@@ -12458,6 +12448,9 @@
         </w:tc>
       </w:tr>
       <w:tr>
+        <w:trPr>
+          <w:jc w:val="center"/>
+        </w:trPr>
         <w:tc>
           <w:tcPr>
             <w:tcW w:w="0" w:type="auto"/>
@@ -12564,6 +12557,9 @@
         </w:tc>
       </w:tr>
       <w:tr>
+        <w:trPr>
+          <w:jc w:val="center"/>
+        </w:trPr>
         <w:tc>
           <w:tcPr>
             <w:tcW w:w="0" w:type="auto"/>
@@ -13565,8 +13561,8 @@
         <w:tabs>
           <w:tab w:val="clear" w:pos="720"/>
         </w:tabs>
-        <w:spacing w:after="240" w:line="360" w:lineRule="auto"/>
-        <w:ind w:left="851" w:hanging="284"/>
+        <w:spacing w:line="360" w:lineRule="auto"/>
+        <w:ind w:left="1134" w:hanging="284"/>
         <w:contextualSpacing w:val="0"/>
       </w:pPr>
       <w:r>
@@ -13583,7 +13579,7 @@
         <w:rPr>
           <w:lang w:val="vi-VN"/>
         </w:rPr>
-        <w:t xml:space="preserve"> nhân sự, trong đó hơn 80% có trình độ Đại học và Sau đại học, MeU sở hữu lực lượng lao động tri thức cao. Sự kết hợp giữa đội ngũ lãnh đạo hơn 20 năm kinh nghiệm quốc tế và lực lượng nhân sự trẻ (70% từ 25-35 tuổi) tạo nên sự cân bằng giữa </w:t>
+        <w:t xml:space="preserve"> nhân sự, trong đó hơn 80% có trình độ Đại học và Sau đại học, MeU sở hữu lực lượng lao động tri thức cao. Sự kết hợp giữa đội ngũ lãnh đạo hơn 20 năm </w:t>
       </w:r>
       <w:r>
         <w:br/>
@@ -13592,7 +13588,16 @@
         <w:rPr>
           <w:lang w:val="vi-VN"/>
         </w:rPr>
-        <w:t>kinh nghiệm quản lý và khả năng sáng tạo đột phá.</w:t>
+        <w:t xml:space="preserve">kinh nghiệm quốc tế và lực lượng nhân sự trẻ (70% từ 25-35 tuổi) tạo nên </w:t>
+      </w:r>
+      <w:r>
+        <w:br/>
+      </w:r>
+      <w:r>
+        <w:rPr>
+          <w:lang w:val="vi-VN"/>
+        </w:rPr>
+        <w:t>sự cân bằng giữa kinh nghiệm quản lý và khả năng sáng tạo đột phá.</w:t>
       </w:r>
     </w:p>
     <w:p>
@@ -13605,8 +13610,8 @@
         <w:tabs>
           <w:tab w:val="clear" w:pos="720"/>
         </w:tabs>
-        <w:spacing w:after="240" w:line="360" w:lineRule="auto"/>
-        <w:ind w:left="851" w:hanging="284"/>
+        <w:spacing w:line="360" w:lineRule="auto"/>
+        <w:ind w:left="1134" w:hanging="284"/>
         <w:contextualSpacing w:val="0"/>
       </w:pPr>
       <w:r>
@@ -13645,7 +13650,7 @@
           <w:tab w:val="clear" w:pos="720"/>
         </w:tabs>
         <w:spacing w:after="240" w:line="360" w:lineRule="auto"/>
-        <w:ind w:left="851" w:hanging="284"/>
+        <w:ind w:left="1134" w:hanging="284"/>
         <w:contextualSpacing w:val="0"/>
       </w:pPr>
       <w:r>
@@ -13768,8 +13773,8 @@
         <w:tabs>
           <w:tab w:val="clear" w:pos="720"/>
         </w:tabs>
-        <w:spacing w:after="240" w:line="360" w:lineRule="auto"/>
-        <w:ind w:left="851" w:hanging="284"/>
+        <w:spacing w:line="360" w:lineRule="auto"/>
+        <w:ind w:left="1134" w:hanging="284"/>
         <w:contextualSpacing w:val="0"/>
         <w:rPr>
           <w:lang w:val="vi-VN"/>
@@ -13837,8 +13842,8 @@
         <w:tabs>
           <w:tab w:val="clear" w:pos="720"/>
         </w:tabs>
-        <w:spacing w:after="240" w:line="360" w:lineRule="auto"/>
-        <w:ind w:left="851" w:hanging="284"/>
+        <w:spacing w:line="360" w:lineRule="auto"/>
+        <w:ind w:left="1134" w:hanging="284"/>
         <w:contextualSpacing w:val="0"/>
         <w:rPr>
           <w:lang w:val="vi-VN"/>
@@ -13871,7 +13876,7 @@
           <w:tab w:val="clear" w:pos="720"/>
         </w:tabs>
         <w:spacing w:after="240" w:line="360" w:lineRule="auto"/>
-        <w:ind w:left="851" w:hanging="284"/>
+        <w:ind w:left="1134" w:hanging="284"/>
         <w:contextualSpacing w:val="0"/>
         <w:rPr>
           <w:lang w:val="vi-VN"/>
@@ -13912,7 +13917,6 @@
           <w:bCs/>
           <w:lang w:val="vi-VN"/>
         </w:rPr>
-        <w:lastRenderedPageBreak/>
         <w:t>Nhược điểm:</w:t>
       </w:r>
     </w:p>
@@ -13926,8 +13930,8 @@
         <w:tabs>
           <w:tab w:val="clear" w:pos="720"/>
         </w:tabs>
-        <w:spacing w:after="240" w:line="360" w:lineRule="auto"/>
-        <w:ind w:left="851" w:hanging="284"/>
+        <w:spacing w:line="360" w:lineRule="auto"/>
+        <w:ind w:left="1134" w:hanging="284"/>
         <w:contextualSpacing w:val="0"/>
         <w:rPr>
           <w:lang w:val="vi-VN"/>
@@ -13937,6 +13941,7 @@
         <w:rPr>
           <w:lang w:val="vi-VN"/>
         </w:rPr>
+        <w:lastRenderedPageBreak/>
         <w:t>Quy mô nhân sự vẫn ở mức doanh nghiệp vừa (</w:t>
       </w:r>
       <w:r>
@@ -13979,7 +13984,7 @@
           <w:tab w:val="clear" w:pos="720"/>
         </w:tabs>
         <w:spacing w:after="240" w:line="360" w:lineRule="auto"/>
-        <w:ind w:left="851" w:hanging="284"/>
+        <w:ind w:left="1134" w:hanging="284"/>
         <w:contextualSpacing w:val="0"/>
         <w:rPr>
           <w:lang w:val="vi-VN"/>
@@ -14021,8 +14026,8 @@
         <w:tabs>
           <w:tab w:val="clear" w:pos="720"/>
         </w:tabs>
-        <w:spacing w:after="240" w:line="360" w:lineRule="auto"/>
-        <w:ind w:left="851" w:hanging="284"/>
+        <w:spacing w:line="360" w:lineRule="auto"/>
+        <w:ind w:left="1134" w:hanging="284"/>
         <w:contextualSpacing w:val="0"/>
         <w:rPr>
           <w:lang w:val="vi-VN"/>
@@ -14054,8 +14059,8 @@
         <w:tabs>
           <w:tab w:val="clear" w:pos="720"/>
         </w:tabs>
-        <w:spacing w:after="240" w:line="360" w:lineRule="auto"/>
-        <w:ind w:left="851" w:hanging="284"/>
+        <w:spacing w:line="360" w:lineRule="auto"/>
+        <w:ind w:left="1134" w:hanging="284"/>
         <w:contextualSpacing w:val="0"/>
         <w:rPr>
           <w:lang w:val="vi-VN"/>
@@ -14088,7 +14093,7 @@
           <w:tab w:val="clear" w:pos="720"/>
         </w:tabs>
         <w:spacing w:after="240" w:line="360" w:lineRule="auto"/>
-        <w:ind w:left="851" w:hanging="284"/>
+        <w:ind w:left="1134" w:hanging="284"/>
         <w:contextualSpacing w:val="0"/>
         <w:rPr>
           <w:lang w:val="vi-VN"/>
@@ -14176,7 +14181,7 @@
           <w:tab w:val="clear" w:pos="720"/>
         </w:tabs>
         <w:spacing w:after="240" w:line="360" w:lineRule="auto"/>
-        <w:ind w:left="851" w:hanging="284"/>
+        <w:ind w:left="1134" w:hanging="284"/>
         <w:rPr>
           <w:rFonts w:cs="Times New Roman"/>
           <w:color w:val="000000" w:themeColor="text1"/>
@@ -14255,7 +14260,7 @@
           <w:tab w:val="clear" w:pos="720"/>
         </w:tabs>
         <w:spacing w:after="240" w:line="360" w:lineRule="auto"/>
-        <w:ind w:left="851" w:hanging="284"/>
+        <w:ind w:left="1134" w:hanging="284"/>
         <w:rPr>
           <w:rFonts w:cs="Times New Roman"/>
           <w:color w:val="000000" w:themeColor="text1"/>
@@ -14354,7 +14359,7 @@
           <w:tab w:val="clear" w:pos="720"/>
         </w:tabs>
         <w:spacing w:after="240" w:line="360" w:lineRule="auto"/>
-        <w:ind w:left="851" w:hanging="284"/>
+        <w:ind w:left="1134" w:hanging="284"/>
         <w:rPr>
           <w:rFonts w:cs="Times New Roman"/>
           <w:color w:val="000000" w:themeColor="text1"/>
@@ -14382,8 +14387,22 @@
           <w:color w:val="000000" w:themeColor="text1"/>
           <w:lang w:val="vi-VN"/>
         </w:rPr>
-        <w:lastRenderedPageBreak/>
-        <w:t>doanh nghiệp cùng hợp tác, chia sẻ và phát triển bền vững, thay vì chỉ dừng lại ở quan hệ mua-bán truyền thống.</w:t>
+        <w:t xml:space="preserve">doanh nghiệp cùng hợp tác, chia sẻ và phát triển bền vững, thay vì chỉ </w:t>
+      </w:r>
+      <w:r>
+        <w:rPr>
+          <w:rFonts w:cs="Times New Roman"/>
+          <w:color w:val="000000" w:themeColor="text1"/>
+        </w:rPr>
+        <w:br/>
+      </w:r>
+      <w:r>
+        <w:rPr>
+          <w:rFonts w:cs="Times New Roman"/>
+          <w:color w:val="000000" w:themeColor="text1"/>
+          <w:lang w:val="vi-VN"/>
+        </w:rPr>
+        <w:t>dừng lại ở quan hệ mua-bán truyền thống.</w:t>
       </w:r>
     </w:p>
     <w:p>
@@ -14397,7 +14416,7 @@
           <w:tab w:val="clear" w:pos="720"/>
         </w:tabs>
         <w:spacing w:after="240" w:line="360" w:lineRule="auto"/>
-        <w:ind w:left="851" w:hanging="284"/>
+        <w:ind w:left="1134" w:hanging="284"/>
         <w:rPr>
           <w:rFonts w:cs="Times New Roman"/>
           <w:color w:val="000000" w:themeColor="text1"/>
@@ -14417,15 +14436,53 @@
           <w:rFonts w:cs="Times New Roman"/>
           <w:color w:val="000000" w:themeColor="text1"/>
         </w:rPr>
-        <w:t xml:space="preserve"> nhân viên</w:t>
-      </w:r>
-      <w:r>
-        <w:rPr>
-          <w:rFonts w:cs="Times New Roman"/>
-          <w:color w:val="000000" w:themeColor="text1"/>
-          <w:lang w:val="vi-VN"/>
-        </w:rPr>
-        <w:t xml:space="preserve"> nội bộ và thu hút nhân tài, hướng tới mục tiêu trở thành trung tâm huấn luyện và cung cấp nguồn nhân lực công nghệ cao cấp hàng đầu từ Việt Nam</w:t>
+        <w:t xml:space="preserve"> </w:t>
+      </w:r>
+      <w:r>
+        <w:rPr>
+          <w:rFonts w:cs="Times New Roman"/>
+          <w:color w:val="000000" w:themeColor="text1"/>
+        </w:rPr>
+        <w:br/>
+      </w:r>
+      <w:r>
+        <w:rPr>
+          <w:rFonts w:cs="Times New Roman"/>
+          <w:color w:val="000000" w:themeColor="text1"/>
+        </w:rPr>
+        <w:t>nhân viên</w:t>
+      </w:r>
+      <w:r>
+        <w:rPr>
+          <w:rFonts w:cs="Times New Roman"/>
+          <w:color w:val="000000" w:themeColor="text1"/>
+          <w:lang w:val="vi-VN"/>
+        </w:rPr>
+        <w:t xml:space="preserve"> nội bộ và thu hút nhân tài, hướng tới mục tiêu trở thành trung tâm </w:t>
+      </w:r>
+      <w:r>
+        <w:rPr>
+          <w:rFonts w:cs="Times New Roman"/>
+          <w:color w:val="000000" w:themeColor="text1"/>
+          <w:lang w:val="vi-VN"/>
+        </w:rPr>
+        <w:lastRenderedPageBreak/>
+        <w:t xml:space="preserve">huấn luyện và cung cấp nguồn nhân lực công nghệ cao cấp hàng đầu từ </w:t>
+      </w:r>
+      <w:r>
+        <w:rPr>
+          <w:rFonts w:cs="Times New Roman"/>
+          <w:color w:val="000000" w:themeColor="text1"/>
+        </w:rPr>
+        <w:br/>
+      </w:r>
+      <w:r>
+        <w:rPr>
+          <w:rFonts w:cs="Times New Roman"/>
+          <w:color w:val="000000" w:themeColor="text1"/>
+          <w:lang w:val="vi-VN"/>
+        </w:rPr>
+        <w:t>Việt Nam</w:t>
       </w:r>
       <w:r>
         <w:rPr>
@@ -14520,18 +14577,32 @@
           <w:numId w:val="13"/>
         </w:numPr>
         <w:spacing w:after="240" w:line="360" w:lineRule="auto"/>
-        <w:ind w:left="851" w:hanging="284"/>
-        <w:rPr>
-          <w:rFonts w:cs="Times New Roman"/>
-          <w:color w:val="000000" w:themeColor="text1"/>
-        </w:rPr>
-      </w:pPr>
-      <w:r>
-        <w:rPr>
-          <w:rFonts w:cs="Times New Roman"/>
-          <w:color w:val="000000" w:themeColor="text1"/>
-        </w:rPr>
-        <w:t>Giai đoạn Phát triển (Backend Development): Giai đoạn này chỉ tập trung vào quy trình xây dựng ứng dụng, phân tích nghiệp vụ, thiết kế API đến kiểm thử.</w:t>
+        <w:ind w:left="1134" w:hanging="284"/>
+        <w:rPr>
+          <w:rFonts w:cs="Times New Roman"/>
+          <w:color w:val="000000" w:themeColor="text1"/>
+        </w:rPr>
+      </w:pPr>
+      <w:r>
+        <w:rPr>
+          <w:rFonts w:cs="Times New Roman"/>
+          <w:color w:val="000000" w:themeColor="text1"/>
+        </w:rPr>
+        <w:t xml:space="preserve">Giai đoạn Phát triển (Backend Development): Giai đoạn này chỉ tập trung vào quy trình xây dựng ứng dụng, phân tích nghiệp vụ, thiết kế API đến </w:t>
+      </w:r>
+      <w:r>
+        <w:rPr>
+          <w:rFonts w:cs="Times New Roman"/>
+          <w:color w:val="000000" w:themeColor="text1"/>
+        </w:rPr>
+        <w:br/>
+      </w:r>
+      <w:r>
+        <w:rPr>
+          <w:rFonts w:cs="Times New Roman"/>
+          <w:color w:val="000000" w:themeColor="text1"/>
+        </w:rPr>
+        <w:t>kiểm thử.</w:t>
       </w:r>
     </w:p>
     <w:p>
@@ -14542,7 +14613,7 @@
           <w:numId w:val="13"/>
         </w:numPr>
         <w:spacing w:after="240" w:line="360" w:lineRule="auto"/>
-        <w:ind w:left="851" w:hanging="284"/>
+        <w:ind w:left="1134" w:hanging="284"/>
         <w:rPr>
           <w:rFonts w:cs="Times New Roman"/>
           <w:color w:val="000000" w:themeColor="text1"/>
@@ -14617,7 +14688,7 @@
           <w:numId w:val="19"/>
         </w:numPr>
         <w:spacing w:after="240" w:line="360" w:lineRule="auto"/>
-        <w:ind w:left="851" w:hanging="284"/>
+        <w:ind w:left="1134" w:hanging="284"/>
         <w:rPr>
           <w:rFonts w:cs="Times New Roman"/>
           <w:color w:val="000000" w:themeColor="text1"/>
@@ -14639,7 +14710,7 @@
           <w:numId w:val="19"/>
         </w:numPr>
         <w:spacing w:after="240" w:line="360" w:lineRule="auto"/>
-        <w:ind w:left="851" w:hanging="284"/>
+        <w:ind w:left="1134" w:hanging="284"/>
         <w:rPr>
           <w:rFonts w:cs="Times New Roman"/>
           <w:color w:val="000000" w:themeColor="text1"/>
@@ -14675,7 +14746,7 @@
           <w:numId w:val="19"/>
         </w:numPr>
         <w:spacing w:after="240" w:line="360" w:lineRule="auto"/>
-        <w:ind w:left="851" w:hanging="284"/>
+        <w:ind w:left="1134" w:hanging="284"/>
         <w:rPr>
           <w:rFonts w:cs="Times New Roman"/>
           <w:color w:val="000000" w:themeColor="text1"/>
@@ -14697,7 +14768,7 @@
           <w:numId w:val="19"/>
         </w:numPr>
         <w:spacing w:after="240" w:line="360" w:lineRule="auto"/>
-        <w:ind w:left="851" w:hanging="284"/>
+        <w:ind w:left="1134" w:hanging="284"/>
         <w:rPr>
           <w:rFonts w:cs="Times New Roman"/>
           <w:color w:val="000000" w:themeColor="text1"/>
@@ -14719,7 +14790,7 @@
           <w:numId w:val="19"/>
         </w:numPr>
         <w:spacing w:after="240" w:line="360" w:lineRule="auto"/>
-        <w:ind w:left="851" w:hanging="284"/>
+        <w:ind w:left="1134" w:hanging="284"/>
         <w:rPr>
           <w:rFonts w:cs="Times New Roman"/>
           <w:color w:val="000000" w:themeColor="text1"/>
@@ -14749,7 +14820,7 @@
           <w:numId w:val="19"/>
         </w:numPr>
         <w:spacing w:after="240" w:line="360" w:lineRule="auto"/>
-        <w:ind w:left="851" w:hanging="284"/>
+        <w:ind w:left="1134" w:hanging="284"/>
         <w:rPr>
           <w:rFonts w:cs="Times New Roman"/>
           <w:color w:val="000000" w:themeColor="text1"/>
@@ -14845,7 +14916,21 @@
           <w:color w:val="000000" w:themeColor="text1"/>
         </w:rPr>
         <w:lastRenderedPageBreak/>
-        <w:t>Quy trình thực tập tại nhóm Backend của tôi được diễn ra như sau:</w:t>
+        <w:t xml:space="preserve">Quy trình thực tập tại nhóm Backend của </w:t>
+      </w:r>
+      <w:r>
+        <w:rPr>
+          <w:rFonts w:cs="Times New Roman"/>
+          <w:color w:val="000000" w:themeColor="text1"/>
+        </w:rPr>
+        <w:t>sinh viên</w:t>
+      </w:r>
+      <w:r>
+        <w:rPr>
+          <w:rFonts w:cs="Times New Roman"/>
+          <w:color w:val="000000" w:themeColor="text1"/>
+        </w:rPr>
+        <w:t xml:space="preserve"> được diễn ra như sau:</w:t>
       </w:r>
     </w:p>
     <w:p>
@@ -14856,18 +14941,32 @@
           <w:numId w:val="20"/>
         </w:numPr>
         <w:spacing w:after="240" w:line="360" w:lineRule="auto"/>
-        <w:ind w:left="851" w:hanging="284"/>
-        <w:rPr>
-          <w:rFonts w:cs="Times New Roman"/>
-          <w:color w:val="000000" w:themeColor="text1"/>
-        </w:rPr>
-      </w:pPr>
-      <w:r>
-        <w:rPr>
-          <w:rFonts w:cs="Times New Roman"/>
-          <w:color w:val="000000" w:themeColor="text1"/>
-        </w:rPr>
-        <w:t>Từ nhiệm vụ được giao, tôi sẽ phân tích yêu cầu.</w:t>
+        <w:ind w:left="1134" w:hanging="284"/>
+        <w:rPr>
+          <w:rFonts w:cs="Times New Roman"/>
+          <w:color w:val="000000" w:themeColor="text1"/>
+        </w:rPr>
+      </w:pPr>
+      <w:r>
+        <w:rPr>
+          <w:rFonts w:cs="Times New Roman"/>
+          <w:color w:val="000000" w:themeColor="text1"/>
+        </w:rPr>
+        <w:t xml:space="preserve">Từ nhiệm vụ được giao, </w:t>
+      </w:r>
+      <w:r>
+        <w:rPr>
+          <w:rFonts w:cs="Times New Roman"/>
+          <w:color w:val="000000" w:themeColor="text1"/>
+        </w:rPr>
+        <w:t>sinh viên</w:t>
+      </w:r>
+      <w:r>
+        <w:rPr>
+          <w:rFonts w:cs="Times New Roman"/>
+          <w:color w:val="000000" w:themeColor="text1"/>
+        </w:rPr>
+        <w:t xml:space="preserve"> sẽ phân tích yêu cầu.</w:t>
       </w:r>
     </w:p>
     <w:p>
@@ -14878,7 +14977,7 @@
           <w:numId w:val="20"/>
         </w:numPr>
         <w:spacing w:after="240" w:line="360" w:lineRule="auto"/>
-        <w:ind w:left="851" w:hanging="284"/>
+        <w:ind w:left="1134" w:hanging="284"/>
         <w:rPr>
           <w:rFonts w:cs="Times New Roman"/>
           <w:color w:val="000000" w:themeColor="text1"/>
@@ -14900,7 +14999,7 @@
           <w:numId w:val="20"/>
         </w:numPr>
         <w:spacing w:after="240" w:line="360" w:lineRule="auto"/>
-        <w:ind w:left="851" w:hanging="284"/>
+        <w:ind w:left="1134" w:hanging="284"/>
         <w:rPr>
           <w:rFonts w:cs="Times New Roman"/>
           <w:color w:val="000000" w:themeColor="text1"/>
@@ -14922,7 +15021,7 @@
           <w:numId w:val="20"/>
         </w:numPr>
         <w:spacing w:after="240" w:line="360" w:lineRule="auto"/>
-        <w:ind w:left="851" w:hanging="284"/>
+        <w:ind w:left="1134" w:hanging="284"/>
         <w:rPr>
           <w:rFonts w:cs="Times New Roman"/>
           <w:color w:val="000000" w:themeColor="text1"/>
@@ -14944,7 +15043,7 @@
           <w:numId w:val="20"/>
         </w:numPr>
         <w:spacing w:after="240" w:line="360" w:lineRule="auto"/>
-        <w:ind w:left="851" w:hanging="284"/>
+        <w:ind w:left="1134" w:hanging="284"/>
         <w:rPr>
           <w:rFonts w:cs="Times New Roman"/>
           <w:color w:val="000000" w:themeColor="text1"/>
@@ -14966,7 +15065,7 @@
           <w:numId w:val="20"/>
         </w:numPr>
         <w:spacing w:after="240" w:line="360" w:lineRule="auto"/>
-        <w:ind w:left="1134" w:hanging="284"/>
+        <w:ind w:left="1418" w:hanging="284"/>
         <w:rPr>
           <w:rFonts w:cs="Times New Roman"/>
           <w:color w:val="000000" w:themeColor="text1"/>
@@ -14988,18 +15087,32 @@
           <w:numId w:val="20"/>
         </w:numPr>
         <w:spacing w:after="240" w:line="360" w:lineRule="auto"/>
-        <w:ind w:left="1134" w:hanging="284"/>
-        <w:rPr>
-          <w:rFonts w:cs="Times New Roman"/>
-          <w:color w:val="000000" w:themeColor="text1"/>
-        </w:rPr>
-      </w:pPr>
-      <w:r>
-        <w:rPr>
-          <w:rFonts w:cs="Times New Roman"/>
-          <w:color w:val="000000" w:themeColor="text1"/>
-        </w:rPr>
-        <w:t xml:space="preserve">Nếu không đạt thì sẽ thông báo lại cho tôi sửa lỗi/tối ưu lại rồi lặp lại </w:t>
+        <w:ind w:left="1418" w:hanging="284"/>
+        <w:rPr>
+          <w:rFonts w:cs="Times New Roman"/>
+          <w:color w:val="000000" w:themeColor="text1"/>
+        </w:rPr>
+      </w:pPr>
+      <w:r>
+        <w:rPr>
+          <w:rFonts w:cs="Times New Roman"/>
+          <w:color w:val="000000" w:themeColor="text1"/>
+        </w:rPr>
+        <w:t xml:space="preserve">Nếu không đạt thì sẽ thông báo lại cho </w:t>
+      </w:r>
+      <w:r>
+        <w:rPr>
+          <w:rFonts w:cs="Times New Roman"/>
+          <w:color w:val="000000" w:themeColor="text1"/>
+        </w:rPr>
+        <w:t>sinh viên</w:t>
+      </w:r>
+      <w:r>
+        <w:rPr>
+          <w:rFonts w:cs="Times New Roman"/>
+          <w:color w:val="000000" w:themeColor="text1"/>
+        </w:rPr>
+        <w:t xml:space="preserve"> sửa lỗi/tối ưu lại rồi lặp lại </w:t>
       </w:r>
       <w:r>
         <w:rPr>
@@ -15129,13 +15242,16 @@
         <w:br/>
       </w:r>
       <w:r>
-        <w:t xml:space="preserve">sinh viên đã có cơ hội trực tiếp tham gia vào môi trường làm việc chuyên nghiệp của một doanh nghiệp. Quá trình thực tập không chỉ giúp sinh viên củng cố và mở rộng </w:t>
+        <w:t xml:space="preserve">sinh viên đã có cơ hội trực tiếp tham gia vào môi trường làm việc chuyên nghiệp của </w:t>
+      </w:r>
+      <w:r>
+        <w:lastRenderedPageBreak/>
+        <w:t xml:space="preserve">một doanh nghiệp. Quá trình thực tập không chỉ giúp sinh viên củng cố và mở rộng </w:t>
       </w:r>
       <w:r>
         <w:br/>
       </w:r>
       <w:r>
-        <w:lastRenderedPageBreak/>
         <w:t xml:space="preserve">kiến thức chuyên môn đã được học tại trường mà còn tạo điều kiện để vận dụng </w:t>
       </w:r>
       <w:r>
@@ -15335,17 +15451,14 @@
         <w:ind w:firstLine="567"/>
       </w:pPr>
       <w:r>
+        <w:lastRenderedPageBreak/>
         <w:t xml:space="preserve">Song song với đó, sinh viên được tiếp cận sâu hơn với kỹ thuật phát triển và </w:t>
       </w:r>
       <w:r>
         <w:br/>
       </w:r>
       <w:r>
-        <w:t xml:space="preserve">kiểm thử API trong môi trường ASP.NET Core. Sinh viên đã tìm hiểu và nắm vững </w:t>
-      </w:r>
-      <w:r>
-        <w:lastRenderedPageBreak/>
-        <w:t xml:space="preserve">vòng đời của một yêu cầu HTTP trong hệ thống, từ lúc request được gửi lên server, </w:t>
+        <w:t xml:space="preserve">kiểm thử API trong môi trường ASP.NET Core. Sinh viên đã tìm hiểu và nắm vững vòng đời của một yêu cầu HTTP trong hệ thống, từ lúc request được gửi lên server, </w:t>
       </w:r>
       <w:r>
         <w:br/>
@@ -15492,14 +15605,14 @@
         <w:br/>
       </w:r>
       <w:r>
-        <w:t>Những kiến thức này giúp sinh viên nhận thức được vai trò của backend trong toàn bộ hệ thống và cách phối hợp hiệu quả với frontend để đảm bảo dữ liệu được truyền tải chính xác và nhất quán. Đồng thời, sinh viên được tiếp cận sâu hơn</w:t>
-      </w:r>
-      <w:r>
-        <w:t xml:space="preserve"> với các khái niệm </w:t>
+        <w:t xml:space="preserve">Những kiến thức này giúp sinh viên nhận thức được vai trò của backend trong toàn bộ </w:t>
       </w:r>
       <w:r>
         <w:lastRenderedPageBreak/>
-        <w:t>nâng cao của</w:t>
+        <w:t>hệ thống và cách phối hợp hiệu quả với frontend để đảm bảo dữ liệu được truyền tải chính xác và nhất quán. Đồng thời, sinh viên được tiếp cận sâu hơn</w:t>
+      </w:r>
+      <w:r>
+        <w:t xml:space="preserve"> với các khái niệm nâng cao của</w:t>
       </w:r>
       <w:r>
         <w:t xml:space="preserve"> với kiến trúc ASP.NET Core, đặc biệt là cơ chế Dependency Injection, </w:t>
@@ -15664,7 +15777,11 @@
         <w:br/>
       </w:r>
       <w:r>
-        <w:t xml:space="preserve">sự cố. Bên cạnh đó, việc nghiên cứu mô hình Internal Developer Platform giúp sinh viên có cái nhìn tổng quan hơn về xu hướng tối ưu hóa trải nghiệm làm việc cho đội ngũ </w:t>
+        <w:t xml:space="preserve">sự cố. Bên cạnh đó, việc nghiên cứu mô hình Internal Developer Platform giúp sinh viên </w:t>
+      </w:r>
+      <w:r>
+        <w:lastRenderedPageBreak/>
+        <w:t xml:space="preserve">có cái nhìn tổng quan hơn về xu hướng tối ưu hóa trải nghiệm làm việc cho đội ngũ </w:t>
       </w:r>
       <w:r>
         <w:br/>
@@ -15679,7 +15796,6 @@
         <w:ind w:firstLine="567"/>
       </w:pPr>
       <w:r>
-        <w:lastRenderedPageBreak/>
         <w:t xml:space="preserve">Ngoài các kiến thức chuyên môn, quá trình thực tập còn giúp sinh viên rèn luyện nhiều kỹ năng mềm quan trọng. Sinh viên học được cách lập kế hoạch công việc </w:t>
       </w:r>
       <w:r>
@@ -15849,6 +15965,7 @@
         <w:ind w:firstLine="567"/>
       </w:pPr>
       <w:r>
+        <w:lastRenderedPageBreak/>
         <w:t xml:space="preserve">Song song với đó, </w:t>
       </w:r>
       <w:r>
@@ -15891,7 +16008,6 @@
         <w:br/>
       </w:r>
       <w:r>
-        <w:lastRenderedPageBreak/>
         <w:t>Việc sử dụng JIRA giúp sinh viên hiểu rõ cách quản lý công việc theo quy trình Agile, thay vì làm việc rời rạc như các bài tập cá nhân ở môi trường học tập.</w:t>
       </w:r>
     </w:p>
@@ -16048,6 +16164,7 @@
         <w:rPr>
           <w:lang w:val="vi-VN"/>
         </w:rPr>
+        <w:lastRenderedPageBreak/>
         <w:t xml:space="preserve">Trước hết, sinh viên được giới thiệu về mô hình phân quyền theo vai trò </w:t>
       </w:r>
       <w:r>
@@ -16057,14 +16174,7 @@
         <w:rPr>
           <w:lang w:val="vi-VN"/>
         </w:rPr>
-        <w:t xml:space="preserve">(Role-based Permissions) trong nhóm phát triển. Mỗi vai trò trong dự án có phạm vi trách nhiệm và quyền hạn khác nhau nhằm đảm bảo tính an toàn, ổn định và kiểm soát </w:t>
-      </w:r>
-      <w:r>
-        <w:rPr>
-          <w:lang w:val="vi-VN"/>
-        </w:rPr>
-        <w:lastRenderedPageBreak/>
-        <w:t xml:space="preserve">chất lượng của </w:t>
+        <w:t xml:space="preserve">(Role-based Permissions) trong nhóm phát triển. Mỗi vai trò trong dự án có phạm vi trách nhiệm và quyền hạn khác nhau nhằm đảm bảo tính an toàn, ổn định và kiểm soát chất lượng của </w:t>
       </w:r>
       <w:r>
         <w:t>codebase</w:t>
@@ -16389,6 +16499,7 @@
         <w:rPr>
           <w:lang w:val="vi-VN"/>
         </w:rPr>
+        <w:lastRenderedPageBreak/>
         <w:t>thay đổi mà còn thể hiện rõ loại thay đổi</w:t>
       </w:r>
       <w:r>
@@ -16416,14 +16527,7 @@
         <w:rPr>
           <w:lang w:val="vi-VN"/>
         </w:rPr>
-        <w:t xml:space="preserve"> tương ứng. Việc áp dụng </w:t>
-      </w:r>
-      <w:r>
-        <w:rPr>
-          <w:lang w:val="vi-VN"/>
-        </w:rPr>
-        <w:lastRenderedPageBreak/>
-        <w:t xml:space="preserve">chuẩn commit giúp lịch sử </w:t>
+        <w:t xml:space="preserve"> tương ứng. Việc áp dụng chuẩn commit giúp lịch sử </w:t>
       </w:r>
       <w:r>
         <w:t>source code</w:t>
@@ -16787,6 +16891,7 @@
         <w:rPr>
           <w:lang w:val="vi-VN"/>
         </w:rPr>
+        <w:lastRenderedPageBreak/>
         <w:t xml:space="preserve">Tiếp theo là môi trường Staging, được xem là môi trường kiểm thử cuối cùng </w:t>
       </w:r>
       <w:r>
@@ -16805,14 +16910,7 @@
         <w:rPr>
           <w:lang w:val="vi-VN"/>
         </w:rPr>
-        <w:t xml:space="preserve"> kiểm tra toàn diện hệ thống trong các điều kiện </w:t>
-      </w:r>
-      <w:r>
-        <w:rPr>
-          <w:lang w:val="vi-VN"/>
-        </w:rPr>
-        <w:lastRenderedPageBreak/>
-        <w:t xml:space="preserve">gần với thực tế. Tại đây, các tình huống vận hành thực tế được áp dụng để kiểm thử, </w:t>
+        <w:t xml:space="preserve"> kiểm tra toàn diện hệ thống trong các điều kiện gần với thực tế. Tại đây, các tình huống vận hành thực tế được áp dụng để kiểm thử, </w:t>
       </w:r>
       <w:r>
         <w:br/>
@@ -16953,6 +17051,7 @@
         <w:ind w:firstLine="567"/>
       </w:pPr>
       <w:r>
+        <w:lastRenderedPageBreak/>
         <w:t>Sau khi nắm bắt yêu cầu, sinh viên tiếp nhận các nhiệm vụ cụ thể được phân công từ mentor. Trong quá trình tiếp nhận nhiệm vụ, sinh viên chủ động trao đổi, đặt câu hỏi để làm rõ các yêu cầu chưa cụ thể, từ đó hạn chế sai sót trong quá trình triển khai.</w:t>
       </w:r>
     </w:p>
@@ -16962,7 +17061,6 @@
         <w:ind w:firstLine="567"/>
       </w:pPr>
       <w:r>
-        <w:lastRenderedPageBreak/>
         <w:t>Sinh viên được giao nhiệm vụ rà soát và kiểm tra các API đã được xây dựng từ các dự án trước đó. Công việc này bao gồm việc phân tích cấu trúc API, cách xử lý request/response, cũng như đánh giá khả năng tái sử dụng của các API trong bối cảnh dự án mới.</w:t>
       </w:r>
       <w:r>
@@ -17131,7 +17229,14 @@
         <w:rPr>
           <w:lang w:val="vi-VN"/>
         </w:rPr>
-        <w:t>Thông qua việc làm việc với Controller, sinh viên hiểu được cách thiết kế các API theo chuẩn RESTful, đảm bảo cấu trúc rõ ràng và nhất quán, đồng thời hạn chế việc xử lý logic nghiệp vụ trực tiếp tại Controller nhằm đảm bảo tính tách biệt giữa các tầng và nâng cao khả năng bảo trì, mở rộng của hệ thống.</w:t>
+        <w:t xml:space="preserve">Thông qua việc làm việc với Controller, sinh viên hiểu được cách thiết kế </w:t>
+      </w:r>
+      <w:r>
+        <w:rPr>
+          <w:lang w:val="vi-VN"/>
+        </w:rPr>
+        <w:lastRenderedPageBreak/>
+        <w:t>các API theo chuẩn RESTful, đảm bảo cấu trúc rõ ràng và nhất quán, đồng thời hạn chế việc xử lý logic nghiệp vụ trực tiếp tại Controller nhằm đảm bảo tính tách biệt giữa các tầng và nâng cao khả năng bảo trì, mở rộng của hệ thống.</w:t>
       </w:r>
     </w:p>
     <w:p>
@@ -17146,7 +17251,6 @@
         <w:rPr>
           <w:lang w:val="vi-VN"/>
         </w:rPr>
-        <w:lastRenderedPageBreak/>
         <w:t xml:space="preserve">Tiếp theo, sinh viên được giới thiệu về </w:t>
       </w:r>
       <w:r>
@@ -17358,6 +17462,7 @@
         <w:ind w:firstLine="567"/>
       </w:pPr>
       <w:r>
+        <w:lastRenderedPageBreak/>
         <w:t xml:space="preserve">Cuối cùng, </w:t>
       </w:r>
       <w:r>
@@ -17391,7 +17496,6 @@
         <w:br/>
       </w:r>
       <w:r>
-        <w:lastRenderedPageBreak/>
         <w:t>dữ liệu lưu trữ và logic nghiệp vụ, cũng như tầm quan trọng của việc thiết kế cấu trúc dữ liệu phù hợp với yêu cầu hệ thống.</w:t>
       </w:r>
     </w:p>
@@ -17529,7 +17633,7 @@
           <w:tab w:val="clear" w:pos="720"/>
         </w:tabs>
         <w:spacing w:line="360" w:lineRule="auto"/>
-        <w:ind w:left="851" w:hanging="284"/>
+        <w:ind w:left="1134" w:hanging="284"/>
         <w:rPr>
           <w:lang w:val="vi-VN"/>
         </w:rPr>
@@ -17551,7 +17655,7 @@
           <w:tab w:val="clear" w:pos="720"/>
         </w:tabs>
         <w:spacing w:line="360" w:lineRule="auto"/>
-        <w:ind w:left="851" w:hanging="284"/>
+        <w:ind w:left="1134" w:hanging="284"/>
         <w:rPr>
           <w:lang w:val="vi-VN"/>
         </w:rPr>
@@ -17573,7 +17677,7 @@
           <w:tab w:val="clear" w:pos="720"/>
         </w:tabs>
         <w:spacing w:line="360" w:lineRule="auto"/>
-        <w:ind w:left="851" w:hanging="284"/>
+        <w:ind w:left="1134" w:hanging="284"/>
         <w:rPr>
           <w:lang w:val="vi-VN"/>
         </w:rPr>
@@ -17595,7 +17699,7 @@
           <w:tab w:val="clear" w:pos="720"/>
         </w:tabs>
         <w:spacing w:line="360" w:lineRule="auto"/>
-        <w:ind w:left="851" w:hanging="284"/>
+        <w:ind w:left="1134" w:hanging="284"/>
         <w:rPr>
           <w:lang w:val="vi-VN"/>
         </w:rPr>
@@ -17617,7 +17721,7 @@
           <w:tab w:val="clear" w:pos="720"/>
         </w:tabs>
         <w:spacing w:line="360" w:lineRule="auto"/>
-        <w:ind w:left="851" w:hanging="284"/>
+        <w:ind w:left="1134" w:hanging="284"/>
         <w:rPr>
           <w:lang w:val="vi-VN"/>
         </w:rPr>
@@ -17666,16 +17770,25 @@
           <w:tab w:val="clear" w:pos="720"/>
         </w:tabs>
         <w:spacing w:after="240" w:line="360" w:lineRule="auto"/>
-        <w:ind w:left="851" w:hanging="284"/>
-        <w:rPr>
-          <w:lang w:val="vi-VN"/>
-        </w:rPr>
-      </w:pPr>
-      <w:r>
-        <w:rPr>
-          <w:lang w:val="vi-VN"/>
-        </w:rPr>
-        <w:t>Nếu OTP hợp lệ, người dùng được xác nhận đăng nhập thành công; ngược lại, hệ thống sẽ từ chối và áp dụng các cơ chế bảo vệ tương ứng.</w:t>
+        <w:ind w:left="1134" w:hanging="284"/>
+        <w:rPr>
+          <w:lang w:val="vi-VN"/>
+        </w:rPr>
+      </w:pPr>
+      <w:r>
+        <w:rPr>
+          <w:lang w:val="vi-VN"/>
+        </w:rPr>
+        <w:t xml:space="preserve">Nếu OTP hợp lệ, người dùng được xác nhận đăng nhập thành công; </w:t>
+      </w:r>
+      <w:r>
+        <w:br/>
+      </w:r>
+      <w:r>
+        <w:rPr>
+          <w:lang w:val="vi-VN"/>
+        </w:rPr>
+        <w:t>ngược lại, hệ thống sẽ từ chối và áp dụng các cơ chế bảo vệ tương ứng.</w:t>
       </w:r>
     </w:p>
     <w:p>
@@ -17800,7 +17913,7 @@
           <w:tab w:val="clear" w:pos="720"/>
         </w:tabs>
         <w:spacing w:line="360" w:lineRule="auto"/>
-        <w:ind w:left="851" w:hanging="284"/>
+        <w:ind w:left="1134" w:hanging="284"/>
         <w:rPr>
           <w:lang w:val="vi-VN"/>
         </w:rPr>
@@ -17825,7 +17938,7 @@
           <w:tab w:val="clear" w:pos="720"/>
         </w:tabs>
         <w:spacing w:line="360" w:lineRule="auto"/>
-        <w:ind w:left="851" w:hanging="284"/>
+        <w:ind w:left="1134" w:hanging="284"/>
         <w:rPr>
           <w:lang w:val="vi-VN"/>
         </w:rPr>
@@ -17850,7 +17963,7 @@
           <w:tab w:val="clear" w:pos="720"/>
         </w:tabs>
         <w:spacing w:line="360" w:lineRule="auto"/>
-        <w:ind w:left="851" w:hanging="284"/>
+        <w:ind w:left="1134" w:hanging="284"/>
         <w:rPr>
           <w:lang w:val="vi-VN"/>
         </w:rPr>
@@ -17875,7 +17988,7 @@
           <w:tab w:val="clear" w:pos="720"/>
         </w:tabs>
         <w:spacing w:line="360" w:lineRule="auto"/>
-        <w:ind w:left="851" w:hanging="284"/>
+        <w:ind w:left="1134" w:hanging="284"/>
         <w:rPr>
           <w:lang w:val="vi-VN"/>
         </w:rPr>
@@ -17900,7 +18013,7 @@
           <w:tab w:val="clear" w:pos="720"/>
         </w:tabs>
         <w:spacing w:after="240" w:line="360" w:lineRule="auto"/>
-        <w:ind w:left="851" w:hanging="284"/>
+        <w:ind w:left="1134" w:hanging="284"/>
         <w:rPr>
           <w:lang w:val="vi-VN"/>
         </w:rPr>
@@ -18075,7 +18188,7 @@
           <w:tab w:val="clear" w:pos="720"/>
         </w:tabs>
         <w:spacing w:line="360" w:lineRule="auto"/>
-        <w:ind w:left="851" w:hanging="284"/>
+        <w:ind w:left="1134" w:hanging="284"/>
         <w:rPr>
           <w:lang w:val="vi-VN"/>
         </w:rPr>
@@ -18101,7 +18214,7 @@
           <w:tab w:val="clear" w:pos="720"/>
         </w:tabs>
         <w:spacing w:line="360" w:lineRule="auto"/>
-        <w:ind w:left="851" w:hanging="284"/>
+        <w:ind w:left="1134" w:hanging="284"/>
         <w:rPr>
           <w:lang w:val="vi-VN"/>
         </w:rPr>
@@ -18126,7 +18239,7 @@
           <w:tab w:val="clear" w:pos="720"/>
         </w:tabs>
         <w:spacing w:line="360" w:lineRule="auto"/>
-        <w:ind w:left="851" w:hanging="284"/>
+        <w:ind w:left="1134" w:hanging="284"/>
         <w:rPr>
           <w:lang w:val="vi-VN"/>
         </w:rPr>
@@ -18151,7 +18264,7 @@
           <w:tab w:val="clear" w:pos="720"/>
         </w:tabs>
         <w:spacing w:after="240" w:line="360" w:lineRule="auto"/>
-        <w:ind w:left="851" w:hanging="284"/>
+        <w:ind w:left="1134" w:hanging="284"/>
         <w:rPr>
           <w:lang w:val="vi-VN"/>
         </w:rPr>
@@ -18289,7 +18402,7 @@
           <w:tab w:val="clear" w:pos="720"/>
         </w:tabs>
         <w:spacing w:line="360" w:lineRule="auto"/>
-        <w:ind w:left="851" w:hanging="284"/>
+        <w:ind w:left="1134" w:hanging="284"/>
         <w:rPr>
           <w:lang w:val="vi-VN"/>
         </w:rPr>
@@ -18314,7 +18427,7 @@
           <w:tab w:val="clear" w:pos="720"/>
         </w:tabs>
         <w:spacing w:line="360" w:lineRule="auto"/>
-        <w:ind w:left="851" w:hanging="284"/>
+        <w:ind w:left="1134" w:hanging="284"/>
         <w:rPr>
           <w:lang w:val="vi-VN"/>
         </w:rPr>
@@ -18348,7 +18461,7 @@
           <w:tab w:val="clear" w:pos="720"/>
         </w:tabs>
         <w:spacing w:line="360" w:lineRule="auto"/>
-        <w:ind w:left="851" w:hanging="284"/>
+        <w:ind w:left="1134" w:hanging="284"/>
         <w:rPr>
           <w:lang w:val="vi-VN"/>
         </w:rPr>
@@ -18373,7 +18486,7 @@
           <w:tab w:val="clear" w:pos="720"/>
         </w:tabs>
         <w:spacing w:line="360" w:lineRule="auto"/>
-        <w:ind w:left="851" w:hanging="284"/>
+        <w:ind w:left="1134" w:hanging="284"/>
         <w:rPr>
           <w:lang w:val="vi-VN"/>
         </w:rPr>
@@ -18398,7 +18511,7 @@
           <w:tab w:val="clear" w:pos="720"/>
         </w:tabs>
         <w:spacing w:line="360" w:lineRule="auto"/>
-        <w:ind w:left="851" w:hanging="284"/>
+        <w:ind w:left="1134" w:hanging="284"/>
         <w:rPr>
           <w:lang w:val="vi-VN"/>
         </w:rPr>
@@ -18424,7 +18537,7 @@
           <w:tab w:val="clear" w:pos="720"/>
         </w:tabs>
         <w:spacing w:after="240" w:line="360" w:lineRule="auto"/>
-        <w:ind w:left="851" w:hanging="284"/>
+        <w:ind w:left="1134" w:hanging="284"/>
         <w:rPr>
           <w:lang w:val="vi-VN"/>
         </w:rPr>
@@ -18482,7 +18595,7 @@
           <w:tab w:val="clear" w:pos="720"/>
         </w:tabs>
         <w:spacing w:line="360" w:lineRule="auto"/>
-        <w:ind w:left="851" w:hanging="284"/>
+        <w:ind w:left="1134" w:hanging="284"/>
         <w:rPr>
           <w:lang w:val="vi-VN"/>
         </w:rPr>
@@ -18507,7 +18620,7 @@
           <w:tab w:val="clear" w:pos="720"/>
         </w:tabs>
         <w:spacing w:line="360" w:lineRule="auto"/>
-        <w:ind w:left="851" w:hanging="284"/>
+        <w:ind w:left="1134" w:hanging="284"/>
         <w:rPr>
           <w:lang w:val="vi-VN"/>
         </w:rPr>
@@ -18532,7 +18645,7 @@
           <w:tab w:val="clear" w:pos="720"/>
         </w:tabs>
         <w:spacing w:line="360" w:lineRule="auto"/>
-        <w:ind w:left="851" w:hanging="284"/>
+        <w:ind w:left="1134" w:hanging="284"/>
         <w:rPr>
           <w:lang w:val="vi-VN"/>
         </w:rPr>
@@ -18557,7 +18670,7 @@
           <w:tab w:val="clear" w:pos="720"/>
         </w:tabs>
         <w:spacing w:after="240" w:line="360" w:lineRule="auto"/>
-        <w:ind w:left="851" w:hanging="284"/>
+        <w:ind w:left="1134" w:hanging="284"/>
         <w:rPr>
           <w:lang w:val="vi-VN"/>
         </w:rPr>
@@ -18597,7 +18710,7 @@
           <w:tab w:val="clear" w:pos="720"/>
         </w:tabs>
         <w:spacing w:line="360" w:lineRule="auto"/>
-        <w:ind w:left="851" w:hanging="284"/>
+        <w:ind w:left="1134" w:hanging="284"/>
         <w:rPr>
           <w:lang w:val="vi-VN"/>
         </w:rPr>
@@ -18622,7 +18735,7 @@
           <w:tab w:val="clear" w:pos="720"/>
         </w:tabs>
         <w:spacing w:line="360" w:lineRule="auto"/>
-        <w:ind w:left="851" w:hanging="284"/>
+        <w:ind w:left="1134" w:hanging="284"/>
         <w:rPr>
           <w:lang w:val="vi-VN"/>
         </w:rPr>
@@ -18656,7 +18769,7 @@
           <w:tab w:val="clear" w:pos="720"/>
         </w:tabs>
         <w:spacing w:line="360" w:lineRule="auto"/>
-        <w:ind w:left="851" w:hanging="284"/>
+        <w:ind w:left="1134" w:hanging="284"/>
         <w:rPr>
           <w:lang w:val="vi-VN"/>
         </w:rPr>
@@ -18687,7 +18800,7 @@
           <w:tab w:val="clear" w:pos="720"/>
         </w:tabs>
         <w:spacing w:after="240" w:line="360" w:lineRule="auto"/>
-        <w:ind w:left="851" w:hanging="284"/>
+        <w:ind w:left="1134" w:hanging="284"/>
         <w:rPr>
           <w:lang w:val="vi-VN"/>
         </w:rPr>
@@ -18786,7 +18899,7 @@
     </w:p>
     <w:p>
       <w:pPr>
-        <w:spacing w:before="240" w:line="360" w:lineRule="auto"/>
+        <w:spacing w:before="240" w:after="240" w:line="360" w:lineRule="auto"/>
       </w:pPr>
       <w:r>
         <w:rPr>
@@ -18988,35 +19101,7 @@
         <w:rPr>
           <w:lang w:val="vi-VN"/>
         </w:rPr>
-        <w:t xml:space="preserve">các quy tắc nghiệp vụ cốt lõi ở cấp độ doanh nghiệp, thường được biểu diễn thông qua các </w:t>
-      </w:r>
-      <w:r>
-        <w:rPr>
-          <w:i/>
-          <w:iCs/>
-          <w:lang w:val="vi-VN"/>
-        </w:rPr>
-        <w:t>Entities</w:t>
-      </w:r>
-      <w:r>
-        <w:rPr>
-          <w:lang w:val="vi-VN"/>
-        </w:rPr>
-        <w:t xml:space="preserve"> hoặc </w:t>
-      </w:r>
-      <w:r>
-        <w:rPr>
-          <w:i/>
-          <w:iCs/>
-          <w:lang w:val="vi-VN"/>
-        </w:rPr>
-        <w:t>Domain Model</w:t>
-      </w:r>
-      <w:r>
-        <w:rPr>
-          <w:lang w:val="vi-VN"/>
-        </w:rPr>
-        <w:t>. Tầng này chứa các logic nghiệp vụ quan trọng nhất, có mức độ ổn định cao và ít thay đổi. Các thành phần ở tầng này hoàn toàn độc lập với giao diện người dùng, cơ sở dữ liệu hay framework, và chỉ phụ thuộc vào các khái niệm trừu tượng.</w:t>
+        <w:t>các quy tắc nghiệp vụ cốt lõi ở cấp độ doanh nghiệp, thường được biểu diễn thông qua các Entities hoặc Domain Model. Tầng này chứa các logic nghiệp vụ quan trọng nhất, có mức độ ổn định cao và ít thay đổi. Các thành phần ở tầng này hoàn toàn độc lập với giao diện người dùng, cơ sở dữ liệu hay framework, và chỉ phụ thuộc vào các khái niệm trừu tượng.</w:t>
       </w:r>
     </w:p>
     <w:p>
@@ -19047,21 +19132,7 @@
         <w:rPr>
           <w:lang w:val="vi-VN"/>
         </w:rPr>
-        <w:t xml:space="preserve">Tầng này chịu trách nhiệm điều phối các hành động nghiệp vụ của hệ thống thông qua các </w:t>
-      </w:r>
-      <w:r>
-        <w:rPr>
-          <w:i/>
-          <w:iCs/>
-          <w:lang w:val="vi-VN"/>
-        </w:rPr>
-        <w:t>Use Case</w:t>
-      </w:r>
-      <w:r>
-        <w:rPr>
-          <w:lang w:val="vi-VN"/>
-        </w:rPr>
-        <w:t xml:space="preserve">. Mỗi use case đại diện cho một </w:t>
+        <w:t xml:space="preserve">Tầng này chịu trách nhiệm điều phối các hành động nghiệp vụ của hệ thống thông qua các Use Case. Mỗi use case đại diện cho một </w:t>
       </w:r>
       <w:r>
         <w:br/>
@@ -19103,91 +19174,7 @@
         <w:rPr>
           <w:lang w:val="vi-VN"/>
         </w:rPr>
-        <w:t xml:space="preserve">Tầng Interface Adapters đóng vai trò trung gian, bao gồm các thành phần như </w:t>
-      </w:r>
-      <w:r>
-        <w:rPr>
-          <w:i/>
-          <w:iCs/>
-          <w:lang w:val="vi-VN"/>
-        </w:rPr>
-        <w:t>Controller</w:t>
-      </w:r>
-      <w:r>
-        <w:rPr>
-          <w:lang w:val="vi-VN"/>
-        </w:rPr>
-        <w:t xml:space="preserve">, </w:t>
-      </w:r>
-      <w:r>
-        <w:rPr>
-          <w:i/>
-          <w:iCs/>
-          <w:lang w:val="vi-VN"/>
-        </w:rPr>
-        <w:t>Presenter</w:t>
-      </w:r>
-      <w:r>
-        <w:rPr>
-          <w:lang w:val="vi-VN"/>
-        </w:rPr>
-        <w:t xml:space="preserve"> và </w:t>
-      </w:r>
-      <w:r>
-        <w:rPr>
-          <w:i/>
-          <w:iCs/>
-          <w:lang w:val="vi-VN"/>
-        </w:rPr>
-        <w:t>Gateway</w:t>
-      </w:r>
-      <w:r>
-        <w:rPr>
-          <w:lang w:val="vi-VN"/>
-        </w:rPr>
-        <w:t xml:space="preserve">, cùng với các adapter khác như </w:t>
-      </w:r>
-      <w:r>
-        <w:rPr>
-          <w:i/>
-          <w:iCs/>
-          <w:lang w:val="vi-VN"/>
-        </w:rPr>
-        <w:t>Validator</w:t>
-      </w:r>
-      <w:r>
-        <w:rPr>
-          <w:lang w:val="vi-VN"/>
-        </w:rPr>
-        <w:t xml:space="preserve">, </w:t>
-      </w:r>
-      <w:r>
-        <w:rPr>
-          <w:i/>
-          <w:iCs/>
-          <w:lang w:val="vi-VN"/>
-        </w:rPr>
-        <w:t>Security Adapter</w:t>
-      </w:r>
-      <w:r>
-        <w:rPr>
-          <w:lang w:val="vi-VN"/>
-        </w:rPr>
-        <w:t xml:space="preserve">, </w:t>
-      </w:r>
-      <w:r>
-        <w:rPr>
-          <w:i/>
-          <w:iCs/>
-          <w:lang w:val="vi-VN"/>
-        </w:rPr>
-        <w:t>ViewModel</w:t>
-      </w:r>
-      <w:r>
-        <w:rPr>
-          <w:lang w:val="vi-VN"/>
-        </w:rPr>
-        <w:t>,… Nhiệm vụ chính của tầng này là chuyển đổi dữ liệu giữa các định dạng bên ngoài (HTTP request/response, dữ liệu từ cơ sở dữ liệu, API bên thứ ba) và các mô hình nội bộ của Use Case và Domain Model. Nhờ đó, khi có sự thay đổi về mặt kỹ thuật, business logic ở các tầng bên trong không bị ảnh hưởng.</w:t>
+        <w:t>Tầng Interface Adapters đóng vai trò trung gian, bao gồm các thành phần như Controller, Presenter và Gateway, cùng với các adapter khác như Validator, Security Adapter, ViewModel,… Nhiệm vụ chính của tầng này là chuyển đổi dữ liệu giữa các định dạng bên ngoài (HTTP request/response, dữ liệu từ cơ sở dữ liệu, API bên thứ ba) và các mô hình nội bộ của Use Case và Domain Model. Nhờ đó, khi có sự thay đổi về mặt kỹ thuật, business logic ở các tầng bên trong không bị ảnh hưởng.</w:t>
       </w:r>
     </w:p>
     <w:p>
@@ -19303,21 +19290,7 @@
         <w:rPr>
           <w:lang w:val="vi-VN"/>
         </w:rPr>
-        <w:t xml:space="preserve">rõ ràng giữa nghiệp vụ và các chi tiết triển khai kỹ thuật, đồng thời tuân thủ nguyên tắc </w:t>
-      </w:r>
-      <w:r>
-        <w:rPr>
-          <w:i/>
-          <w:iCs/>
-          <w:lang w:val="vi-VN"/>
-        </w:rPr>
-        <w:t>Dependency Inversion Principle</w:t>
-      </w:r>
-      <w:r>
-        <w:rPr>
-          <w:lang w:val="vi-VN"/>
-        </w:rPr>
-        <w:t xml:space="preserve"> trong SOLID. Theo nguyên tắc này, các module cấp cao không phụ thuộc trực tiếp vào các module cấp thấp, mà cả hai cùng phụ thuộc </w:t>
+        <w:t xml:space="preserve">rõ ràng giữa nghiệp vụ và các chi tiết triển khai kỹ thuật, đồng thời tuân thủ nguyên tắc Dependency Inversion Principle trong SOLID. Theo nguyên tắc này, các module cấp cao không phụ thuộc trực tiếp vào các module cấp thấp, mà cả hai cùng phụ thuộc </w:t>
       </w:r>
       <w:r>
         <w:br/>
@@ -19326,21 +19299,7 @@
         <w:rPr>
           <w:lang w:val="vi-VN"/>
         </w:rPr>
-        <w:t>vào abstraction, tránh việc phụ thuộc chặt chẽ vào các cài đặt cụ thể (</w:t>
-      </w:r>
-      <w:r>
-        <w:rPr>
-          <w:i/>
-          <w:iCs/>
-          <w:lang w:val="vi-VN"/>
-        </w:rPr>
-        <w:t>concrete implementation</w:t>
-      </w:r>
-      <w:r>
-        <w:rPr>
-          <w:lang w:val="vi-VN"/>
-        </w:rPr>
-        <w:t>).</w:t>
+        <w:t>vào abstraction, tránh việc phụ thuộc chặt chẽ vào các cài đặt cụ thể (concrete implementation).</w:t>
       </w:r>
     </w:p>
     <w:p>
@@ -19593,8 +19552,841 @@
       </w:r>
     </w:p>
     <w:p>
-      <w:r>
-        <w:t>3.3.9.2 Design Pattern</w:t>
+      <w:pPr>
+        <w:spacing w:after="240" w:line="360" w:lineRule="auto"/>
+      </w:pPr>
+      <w:r>
+        <w:t xml:space="preserve">3.3.9.2 </w:t>
+      </w:r>
+      <w:r>
+        <w:t>Domain-Driven Design</w:t>
+      </w:r>
+    </w:p>
+    <w:p>
+      <w:pPr>
+        <w:spacing w:after="240" w:line="360" w:lineRule="auto"/>
+        <w:ind w:firstLine="567"/>
+        <w:rPr>
+          <w:lang w:val="vi-VN"/>
+        </w:rPr>
+      </w:pPr>
+      <w:r>
+        <w:rPr>
+          <w:lang w:val="vi-VN"/>
+        </w:rPr>
+        <w:t xml:space="preserve">Domain-Driven Design (DDD) là một phương pháp thiết kế phần mềm tập trung vào việc mô hình hóa và giải quyết các bài toán nghiệp vụ phức tạp thông qua sự </w:t>
+      </w:r>
+      <w:r>
+        <w:br/>
+      </w:r>
+      <w:r>
+        <w:rPr>
+          <w:lang w:val="vi-VN"/>
+        </w:rPr>
+        <w:t>phối hợp chặt chẽ giữa kiến thức nghiệp vụ và kỹ thuật phần mềm. Mục tiêu của DDD là đảm bảo hệ thống phần mềm phản ánh chính xác logic kinh doanh, quy trình vận hành và chiến lược phát triển của doanh nghiệp.</w:t>
+      </w:r>
+    </w:p>
+    <w:p>
+      <w:pPr>
+        <w:spacing w:after="240" w:line="360" w:lineRule="auto"/>
+        <w:ind w:firstLine="567"/>
+        <w:rPr>
+          <w:lang w:val="vi-VN"/>
+        </w:rPr>
+      </w:pPr>
+      <w:r>
+        <w:rPr>
+          <w:lang w:val="vi-VN"/>
+        </w:rPr>
+        <w:t>DDD giới thiệu nhiều khái niệm quan trọng như Domain, Bounded Context, Ubiquitous Language, cùng các mô hình nghiệp vụ nhằm hỗ trợ việc xây dựng hệ thống có cấu trúc rõ ràng, dễ mở rộng và phù hợp với thực tế kinh doanh.</w:t>
+      </w:r>
+    </w:p>
+    <w:p>
+      <w:pPr>
+        <w:spacing w:after="240" w:line="360" w:lineRule="auto"/>
+        <w:ind w:firstLine="567"/>
+        <w:rPr>
+          <w:lang w:val="vi-VN"/>
+        </w:rPr>
+      </w:pPr>
+      <w:r>
+        <w:rPr>
+          <w:lang w:val="vi-VN"/>
+        </w:rPr>
+        <w:lastRenderedPageBreak/>
+        <w:t>Ở cấp độ thiết kế chiến lược (Strategic Design), DDD tập trung vào việc phân tích tổng thể miền nghiệp vụ (problem space) để xác định cấu trúc và ranh giới của hệ thống.</w:t>
+      </w:r>
+    </w:p>
+    <w:p>
+      <w:pPr>
+        <w:spacing w:after="240" w:line="360" w:lineRule="auto"/>
+        <w:ind w:firstLine="567"/>
+        <w:rPr>
+          <w:lang w:val="vi-VN"/>
+        </w:rPr>
+      </w:pPr>
+      <w:r>
+        <w:rPr>
+          <w:lang w:val="vi-VN"/>
+        </w:rPr>
+        <w:t>Trước hết, miền nghiệp vụ cần được phân tích và chia nhỏ thành các Subdomain. Subdomain là các phần nghiệp vụ cụ thể cấu thành nên toàn bộ domain của hệ thống. Việc xác định subdomain giúp chia nhỏ một bài toán nghiệp vụ lớn và phức tạp thành các thành phần hợp lý, có mục tiêu rõ ràng và dễ quản lý hơn.</w:t>
+      </w:r>
+    </w:p>
+    <w:p>
+      <w:pPr>
+        <w:spacing w:after="240" w:line="360" w:lineRule="auto"/>
+        <w:ind w:firstLine="567"/>
+        <w:rPr>
+          <w:lang w:val="vi-VN"/>
+        </w:rPr>
+      </w:pPr>
+      <w:r>
+        <w:rPr>
+          <w:lang w:val="vi-VN"/>
+        </w:rPr>
+        <w:t xml:space="preserve">Dựa trên mức độ quan trọng và giá trị chiến lược đối với doanh nghiệp, </w:t>
+      </w:r>
+      <w:r>
+        <w:br/>
+      </w:r>
+      <w:r>
+        <w:rPr>
+          <w:lang w:val="vi-VN"/>
+        </w:rPr>
+        <w:t>các subdomain được phân loại thành:</w:t>
+      </w:r>
+    </w:p>
+    <w:p>
+      <w:pPr>
+        <w:numPr>
+          <w:ilvl w:val="0"/>
+          <w:numId w:val="59"/>
+        </w:numPr>
+        <w:tabs>
+          <w:tab w:val="clear" w:pos="720"/>
+        </w:tabs>
+        <w:spacing w:line="360" w:lineRule="auto"/>
+        <w:ind w:left="1134" w:hanging="284"/>
+        <w:rPr>
+          <w:lang w:val="vi-VN"/>
+        </w:rPr>
+      </w:pPr>
+      <w:r>
+        <w:rPr>
+          <w:b/>
+          <w:bCs/>
+          <w:lang w:val="vi-VN"/>
+        </w:rPr>
+        <w:t>Core Domain</w:t>
+      </w:r>
+      <w:r>
+        <w:rPr>
+          <w:lang w:val="vi-VN"/>
+        </w:rPr>
+        <w:t xml:space="preserve">: đại diện cho nghiệp vụ cốt lõi, phản ánh logic và chiến lược riêng của doanh nghiệp, tạo nên lợi thế cạnh tranh và sự khác biệt trên </w:t>
+      </w:r>
+      <w:r>
+        <w:br/>
+      </w:r>
+      <w:r>
+        <w:rPr>
+          <w:lang w:val="vi-VN"/>
+        </w:rPr>
+        <w:t>thị trường. Đây là phần khó có thể sao chép hoặc thay thế bằng các giải pháp có sẵn.</w:t>
+      </w:r>
+    </w:p>
+    <w:p>
+      <w:pPr>
+        <w:numPr>
+          <w:ilvl w:val="0"/>
+          <w:numId w:val="59"/>
+        </w:numPr>
+        <w:tabs>
+          <w:tab w:val="clear" w:pos="720"/>
+        </w:tabs>
+        <w:spacing w:line="360" w:lineRule="auto"/>
+        <w:ind w:left="1134" w:hanging="284"/>
+        <w:rPr>
+          <w:lang w:val="vi-VN"/>
+        </w:rPr>
+      </w:pPr>
+      <w:r>
+        <w:rPr>
+          <w:b/>
+          <w:bCs/>
+          <w:lang w:val="vi-VN"/>
+        </w:rPr>
+        <w:t>Supporting Subdomain</w:t>
+      </w:r>
+      <w:r>
+        <w:rPr>
+          <w:lang w:val="vi-VN"/>
+        </w:rPr>
+        <w:t>: hỗ trợ cho Core Domain, giúp hoàn thiện quy trình nghiệp vụ nhưng không mang tính chiến lược cốt lõi.</w:t>
+      </w:r>
+    </w:p>
+    <w:p>
+      <w:pPr>
+        <w:numPr>
+          <w:ilvl w:val="0"/>
+          <w:numId w:val="59"/>
+        </w:numPr>
+        <w:tabs>
+          <w:tab w:val="clear" w:pos="720"/>
+        </w:tabs>
+        <w:spacing w:after="240" w:line="360" w:lineRule="auto"/>
+        <w:ind w:left="1134" w:hanging="284"/>
+        <w:rPr>
+          <w:lang w:val="vi-VN"/>
+        </w:rPr>
+      </w:pPr>
+      <w:r>
+        <w:rPr>
+          <w:b/>
+          <w:bCs/>
+          <w:lang w:val="vi-VN"/>
+        </w:rPr>
+        <w:t>Generic Subdomain</w:t>
+      </w:r>
+      <w:r>
+        <w:rPr>
+          <w:lang w:val="vi-VN"/>
+        </w:rPr>
+        <w:t xml:space="preserve">: các nghiệp vụ phổ biến, có thể dùng chung hoặc </w:t>
+      </w:r>
+      <w:r>
+        <w:br/>
+      </w:r>
+      <w:r>
+        <w:rPr>
+          <w:lang w:val="vi-VN"/>
+        </w:rPr>
+        <w:t>thay thế bằng giải pháp bên ngoài.</w:t>
+      </w:r>
+    </w:p>
+    <w:p>
+      <w:pPr>
+        <w:spacing w:after="240" w:line="360" w:lineRule="auto"/>
+        <w:ind w:firstLine="567"/>
+        <w:rPr>
+          <w:lang w:val="vi-VN"/>
+        </w:rPr>
+      </w:pPr>
+      <w:r>
+        <w:rPr>
+          <w:lang w:val="vi-VN"/>
+        </w:rPr>
+        <w:t xml:space="preserve">Ví dụ, mặc dù Be Group và Grab đều cung cấp dịch vụ gọi xe, mỗi doanh nghiệp lại sở hữu Core Domain khác nhau, gắn liền với chiến lược kinh doanh, mô hình </w:t>
+      </w:r>
+      <w:r>
+        <w:br/>
+      </w:r>
+      <w:r>
+        <w:rPr>
+          <w:lang w:val="vi-VN"/>
+        </w:rPr>
+        <w:t>vận hành và cách tối ưu dịch vụ riêng.</w:t>
+      </w:r>
+    </w:p>
+    <w:p>
+      <w:pPr>
+        <w:spacing w:after="240" w:line="360" w:lineRule="auto"/>
+        <w:ind w:firstLine="567"/>
+        <w:rPr>
+          <w:lang w:val="vi-VN"/>
+        </w:rPr>
+      </w:pPr>
+      <w:r>
+        <w:rPr>
+          <w:lang w:val="vi-VN"/>
+        </w:rPr>
+        <w:t xml:space="preserve">Sau khi xác định các subdomain, DDD yêu cầu thiết lập các ranh giới rõ ràng </w:t>
+      </w:r>
+      <w:r>
+        <w:br/>
+      </w:r>
+      <w:r>
+        <w:rPr>
+          <w:lang w:val="vi-VN"/>
+        </w:rPr>
+        <w:t xml:space="preserve">thông qua khái niệm Bounded Context. Mỗi Bounded Context đại diện cho một </w:t>
+      </w:r>
+      <w:r>
+        <w:br/>
+      </w:r>
+      <w:r>
+        <w:rPr>
+          <w:lang w:val="vi-VN"/>
+        </w:rPr>
+        <w:t xml:space="preserve">phạm vi nghiệp vụ độc lập, trong đó các khái niệm, mô hình dữ liệu và quy tắc </w:t>
+      </w:r>
+      <w:r>
+        <w:br/>
+      </w:r>
+      <w:r>
+        <w:rPr>
+          <w:lang w:val="vi-VN"/>
+        </w:rPr>
+        <w:t>nghiệp vụ được định nghĩa nhất quán và không bị ảnh hưởng trực tiếp bởi các ngữ cảnh khác.</w:t>
+      </w:r>
+    </w:p>
+    <w:p>
+      <w:pPr>
+        <w:spacing w:after="240" w:line="360" w:lineRule="auto"/>
+        <w:ind w:firstLine="567"/>
+        <w:rPr>
+          <w:lang w:val="vi-VN"/>
+        </w:rPr>
+      </w:pPr>
+      <w:r>
+        <w:rPr>
+          <w:lang w:val="vi-VN"/>
+        </w:rPr>
+        <w:t>Trong DDD, cần phân biệt rõ:</w:t>
+      </w:r>
+    </w:p>
+    <w:p>
+      <w:pPr>
+        <w:numPr>
+          <w:ilvl w:val="0"/>
+          <w:numId w:val="60"/>
+        </w:numPr>
+        <w:tabs>
+          <w:tab w:val="clear" w:pos="720"/>
+        </w:tabs>
+        <w:spacing w:line="360" w:lineRule="auto"/>
+        <w:ind w:left="1134" w:hanging="284"/>
+        <w:rPr>
+          <w:lang w:val="vi-VN"/>
+        </w:rPr>
+      </w:pPr>
+      <w:r>
+        <w:rPr>
+          <w:b/>
+          <w:bCs/>
+          <w:lang w:val="vi-VN"/>
+        </w:rPr>
+        <w:t>Problem Space</w:t>
+      </w:r>
+      <w:r>
+        <w:rPr>
+          <w:lang w:val="vi-VN"/>
+        </w:rPr>
+        <w:t>: tập trung vào phân tích nghiệp vụ ở mức độ tổng quát (high-level), thuộc phạm vi Strategic Design.</w:t>
+      </w:r>
+    </w:p>
+    <w:p>
+      <w:pPr>
+        <w:numPr>
+          <w:ilvl w:val="0"/>
+          <w:numId w:val="60"/>
+        </w:numPr>
+        <w:tabs>
+          <w:tab w:val="clear" w:pos="720"/>
+        </w:tabs>
+        <w:spacing w:after="240" w:line="360" w:lineRule="auto"/>
+        <w:ind w:left="1134" w:hanging="284"/>
+        <w:rPr>
+          <w:lang w:val="vi-VN"/>
+        </w:rPr>
+      </w:pPr>
+      <w:r>
+        <w:rPr>
+          <w:b/>
+          <w:bCs/>
+          <w:lang w:val="vi-VN"/>
+        </w:rPr>
+        <w:lastRenderedPageBreak/>
+        <w:t>Solution Space</w:t>
+      </w:r>
+      <w:r>
+        <w:rPr>
+          <w:lang w:val="vi-VN"/>
+        </w:rPr>
+        <w:t xml:space="preserve">: tập trung vào việc hiện thực hóa nghiệp vụ bằng các </w:t>
+      </w:r>
+      <w:r>
+        <w:br/>
+      </w:r>
+      <w:r>
+        <w:rPr>
+          <w:lang w:val="vi-VN"/>
+        </w:rPr>
+        <w:t>mô hình và kỹ thuật phần mềm cụ thể, thuộc phạm vi Tactical Design.</w:t>
+      </w:r>
+    </w:p>
+    <w:p>
+      <w:pPr>
+        <w:spacing w:after="240" w:line="360" w:lineRule="auto"/>
+        <w:ind w:firstLine="567"/>
+        <w:rPr>
+          <w:lang w:val="vi-VN"/>
+        </w:rPr>
+      </w:pPr>
+      <w:r>
+        <w:rPr>
+          <w:lang w:val="vi-VN"/>
+        </w:rPr>
+        <w:t xml:space="preserve">Bounded Context đóng vai trò là ranh giới kết nối giữa problem space và </w:t>
+      </w:r>
+      <w:r>
+        <w:br/>
+      </w:r>
+      <w:r>
+        <w:rPr>
+          <w:lang w:val="vi-VN"/>
+        </w:rPr>
+        <w:t xml:space="preserve">solution space, đảm bảo mỗi phần nghiệp vụ được phân tích và triển khai một cách </w:t>
+      </w:r>
+      <w:r>
+        <w:br/>
+      </w:r>
+      <w:r>
+        <w:rPr>
+          <w:lang w:val="vi-VN"/>
+        </w:rPr>
+        <w:t>nhất quán.</w:t>
+      </w:r>
+    </w:p>
+    <w:p>
+      <w:pPr>
+        <w:spacing w:after="240" w:line="360" w:lineRule="auto"/>
+        <w:ind w:firstLine="567"/>
+        <w:rPr>
+          <w:lang w:val="vi-VN"/>
+        </w:rPr>
+      </w:pPr>
+      <w:r>
+        <w:rPr>
+          <w:lang w:val="vi-VN"/>
+        </w:rPr>
+        <w:t xml:space="preserve">Để đảm bảo sự thống nhất trong giao tiếp và hiểu biết nghiệp vụ giữa các bên </w:t>
+      </w:r>
+      <w:r>
+        <w:br/>
+      </w:r>
+      <w:r>
+        <w:rPr>
+          <w:lang w:val="vi-VN"/>
+        </w:rPr>
+        <w:t>liên quan, DDD đề xuất xây dựng Ubiquitous Language. Đây là ngôn ngữ chung được sử dụng xuyên suốt trong từng Bounded Context, bao gồm:</w:t>
+      </w:r>
+    </w:p>
+    <w:p>
+      <w:pPr>
+        <w:numPr>
+          <w:ilvl w:val="0"/>
+          <w:numId w:val="61"/>
+        </w:numPr>
+        <w:tabs>
+          <w:tab w:val="clear" w:pos="720"/>
+        </w:tabs>
+        <w:spacing w:line="360" w:lineRule="auto"/>
+        <w:ind w:left="1134" w:hanging="284"/>
+        <w:rPr>
+          <w:lang w:val="vi-VN"/>
+        </w:rPr>
+      </w:pPr>
+      <w:r>
+        <w:rPr>
+          <w:lang w:val="vi-VN"/>
+        </w:rPr>
+        <w:t>Tài liệu nghiệp vụ</w:t>
+      </w:r>
+      <w:r>
+        <w:t>.</w:t>
+      </w:r>
+    </w:p>
+    <w:p>
+      <w:pPr>
+        <w:numPr>
+          <w:ilvl w:val="0"/>
+          <w:numId w:val="61"/>
+        </w:numPr>
+        <w:tabs>
+          <w:tab w:val="clear" w:pos="720"/>
+        </w:tabs>
+        <w:spacing w:line="360" w:lineRule="auto"/>
+        <w:ind w:left="1134" w:hanging="284"/>
+        <w:rPr>
+          <w:lang w:val="vi-VN"/>
+        </w:rPr>
+      </w:pPr>
+      <w:r>
+        <w:rPr>
+          <w:lang w:val="vi-VN"/>
+        </w:rPr>
+        <w:t>Giao tiếp giữa các nhóm phát triển và chuyên gia nghiệp vụ</w:t>
+      </w:r>
+      <w:r>
+        <w:t>.</w:t>
+      </w:r>
+    </w:p>
+    <w:p>
+      <w:pPr>
+        <w:numPr>
+          <w:ilvl w:val="0"/>
+          <w:numId w:val="61"/>
+        </w:numPr>
+        <w:tabs>
+          <w:tab w:val="clear" w:pos="720"/>
+        </w:tabs>
+        <w:spacing w:after="240" w:line="360" w:lineRule="auto"/>
+        <w:ind w:left="1134" w:hanging="284"/>
+        <w:rPr>
+          <w:lang w:val="vi-VN"/>
+        </w:rPr>
+      </w:pPr>
+      <w:r>
+        <w:rPr>
+          <w:lang w:val="vi-VN"/>
+        </w:rPr>
+        <w:t>Mã nguồn và mô hình phần mềm</w:t>
+      </w:r>
+      <w:r>
+        <w:t>.</w:t>
+      </w:r>
+    </w:p>
+    <w:p>
+      <w:pPr>
+        <w:spacing w:after="240" w:line="360" w:lineRule="auto"/>
+        <w:ind w:firstLine="567"/>
+        <w:rPr>
+          <w:lang w:val="vi-VN"/>
+        </w:rPr>
+      </w:pPr>
+      <w:r>
+        <w:rPr>
+          <w:lang w:val="vi-VN"/>
+        </w:rPr>
+        <w:t>Ubiquitous Language không phải là ngôn ngữ “có sẵn”, mà được hình thành và phát triển liên tục thông qua sự hợp tác giữa các thành viên trong nhóm, phản ánh chính xác cách doanh nghiệp vận hành nghiệp vụ.</w:t>
+      </w:r>
+    </w:p>
+    <w:p>
+      <w:pPr>
+        <w:spacing w:after="240" w:line="360" w:lineRule="auto"/>
+        <w:ind w:firstLine="567"/>
+        <w:rPr>
+          <w:lang w:val="vi-VN"/>
+        </w:rPr>
+      </w:pPr>
+      <w:r>
+        <w:rPr>
+          <w:lang w:val="vi-VN"/>
+        </w:rPr>
+        <w:t xml:space="preserve">Trong các hệ thống lớn, nhiều Bounded Context thường cần giao tiếp và tích hợp với nhau. </w:t>
+      </w:r>
+      <w:r>
+        <w:rPr>
+          <w:b/>
+          <w:bCs/>
+          <w:lang w:val="vi-VN"/>
+        </w:rPr>
+        <w:t>Context Mapping</w:t>
+      </w:r>
+      <w:r>
+        <w:rPr>
+          <w:lang w:val="vi-VN"/>
+        </w:rPr>
+        <w:t xml:space="preserve"> được sử dụng để xác định rõ mối quan hệ, cách thức giao tiếp và mức độ phụ thuộc giữa các Bounded Context. Một số kiểu Context Mapping phổ biến bao gồm:</w:t>
+      </w:r>
+    </w:p>
+    <w:p>
+      <w:pPr>
+        <w:numPr>
+          <w:ilvl w:val="0"/>
+          <w:numId w:val="62"/>
+        </w:numPr>
+        <w:tabs>
+          <w:tab w:val="clear" w:pos="720"/>
+        </w:tabs>
+        <w:spacing w:line="360" w:lineRule="auto"/>
+        <w:ind w:left="1134" w:hanging="283"/>
+        <w:rPr>
+          <w:lang w:val="vi-VN"/>
+        </w:rPr>
+      </w:pPr>
+      <w:r>
+        <w:rPr>
+          <w:b/>
+          <w:bCs/>
+          <w:lang w:val="vi-VN"/>
+        </w:rPr>
+        <w:t>Partnership</w:t>
+      </w:r>
+      <w:r>
+        <w:rPr>
+          <w:lang w:val="vi-VN"/>
+        </w:rPr>
+        <w:t>: hai nhóm phát triển phối hợp chặt chẽ, cùng chia sẻ trách nhiệm và ảnh hưởng lẫn nhau.</w:t>
+      </w:r>
+    </w:p>
+    <w:p>
+      <w:pPr>
+        <w:numPr>
+          <w:ilvl w:val="0"/>
+          <w:numId w:val="62"/>
+        </w:numPr>
+        <w:tabs>
+          <w:tab w:val="clear" w:pos="720"/>
+        </w:tabs>
+        <w:spacing w:line="360" w:lineRule="auto"/>
+        <w:ind w:left="1134" w:hanging="283"/>
+        <w:rPr>
+          <w:lang w:val="vi-VN"/>
+        </w:rPr>
+      </w:pPr>
+      <w:r>
+        <w:rPr>
+          <w:b/>
+          <w:bCs/>
+          <w:lang w:val="vi-VN"/>
+        </w:rPr>
+        <w:t>Shared Kernel</w:t>
+      </w:r>
+      <w:r>
+        <w:rPr>
+          <w:lang w:val="vi-VN"/>
+        </w:rPr>
+        <w:t xml:space="preserve">: các nhóm chia sẻ một phần mô hình nghiệp vụ chung, </w:t>
+      </w:r>
+      <w:r>
+        <w:br/>
+      </w:r>
+      <w:r>
+        <w:rPr>
+          <w:lang w:val="vi-VN"/>
+        </w:rPr>
+        <w:t>phần này cần được quản lý và thay đổi một cách cẩn trọng.</w:t>
+      </w:r>
+    </w:p>
+    <w:p>
+      <w:pPr>
+        <w:numPr>
+          <w:ilvl w:val="0"/>
+          <w:numId w:val="62"/>
+        </w:numPr>
+        <w:tabs>
+          <w:tab w:val="clear" w:pos="720"/>
+        </w:tabs>
+        <w:spacing w:line="360" w:lineRule="auto"/>
+        <w:ind w:left="1134" w:hanging="283"/>
+        <w:rPr>
+          <w:lang w:val="vi-VN"/>
+        </w:rPr>
+      </w:pPr>
+      <w:r>
+        <w:rPr>
+          <w:b/>
+          <w:bCs/>
+          <w:lang w:val="vi-VN"/>
+        </w:rPr>
+        <w:t>Customer–Supplier</w:t>
+      </w:r>
+      <w:r>
+        <w:rPr>
+          <w:lang w:val="vi-VN"/>
+        </w:rPr>
+        <w:t xml:space="preserve">: một nhóm phát triển hệ thống (upstream), nhóm </w:t>
+      </w:r>
+      <w:r>
+        <w:br/>
+      </w:r>
+      <w:r>
+        <w:rPr>
+          <w:lang w:val="vi-VN"/>
+        </w:rPr>
+        <w:t>còn lại sử dụng và phụ thuộc vào hệ thống đó (downstream).</w:t>
+      </w:r>
+    </w:p>
+    <w:p>
+      <w:pPr>
+        <w:numPr>
+          <w:ilvl w:val="0"/>
+          <w:numId w:val="62"/>
+        </w:numPr>
+        <w:tabs>
+          <w:tab w:val="clear" w:pos="720"/>
+        </w:tabs>
+        <w:spacing w:line="360" w:lineRule="auto"/>
+        <w:ind w:left="1134" w:hanging="283"/>
+        <w:rPr>
+          <w:lang w:val="vi-VN"/>
+        </w:rPr>
+      </w:pPr>
+      <w:r>
+        <w:rPr>
+          <w:b/>
+          <w:bCs/>
+          <w:lang w:val="vi-VN"/>
+        </w:rPr>
+        <w:t>Conformist</w:t>
+      </w:r>
+      <w:r>
+        <w:rPr>
+          <w:lang w:val="vi-VN"/>
+        </w:rPr>
+        <w:t>: một nhóm phải tuân thủ hoàn toàn mô hình nghiệp vụ do nhóm khác định nghĩa.</w:t>
+      </w:r>
+    </w:p>
+    <w:p>
+      <w:pPr>
+        <w:numPr>
+          <w:ilvl w:val="0"/>
+          <w:numId w:val="62"/>
+        </w:numPr>
+        <w:tabs>
+          <w:tab w:val="clear" w:pos="720"/>
+        </w:tabs>
+        <w:spacing w:line="360" w:lineRule="auto"/>
+        <w:ind w:left="1134" w:hanging="283"/>
+        <w:rPr>
+          <w:lang w:val="vi-VN"/>
+        </w:rPr>
+      </w:pPr>
+      <w:r>
+        <w:rPr>
+          <w:b/>
+          <w:bCs/>
+          <w:lang w:val="vi-VN"/>
+        </w:rPr>
+        <w:t>Anticorruption Layer</w:t>
+      </w:r>
+      <w:r>
+        <w:rPr>
+          <w:lang w:val="vi-VN"/>
+        </w:rPr>
+        <w:t xml:space="preserve">: sử dụng lớp trung gian để chuyển đổi và bảo vệ </w:t>
+      </w:r>
+      <w:r>
+        <w:br/>
+      </w:r>
+      <w:r>
+        <w:rPr>
+          <w:lang w:val="vi-VN"/>
+        </w:rPr>
+        <w:t>mô hình nội bộ khỏi sự phụ thuộc trực tiếp vào mô hình bên ngoài.</w:t>
+      </w:r>
+    </w:p>
+    <w:p>
+      <w:pPr>
+        <w:numPr>
+          <w:ilvl w:val="0"/>
+          <w:numId w:val="62"/>
+        </w:numPr>
+        <w:tabs>
+          <w:tab w:val="clear" w:pos="720"/>
+        </w:tabs>
+        <w:spacing w:line="360" w:lineRule="auto"/>
+        <w:ind w:left="1134" w:hanging="283"/>
+        <w:rPr>
+          <w:lang w:val="vi-VN"/>
+        </w:rPr>
+      </w:pPr>
+      <w:r>
+        <w:rPr>
+          <w:b/>
+          <w:bCs/>
+          <w:lang w:val="vi-VN"/>
+        </w:rPr>
+        <w:lastRenderedPageBreak/>
+        <w:t>Open Host Service</w:t>
+      </w:r>
+      <w:r>
+        <w:rPr>
+          <w:lang w:val="vi-VN"/>
+        </w:rPr>
+        <w:t>: một hệ thống trung tâm cung cấp các dịch vụ mở để các hệ thống khác tích hợp.</w:t>
+      </w:r>
+    </w:p>
+    <w:p>
+      <w:pPr>
+        <w:numPr>
+          <w:ilvl w:val="0"/>
+          <w:numId w:val="62"/>
+        </w:numPr>
+        <w:tabs>
+          <w:tab w:val="clear" w:pos="720"/>
+        </w:tabs>
+        <w:spacing w:line="360" w:lineRule="auto"/>
+        <w:ind w:left="1134" w:hanging="283"/>
+        <w:rPr>
+          <w:lang w:val="vi-VN"/>
+        </w:rPr>
+      </w:pPr>
+      <w:r>
+        <w:rPr>
+          <w:b/>
+          <w:bCs/>
+          <w:lang w:val="vi-VN"/>
+        </w:rPr>
+        <w:t>Published Language</w:t>
+      </w:r>
+      <w:r>
+        <w:rPr>
+          <w:lang w:val="vi-VN"/>
+        </w:rPr>
+        <w:t>: định nghĩa một ngôn ngữ hoặc định dạng chuẩn dùng cho việc tích hợp giữa các hệ thống.</w:t>
+      </w:r>
+    </w:p>
+    <w:p>
+      <w:pPr>
+        <w:numPr>
+          <w:ilvl w:val="0"/>
+          <w:numId w:val="62"/>
+        </w:numPr>
+        <w:tabs>
+          <w:tab w:val="clear" w:pos="720"/>
+        </w:tabs>
+        <w:spacing w:after="240" w:line="360" w:lineRule="auto"/>
+        <w:ind w:left="1134" w:hanging="283"/>
+        <w:rPr>
+          <w:lang w:val="vi-VN"/>
+        </w:rPr>
+      </w:pPr>
+      <w:r>
+        <w:rPr>
+          <w:b/>
+          <w:bCs/>
+          <w:lang w:val="vi-VN"/>
+        </w:rPr>
+        <w:t>Separate Ways</w:t>
+      </w:r>
+      <w:r>
+        <w:rPr>
+          <w:lang w:val="vi-VN"/>
+        </w:rPr>
+        <w:t xml:space="preserve">: các hệ thống hoạt động độc lập, không cần tích hợp hay </w:t>
+      </w:r>
+      <w:r>
+        <w:br/>
+      </w:r>
+      <w:r>
+        <w:rPr>
+          <w:lang w:val="vi-VN"/>
+        </w:rPr>
+        <w:t>chia sẻ mô hình.</w:t>
+      </w:r>
+    </w:p>
+    <w:p>
+      <w:pPr>
+        <w:spacing w:after="240" w:line="360" w:lineRule="auto"/>
+        <w:ind w:firstLine="567"/>
+      </w:pPr>
+      <w:r>
+        <w:t xml:space="preserve">Ở cấp độ </w:t>
+      </w:r>
+      <w:r>
+        <w:t xml:space="preserve">Tactical Design, DDD sử dụng các mô hình chi tiết để hiện thực hóa nghiệp vụ trong từng Bounded Context. Domain Events là một trong những cơ chế </w:t>
+      </w:r>
+      <w:r>
+        <w:br/>
+      </w:r>
+      <w:r>
+        <w:t>quan trọng, cho phép các Bounded Context giao tiếp với nhau thông qua các sự kiện nghiệp vụ đã xảy ra, đồng thời giảm sự phụ thuộc trực tiếp giữa các mô hình nội bộ</w:t>
+      </w:r>
+      <w:r>
+        <w:t>.</w:t>
       </w:r>
     </w:p>
     <w:p>
@@ -19604,7 +20396,10 @@
     </w:p>
     <w:p>
       <w:r>
-        <w:t>3.3.9.4 Domain-Driven Design</w:t>
+        <w:t xml:space="preserve">3.3.9.4 </w:t>
+      </w:r>
+      <w:r>
+        <w:t>Design Pattern</w:t>
       </w:r>
     </w:p>
     <w:p>
@@ -19813,6 +20608,7 @@
         <w:rPr>
           <w:lang w:val="vi-VN"/>
         </w:rPr>
+        <w:lastRenderedPageBreak/>
         <w:t>Exception Handling: try-catch, using, tạo và ném exception</w:t>
       </w:r>
     </w:p>
@@ -20270,7 +21066,6 @@
         <w:rPr>
           <w:lang w:val="vi-VN"/>
         </w:rPr>
-        <w:lastRenderedPageBreak/>
         <w:t>Kiến thức cơ bản về cơ sở dữ liệu và SQL</w:t>
       </w:r>
     </w:p>
@@ -20524,6 +21319,7 @@
         <w:rPr>
           <w:lang w:val="vi-VN"/>
         </w:rPr>
+        <w:lastRenderedPageBreak/>
         <w:t>Factory</w:t>
       </w:r>
     </w:p>
@@ -20983,7 +21779,6 @@
         <w:rPr>
           <w:lang w:val="vi-VN"/>
         </w:rPr>
-        <w:lastRenderedPageBreak/>
         <w:t>Idempotency</w:t>
       </w:r>
     </w:p>
@@ -21235,6 +22030,7 @@
         <w:rPr>
           <w:lang w:val="vi-VN"/>
         </w:rPr>
+        <w:lastRenderedPageBreak/>
         <w:t>Khái niệm ảo hóa</w:t>
       </w:r>
     </w:p>
@@ -21690,7 +22486,6 @@
         <w:rPr>
           <w:lang w:val="vi-VN"/>
         </w:rPr>
-        <w:lastRenderedPageBreak/>
         <w:t>Jenkins:</w:t>
       </w:r>
     </w:p>
@@ -21941,6 +22736,7 @@
         <w:rPr>
           <w:lang w:val="vi-VN"/>
         </w:rPr>
+        <w:lastRenderedPageBreak/>
         <w:t>Tổng hợp toàn bộ kiến thức đã tiếp thu trong quá trình thực tập</w:t>
       </w:r>
     </w:p>
@@ -22124,7 +22920,6 @@
           <w:i/>
           <w:iCs/>
         </w:rPr>
-        <w:lastRenderedPageBreak/>
         <w:t xml:space="preserve">2) Tham gia cùng phòng quản lý chất lượng tiếp đón đoàn kiểm tra liên ngành về an toàn thực phẩm, và sinh viên được yêu cầu chuẩn bị các tài liệu báo cáo tình hình quản lý chất lượng của công ty; </w:t>
       </w:r>
     </w:p>
@@ -22198,7 +22993,15 @@
           <w:i/>
           <w:iCs/>
         </w:rPr>
-        <w:t>Như vậy, trong mục này sinh viên có thể chia thành 5 phần nhỏ với 5 nhiệm vụ chính ở trên. Trong mỗi chương sinh viên chỉ cần trình bày lại các hoạt động sinh viên đã thực hiện/tham gia, các mục tiêu của mỗi công việc và các kết quả thu được từ mỗi công việc đó. Trong báo cáo sinh viên có thể đưa các phụ lục về hình ảnh buổi đón tiếp sinh viên, bảng câu hỏi phỏng vấn, các bảng thống kê từ việc phân tích kết quả khảo sát thị trường, và hình ảnh về hoạt đồng trồng cây, để làm minh chứng. • Nếu sinh viên đã tham gia 20 công việc thì sinh viên chỉ cần trình bày các công việc quan trọng nhất, có ý nghĩa nhất và có liên quan nhất đến các kết quả/mục tiêu học tập mà sinh viên đã đưa ra khi bắt đầu thực tập. Các công việc khác (nếu liên quan đến các kết quả/mục tiêu học tập) thì sinh viên có thể đưa vào phụ lục của báo cáo thực tập. • Cấu trúc của phần còn lại của một báo cáo sản phẩm theo hướng công việc thường không có cấu trúc cụ thể, bởi vì mỗi sinh viên có thể tham gia các công việc và các hoạt động rất khác nhau. Nếu một sinh viên năng động và có năng lực thì báo cáo sản phẩm sẽ rất phong phú. Ngược lại, nếu sinh viên chỉ ngồi nhà chơi games thì sẽ không có câu chuyện nào thú vị để thuật lại sau 14 tuần thực tập.</w:t>
+        <w:t xml:space="preserve">Như vậy, trong mục này sinh viên có thể chia thành 5 phần nhỏ với 5 nhiệm vụ chính ở trên. Trong mỗi chương sinh viên chỉ cần trình bày lại các hoạt động sinh viên đã thực hiện/tham gia, các mục tiêu của mỗi công việc và các kết quả thu được từ mỗi công việc </w:t>
+      </w:r>
+      <w:r>
+        <w:rPr>
+          <w:i/>
+          <w:iCs/>
+        </w:rPr>
+        <w:lastRenderedPageBreak/>
+        <w:t>đó. Trong báo cáo sinh viên có thể đưa các phụ lục về hình ảnh buổi đón tiếp sinh viên, bảng câu hỏi phỏng vấn, các bảng thống kê từ việc phân tích kết quả khảo sát thị trường, và hình ảnh về hoạt đồng trồng cây, để làm minh chứng. • Nếu sinh viên đã tham gia 20 công việc thì sinh viên chỉ cần trình bày các công việc quan trọng nhất, có ý nghĩa nhất và có liên quan nhất đến các kết quả/mục tiêu học tập mà sinh viên đã đưa ra khi bắt đầu thực tập. Các công việc khác (nếu liên quan đến các kết quả/mục tiêu học tập) thì sinh viên có thể đưa vào phụ lục của báo cáo thực tập. • Cấu trúc của phần còn lại của một báo cáo sản phẩm theo hướng công việc thường không có cấu trúc cụ thể, bởi vì mỗi sinh viên có thể tham gia các công việc và các hoạt động rất khác nhau. Nếu một sinh viên năng động và có năng lực thì báo cáo sản phẩm sẽ rất phong phú. Ngược lại, nếu sinh viên chỉ ngồi nhà chơi games thì sẽ không có câu chuyện nào thú vị để thuật lại sau 14 tuần thực tập.</w:t>
       </w:r>
     </w:p>
     <w:p>
@@ -28009,6 +28812,156 @@
 <file path=word/numbering.xml><?xml version="1.0" encoding="utf-8"?>
 <w:numbering xmlns:wpc="http://schemas.microsoft.com/office/word/2010/wordprocessingCanvas" xmlns:cx="http://schemas.microsoft.com/office/drawing/2014/chartex" xmlns:cx1="http://schemas.microsoft.com/office/drawing/2015/9/8/chartex" xmlns:cx2="http://schemas.microsoft.com/office/drawing/2015/10/21/chartex" xmlns:cx3="http://schemas.microsoft.com/office/drawing/2016/5/9/chartex" xmlns:cx4="http://schemas.microsoft.com/office/drawing/2016/5/10/chartex" xmlns:cx5="http://schemas.microsoft.com/office/drawing/2016/5/11/chartex" xmlns:cx6="http://schemas.microsoft.com/office/drawing/2016/5/12/chartex" xmlns:cx7="http://schemas.microsoft.com/office/drawing/2016/5/13/chartex" xmlns:cx8="http://schemas.microsoft.com/office/drawing/2016/5/14/chartex" xmlns:mc="http://schemas.openxmlformats.org/markup-compatibility/2006" xmlns:aink="http://schemas.microsoft.com/office/drawing/2016/ink" xmlns:am3d="http://schemas.microsoft.com/office/drawing/2017/model3d" xmlns:o="urn:schemas-microsoft-com:office:office" xmlns:oel="http://schemas.microsoft.com/office/2019/extlst" xmlns:r="http://schemas.openxmlformats.org/officeDocument/2006/relationships" xmlns:m="http://schemas.openxmlformats.org/officeDocument/2006/math" xmlns:v="urn:schemas-microsoft-com:vml" xmlns:wp14="http://schemas.microsoft.com/office/word/2010/wordprocessingDrawing" xmlns:wp="http://schemas.openxmlformats.org/drawingml/2006/wordprocessingDrawing" xmlns:w10="urn:schemas-microsoft-com:office:word" xmlns:w="http://schemas.openxmlformats.org/wordprocessingml/2006/main" xmlns:w14="http://schemas.microsoft.com/office/word/2010/wordml" xmlns:w15="http://schemas.microsoft.com/office/word/2012/wordml" xmlns:w16cex="http://schemas.microsoft.com/office/word/2018/wordml/cex" xmlns:w16cid="http://schemas.microsoft.com/office/word/2016/wordml/cid" xmlns:w16="http://schemas.microsoft.com/office/word/2018/wordml" xmlns:w16du="http://schemas.microsoft.com/office/word/2023/wordml/word16du" xmlns:w16sdtdh="http://schemas.microsoft.com/office/word/2020/wordml/sdtdatahash" xmlns:w16sdtfl="http://schemas.microsoft.com/office/word/2024/wordml/sdtformatlock" xmlns:w16se="http://schemas.microsoft.com/office/word/2015/wordml/symex" xmlns:wpg="http://schemas.microsoft.com/office/word/2010/wordprocessingGroup" xmlns:wpi="http://schemas.microsoft.com/office/word/2010/wordprocessingInk" xmlns:wne="http://schemas.microsoft.com/office/word/2006/wordml" xmlns:wps="http://schemas.microsoft.com/office/word/2010/wordprocessingShape" mc:Ignorable="w14 w15 w16se w16cid w16 w16cex w16sdtdh w16sdtfl w16du wp14">
   <w:abstractNum w:abstractNumId="0" w15:restartNumberingAfterBreak="0">
+    <w:nsid w:val="05106476"/>
+    <w:multiLevelType w:val="multilevel"/>
+    <w:tmpl w:val="D4C8A664"/>
+    <w:lvl w:ilvl="0">
+      <w:start w:val="1"/>
+      <w:numFmt w:val="bullet"/>
+      <w:lvlText w:val=""/>
+      <w:lvlJc w:val="left"/>
+      <w:pPr>
+        <w:tabs>
+          <w:tab w:val="num" w:pos="720"/>
+        </w:tabs>
+        <w:ind w:left="720" w:hanging="360"/>
+      </w:pPr>
+      <w:rPr>
+        <w:rFonts w:ascii="Symbol" w:hAnsi="Symbol" w:hint="default"/>
+        <w:sz w:val="26"/>
+        <w:szCs w:val="26"/>
+      </w:rPr>
+    </w:lvl>
+    <w:lvl w:ilvl="1" w:tentative="1">
+      <w:start w:val="1"/>
+      <w:numFmt w:val="bullet"/>
+      <w:lvlText w:val="o"/>
+      <w:lvlJc w:val="left"/>
+      <w:pPr>
+        <w:tabs>
+          <w:tab w:val="num" w:pos="1440"/>
+        </w:tabs>
+        <w:ind w:left="1440" w:hanging="360"/>
+      </w:pPr>
+      <w:rPr>
+        <w:rFonts w:ascii="Courier New" w:hAnsi="Courier New" w:hint="default"/>
+        <w:sz w:val="20"/>
+      </w:rPr>
+    </w:lvl>
+    <w:lvl w:ilvl="2" w:tentative="1">
+      <w:start w:val="1"/>
+      <w:numFmt w:val="bullet"/>
+      <w:lvlText w:val=""/>
+      <w:lvlJc w:val="left"/>
+      <w:pPr>
+        <w:tabs>
+          <w:tab w:val="num" w:pos="2160"/>
+        </w:tabs>
+        <w:ind w:left="2160" w:hanging="360"/>
+      </w:pPr>
+      <w:rPr>
+        <w:rFonts w:ascii="Wingdings" w:hAnsi="Wingdings" w:hint="default"/>
+        <w:sz w:val="20"/>
+      </w:rPr>
+    </w:lvl>
+    <w:lvl w:ilvl="3" w:tentative="1">
+      <w:start w:val="1"/>
+      <w:numFmt w:val="bullet"/>
+      <w:lvlText w:val=""/>
+      <w:lvlJc w:val="left"/>
+      <w:pPr>
+        <w:tabs>
+          <w:tab w:val="num" w:pos="2880"/>
+        </w:tabs>
+        <w:ind w:left="2880" w:hanging="360"/>
+      </w:pPr>
+      <w:rPr>
+        <w:rFonts w:ascii="Wingdings" w:hAnsi="Wingdings" w:hint="default"/>
+        <w:sz w:val="20"/>
+      </w:rPr>
+    </w:lvl>
+    <w:lvl w:ilvl="4" w:tentative="1">
+      <w:start w:val="1"/>
+      <w:numFmt w:val="bullet"/>
+      <w:lvlText w:val=""/>
+      <w:lvlJc w:val="left"/>
+      <w:pPr>
+        <w:tabs>
+          <w:tab w:val="num" w:pos="3600"/>
+        </w:tabs>
+        <w:ind w:left="3600" w:hanging="360"/>
+      </w:pPr>
+      <w:rPr>
+        <w:rFonts w:ascii="Wingdings" w:hAnsi="Wingdings" w:hint="default"/>
+        <w:sz w:val="20"/>
+      </w:rPr>
+    </w:lvl>
+    <w:lvl w:ilvl="5" w:tentative="1">
+      <w:start w:val="1"/>
+      <w:numFmt w:val="bullet"/>
+      <w:lvlText w:val=""/>
+      <w:lvlJc w:val="left"/>
+      <w:pPr>
+        <w:tabs>
+          <w:tab w:val="num" w:pos="4320"/>
+        </w:tabs>
+        <w:ind w:left="4320" w:hanging="360"/>
+      </w:pPr>
+      <w:rPr>
+        <w:rFonts w:ascii="Wingdings" w:hAnsi="Wingdings" w:hint="default"/>
+        <w:sz w:val="20"/>
+      </w:rPr>
+    </w:lvl>
+    <w:lvl w:ilvl="6" w:tentative="1">
+      <w:start w:val="1"/>
+      <w:numFmt w:val="bullet"/>
+      <w:lvlText w:val=""/>
+      <w:lvlJc w:val="left"/>
+      <w:pPr>
+        <w:tabs>
+          <w:tab w:val="num" w:pos="5040"/>
+        </w:tabs>
+        <w:ind w:left="5040" w:hanging="360"/>
+      </w:pPr>
+      <w:rPr>
+        <w:rFonts w:ascii="Wingdings" w:hAnsi="Wingdings" w:hint="default"/>
+        <w:sz w:val="20"/>
+      </w:rPr>
+    </w:lvl>
+    <w:lvl w:ilvl="7" w:tentative="1">
+      <w:start w:val="1"/>
+      <w:numFmt w:val="bullet"/>
+      <w:lvlText w:val=""/>
+      <w:lvlJc w:val="left"/>
+      <w:pPr>
+        <w:tabs>
+          <w:tab w:val="num" w:pos="5760"/>
+        </w:tabs>
+        <w:ind w:left="5760" w:hanging="360"/>
+      </w:pPr>
+      <w:rPr>
+        <w:rFonts w:ascii="Wingdings" w:hAnsi="Wingdings" w:hint="default"/>
+        <w:sz w:val="20"/>
+      </w:rPr>
+    </w:lvl>
+    <w:lvl w:ilvl="8" w:tentative="1">
+      <w:start w:val="1"/>
+      <w:numFmt w:val="bullet"/>
+      <w:lvlText w:val=""/>
+      <w:lvlJc w:val="left"/>
+      <w:pPr>
+        <w:tabs>
+          <w:tab w:val="num" w:pos="6480"/>
+        </w:tabs>
+        <w:ind w:left="6480" w:hanging="360"/>
+      </w:pPr>
+      <w:rPr>
+        <w:rFonts w:ascii="Wingdings" w:hAnsi="Wingdings" w:hint="default"/>
+        <w:sz w:val="20"/>
+      </w:rPr>
+    </w:lvl>
+  </w:abstractNum>
+  <w:abstractNum w:abstractNumId="1" w15:restartNumberingAfterBreak="0">
     <w:nsid w:val="05E37ADF"/>
     <w:multiLevelType w:val="multilevel"/>
     <w:tmpl w:val="D1CCF8F4"/>
@@ -28158,7 +29111,7 @@
       </w:rPr>
     </w:lvl>
   </w:abstractNum>
-  <w:abstractNum w:abstractNumId="1" w15:restartNumberingAfterBreak="0">
+  <w:abstractNum w:abstractNumId="2" w15:restartNumberingAfterBreak="0">
     <w:nsid w:val="099D776D"/>
     <w:multiLevelType w:val="multilevel"/>
     <w:tmpl w:val="B78C0AA4"/>
@@ -28307,7 +29260,7 @@
       </w:rPr>
     </w:lvl>
   </w:abstractNum>
-  <w:abstractNum w:abstractNumId="2" w15:restartNumberingAfterBreak="0">
+  <w:abstractNum w:abstractNumId="3" w15:restartNumberingAfterBreak="0">
     <w:nsid w:val="0A1753B8"/>
     <w:multiLevelType w:val="multilevel"/>
     <w:tmpl w:val="6E30C028"/>
@@ -28457,7 +29410,7 @@
       </w:rPr>
     </w:lvl>
   </w:abstractNum>
-  <w:abstractNum w:abstractNumId="3" w15:restartNumberingAfterBreak="0">
+  <w:abstractNum w:abstractNumId="4" w15:restartNumberingAfterBreak="0">
     <w:nsid w:val="0B9341C7"/>
     <w:multiLevelType w:val="multilevel"/>
     <w:tmpl w:val="3F644884"/>
@@ -28606,7 +29559,7 @@
       </w:rPr>
     </w:lvl>
   </w:abstractNum>
-  <w:abstractNum w:abstractNumId="4" w15:restartNumberingAfterBreak="0">
+  <w:abstractNum w:abstractNumId="5" w15:restartNumberingAfterBreak="0">
     <w:nsid w:val="0C4A1204"/>
     <w:multiLevelType w:val="multilevel"/>
     <w:tmpl w:val="9394FFCA"/>
@@ -28755,7 +29708,7 @@
       </w:rPr>
     </w:lvl>
   </w:abstractNum>
-  <w:abstractNum w:abstractNumId="5" w15:restartNumberingAfterBreak="0">
+  <w:abstractNum w:abstractNumId="6" w15:restartNumberingAfterBreak="0">
     <w:nsid w:val="0DC02159"/>
     <w:multiLevelType w:val="hybridMultilevel"/>
     <w:tmpl w:val="9F702902"/>
@@ -28868,7 +29821,7 @@
       </w:rPr>
     </w:lvl>
   </w:abstractNum>
-  <w:abstractNum w:abstractNumId="6" w15:restartNumberingAfterBreak="0">
+  <w:abstractNum w:abstractNumId="7" w15:restartNumberingAfterBreak="0">
     <w:nsid w:val="10622C71"/>
     <w:multiLevelType w:val="multilevel"/>
     <w:tmpl w:val="3B14F120"/>
@@ -29017,7 +29970,7 @@
       </w:rPr>
     </w:lvl>
   </w:abstractNum>
-  <w:abstractNum w:abstractNumId="7" w15:restartNumberingAfterBreak="0">
+  <w:abstractNum w:abstractNumId="8" w15:restartNumberingAfterBreak="0">
     <w:nsid w:val="1269053C"/>
     <w:multiLevelType w:val="multilevel"/>
     <w:tmpl w:val="F65A9AEA"/>
@@ -29166,7 +30119,157 @@
       </w:rPr>
     </w:lvl>
   </w:abstractNum>
-  <w:abstractNum w:abstractNumId="8" w15:restartNumberingAfterBreak="0">
+  <w:abstractNum w:abstractNumId="9" w15:restartNumberingAfterBreak="0">
+    <w:nsid w:val="136D6803"/>
+    <w:multiLevelType w:val="multilevel"/>
+    <w:tmpl w:val="85429D24"/>
+    <w:lvl w:ilvl="0">
+      <w:start w:val="1"/>
+      <w:numFmt w:val="bullet"/>
+      <w:lvlText w:val=""/>
+      <w:lvlJc w:val="left"/>
+      <w:pPr>
+        <w:tabs>
+          <w:tab w:val="num" w:pos="720"/>
+        </w:tabs>
+        <w:ind w:left="720" w:hanging="360"/>
+      </w:pPr>
+      <w:rPr>
+        <w:rFonts w:ascii="Symbol" w:hAnsi="Symbol" w:hint="default"/>
+        <w:sz w:val="26"/>
+        <w:szCs w:val="26"/>
+      </w:rPr>
+    </w:lvl>
+    <w:lvl w:ilvl="1" w:tentative="1">
+      <w:start w:val="1"/>
+      <w:numFmt w:val="bullet"/>
+      <w:lvlText w:val="o"/>
+      <w:lvlJc w:val="left"/>
+      <w:pPr>
+        <w:tabs>
+          <w:tab w:val="num" w:pos="1440"/>
+        </w:tabs>
+        <w:ind w:left="1440" w:hanging="360"/>
+      </w:pPr>
+      <w:rPr>
+        <w:rFonts w:ascii="Courier New" w:hAnsi="Courier New" w:hint="default"/>
+        <w:sz w:val="20"/>
+      </w:rPr>
+    </w:lvl>
+    <w:lvl w:ilvl="2" w:tentative="1">
+      <w:start w:val="1"/>
+      <w:numFmt w:val="bullet"/>
+      <w:lvlText w:val=""/>
+      <w:lvlJc w:val="left"/>
+      <w:pPr>
+        <w:tabs>
+          <w:tab w:val="num" w:pos="2160"/>
+        </w:tabs>
+        <w:ind w:left="2160" w:hanging="360"/>
+      </w:pPr>
+      <w:rPr>
+        <w:rFonts w:ascii="Wingdings" w:hAnsi="Wingdings" w:hint="default"/>
+        <w:sz w:val="20"/>
+      </w:rPr>
+    </w:lvl>
+    <w:lvl w:ilvl="3" w:tentative="1">
+      <w:start w:val="1"/>
+      <w:numFmt w:val="bullet"/>
+      <w:lvlText w:val=""/>
+      <w:lvlJc w:val="left"/>
+      <w:pPr>
+        <w:tabs>
+          <w:tab w:val="num" w:pos="2880"/>
+        </w:tabs>
+        <w:ind w:left="2880" w:hanging="360"/>
+      </w:pPr>
+      <w:rPr>
+        <w:rFonts w:ascii="Wingdings" w:hAnsi="Wingdings" w:hint="default"/>
+        <w:sz w:val="20"/>
+      </w:rPr>
+    </w:lvl>
+    <w:lvl w:ilvl="4" w:tentative="1">
+      <w:start w:val="1"/>
+      <w:numFmt w:val="bullet"/>
+      <w:lvlText w:val=""/>
+      <w:lvlJc w:val="left"/>
+      <w:pPr>
+        <w:tabs>
+          <w:tab w:val="num" w:pos="3600"/>
+        </w:tabs>
+        <w:ind w:left="3600" w:hanging="360"/>
+      </w:pPr>
+      <w:rPr>
+        <w:rFonts w:ascii="Wingdings" w:hAnsi="Wingdings" w:hint="default"/>
+        <w:sz w:val="20"/>
+      </w:rPr>
+    </w:lvl>
+    <w:lvl w:ilvl="5" w:tentative="1">
+      <w:start w:val="1"/>
+      <w:numFmt w:val="bullet"/>
+      <w:lvlText w:val=""/>
+      <w:lvlJc w:val="left"/>
+      <w:pPr>
+        <w:tabs>
+          <w:tab w:val="num" w:pos="4320"/>
+        </w:tabs>
+        <w:ind w:left="4320" w:hanging="360"/>
+      </w:pPr>
+      <w:rPr>
+        <w:rFonts w:ascii="Wingdings" w:hAnsi="Wingdings" w:hint="default"/>
+        <w:sz w:val="20"/>
+      </w:rPr>
+    </w:lvl>
+    <w:lvl w:ilvl="6" w:tentative="1">
+      <w:start w:val="1"/>
+      <w:numFmt w:val="bullet"/>
+      <w:lvlText w:val=""/>
+      <w:lvlJc w:val="left"/>
+      <w:pPr>
+        <w:tabs>
+          <w:tab w:val="num" w:pos="5040"/>
+        </w:tabs>
+        <w:ind w:left="5040" w:hanging="360"/>
+      </w:pPr>
+      <w:rPr>
+        <w:rFonts w:ascii="Wingdings" w:hAnsi="Wingdings" w:hint="default"/>
+        <w:sz w:val="20"/>
+      </w:rPr>
+    </w:lvl>
+    <w:lvl w:ilvl="7" w:tentative="1">
+      <w:start w:val="1"/>
+      <w:numFmt w:val="bullet"/>
+      <w:lvlText w:val=""/>
+      <w:lvlJc w:val="left"/>
+      <w:pPr>
+        <w:tabs>
+          <w:tab w:val="num" w:pos="5760"/>
+        </w:tabs>
+        <w:ind w:left="5760" w:hanging="360"/>
+      </w:pPr>
+      <w:rPr>
+        <w:rFonts w:ascii="Wingdings" w:hAnsi="Wingdings" w:hint="default"/>
+        <w:sz w:val="20"/>
+      </w:rPr>
+    </w:lvl>
+    <w:lvl w:ilvl="8" w:tentative="1">
+      <w:start w:val="1"/>
+      <w:numFmt w:val="bullet"/>
+      <w:lvlText w:val=""/>
+      <w:lvlJc w:val="left"/>
+      <w:pPr>
+        <w:tabs>
+          <w:tab w:val="num" w:pos="6480"/>
+        </w:tabs>
+        <w:ind w:left="6480" w:hanging="360"/>
+      </w:pPr>
+      <w:rPr>
+        <w:rFonts w:ascii="Wingdings" w:hAnsi="Wingdings" w:hint="default"/>
+        <w:sz w:val="20"/>
+      </w:rPr>
+    </w:lvl>
+  </w:abstractNum>
+  <w:abstractNum w:abstractNumId="10" w15:restartNumberingAfterBreak="0">
     <w:nsid w:val="13845602"/>
     <w:multiLevelType w:val="hybridMultilevel"/>
     <w:tmpl w:val="FC0E6416"/>
@@ -29282,7 +30385,7 @@
       </w:rPr>
     </w:lvl>
   </w:abstractNum>
-  <w:abstractNum w:abstractNumId="9" w15:restartNumberingAfterBreak="0">
+  <w:abstractNum w:abstractNumId="11" w15:restartNumberingAfterBreak="0">
     <w:nsid w:val="16A902EA"/>
     <w:multiLevelType w:val="hybridMultilevel"/>
     <w:tmpl w:val="190889D8"/>
@@ -29374,7 +30477,7 @@
       </w:pPr>
     </w:lvl>
   </w:abstractNum>
-  <w:abstractNum w:abstractNumId="10" w15:restartNumberingAfterBreak="0">
+  <w:abstractNum w:abstractNumId="12" w15:restartNumberingAfterBreak="0">
     <w:nsid w:val="16C83982"/>
     <w:multiLevelType w:val="multilevel"/>
     <w:tmpl w:val="F1389362"/>
@@ -29523,7 +30626,7 @@
       </w:rPr>
     </w:lvl>
   </w:abstractNum>
-  <w:abstractNum w:abstractNumId="11" w15:restartNumberingAfterBreak="0">
+  <w:abstractNum w:abstractNumId="13" w15:restartNumberingAfterBreak="0">
     <w:nsid w:val="188D0811"/>
     <w:multiLevelType w:val="multilevel"/>
     <w:tmpl w:val="39B41E88"/>
@@ -29672,7 +30775,7 @@
       </w:rPr>
     </w:lvl>
   </w:abstractNum>
-  <w:abstractNum w:abstractNumId="12" w15:restartNumberingAfterBreak="0">
+  <w:abstractNum w:abstractNumId="14" w15:restartNumberingAfterBreak="0">
     <w:nsid w:val="1921368C"/>
     <w:multiLevelType w:val="multilevel"/>
     <w:tmpl w:val="7B6E95E4"/>
@@ -29822,7 +30925,157 @@
       </w:rPr>
     </w:lvl>
   </w:abstractNum>
-  <w:abstractNum w:abstractNumId="13" w15:restartNumberingAfterBreak="0">
+  <w:abstractNum w:abstractNumId="15" w15:restartNumberingAfterBreak="0">
+    <w:nsid w:val="229B5FCD"/>
+    <w:multiLevelType w:val="multilevel"/>
+    <w:tmpl w:val="EBE8EA84"/>
+    <w:lvl w:ilvl="0">
+      <w:start w:val="1"/>
+      <w:numFmt w:val="bullet"/>
+      <w:lvlText w:val=""/>
+      <w:lvlJc w:val="left"/>
+      <w:pPr>
+        <w:tabs>
+          <w:tab w:val="num" w:pos="720"/>
+        </w:tabs>
+        <w:ind w:left="720" w:hanging="360"/>
+      </w:pPr>
+      <w:rPr>
+        <w:rFonts w:ascii="Symbol" w:hAnsi="Symbol" w:hint="default"/>
+        <w:sz w:val="26"/>
+        <w:szCs w:val="26"/>
+      </w:rPr>
+    </w:lvl>
+    <w:lvl w:ilvl="1" w:tentative="1">
+      <w:start w:val="1"/>
+      <w:numFmt w:val="bullet"/>
+      <w:lvlText w:val="o"/>
+      <w:lvlJc w:val="left"/>
+      <w:pPr>
+        <w:tabs>
+          <w:tab w:val="num" w:pos="1440"/>
+        </w:tabs>
+        <w:ind w:left="1440" w:hanging="360"/>
+      </w:pPr>
+      <w:rPr>
+        <w:rFonts w:ascii="Courier New" w:hAnsi="Courier New" w:hint="default"/>
+        <w:sz w:val="20"/>
+      </w:rPr>
+    </w:lvl>
+    <w:lvl w:ilvl="2" w:tentative="1">
+      <w:start w:val="1"/>
+      <w:numFmt w:val="bullet"/>
+      <w:lvlText w:val=""/>
+      <w:lvlJc w:val="left"/>
+      <w:pPr>
+        <w:tabs>
+          <w:tab w:val="num" w:pos="2160"/>
+        </w:tabs>
+        <w:ind w:left="2160" w:hanging="360"/>
+      </w:pPr>
+      <w:rPr>
+        <w:rFonts w:ascii="Wingdings" w:hAnsi="Wingdings" w:hint="default"/>
+        <w:sz w:val="20"/>
+      </w:rPr>
+    </w:lvl>
+    <w:lvl w:ilvl="3" w:tentative="1">
+      <w:start w:val="1"/>
+      <w:numFmt w:val="bullet"/>
+      <w:lvlText w:val=""/>
+      <w:lvlJc w:val="left"/>
+      <w:pPr>
+        <w:tabs>
+          <w:tab w:val="num" w:pos="2880"/>
+        </w:tabs>
+        <w:ind w:left="2880" w:hanging="360"/>
+      </w:pPr>
+      <w:rPr>
+        <w:rFonts w:ascii="Wingdings" w:hAnsi="Wingdings" w:hint="default"/>
+        <w:sz w:val="20"/>
+      </w:rPr>
+    </w:lvl>
+    <w:lvl w:ilvl="4" w:tentative="1">
+      <w:start w:val="1"/>
+      <w:numFmt w:val="bullet"/>
+      <w:lvlText w:val=""/>
+      <w:lvlJc w:val="left"/>
+      <w:pPr>
+        <w:tabs>
+          <w:tab w:val="num" w:pos="3600"/>
+        </w:tabs>
+        <w:ind w:left="3600" w:hanging="360"/>
+      </w:pPr>
+      <w:rPr>
+        <w:rFonts w:ascii="Wingdings" w:hAnsi="Wingdings" w:hint="default"/>
+        <w:sz w:val="20"/>
+      </w:rPr>
+    </w:lvl>
+    <w:lvl w:ilvl="5" w:tentative="1">
+      <w:start w:val="1"/>
+      <w:numFmt w:val="bullet"/>
+      <w:lvlText w:val=""/>
+      <w:lvlJc w:val="left"/>
+      <w:pPr>
+        <w:tabs>
+          <w:tab w:val="num" w:pos="4320"/>
+        </w:tabs>
+        <w:ind w:left="4320" w:hanging="360"/>
+      </w:pPr>
+      <w:rPr>
+        <w:rFonts w:ascii="Wingdings" w:hAnsi="Wingdings" w:hint="default"/>
+        <w:sz w:val="20"/>
+      </w:rPr>
+    </w:lvl>
+    <w:lvl w:ilvl="6" w:tentative="1">
+      <w:start w:val="1"/>
+      <w:numFmt w:val="bullet"/>
+      <w:lvlText w:val=""/>
+      <w:lvlJc w:val="left"/>
+      <w:pPr>
+        <w:tabs>
+          <w:tab w:val="num" w:pos="5040"/>
+        </w:tabs>
+        <w:ind w:left="5040" w:hanging="360"/>
+      </w:pPr>
+      <w:rPr>
+        <w:rFonts w:ascii="Wingdings" w:hAnsi="Wingdings" w:hint="default"/>
+        <w:sz w:val="20"/>
+      </w:rPr>
+    </w:lvl>
+    <w:lvl w:ilvl="7" w:tentative="1">
+      <w:start w:val="1"/>
+      <w:numFmt w:val="bullet"/>
+      <w:lvlText w:val=""/>
+      <w:lvlJc w:val="left"/>
+      <w:pPr>
+        <w:tabs>
+          <w:tab w:val="num" w:pos="5760"/>
+        </w:tabs>
+        <w:ind w:left="5760" w:hanging="360"/>
+      </w:pPr>
+      <w:rPr>
+        <w:rFonts w:ascii="Wingdings" w:hAnsi="Wingdings" w:hint="default"/>
+        <w:sz w:val="20"/>
+      </w:rPr>
+    </w:lvl>
+    <w:lvl w:ilvl="8" w:tentative="1">
+      <w:start w:val="1"/>
+      <w:numFmt w:val="bullet"/>
+      <w:lvlText w:val=""/>
+      <w:lvlJc w:val="left"/>
+      <w:pPr>
+        <w:tabs>
+          <w:tab w:val="num" w:pos="6480"/>
+        </w:tabs>
+        <w:ind w:left="6480" w:hanging="360"/>
+      </w:pPr>
+      <w:rPr>
+        <w:rFonts w:ascii="Wingdings" w:hAnsi="Wingdings" w:hint="default"/>
+        <w:sz w:val="20"/>
+      </w:rPr>
+    </w:lvl>
+  </w:abstractNum>
+  <w:abstractNum w:abstractNumId="16" w15:restartNumberingAfterBreak="0">
     <w:nsid w:val="25183776"/>
     <w:multiLevelType w:val="multilevel"/>
     <w:tmpl w:val="D1CCF8F4"/>
@@ -29972,7 +31225,7 @@
       </w:rPr>
     </w:lvl>
   </w:abstractNum>
-  <w:abstractNum w:abstractNumId="14" w15:restartNumberingAfterBreak="0">
+  <w:abstractNum w:abstractNumId="17" w15:restartNumberingAfterBreak="0">
     <w:nsid w:val="25240F9B"/>
     <w:multiLevelType w:val="multilevel"/>
     <w:tmpl w:val="C1C0728E"/>
@@ -30121,7 +31374,7 @@
       </w:rPr>
     </w:lvl>
   </w:abstractNum>
-  <w:abstractNum w:abstractNumId="15" w15:restartNumberingAfterBreak="0">
+  <w:abstractNum w:abstractNumId="18" w15:restartNumberingAfterBreak="0">
     <w:nsid w:val="2BD1247C"/>
     <w:multiLevelType w:val="multilevel"/>
     <w:tmpl w:val="D1CCF8F4"/>
@@ -30271,7 +31524,7 @@
       </w:rPr>
     </w:lvl>
   </w:abstractNum>
-  <w:abstractNum w:abstractNumId="16" w15:restartNumberingAfterBreak="0">
+  <w:abstractNum w:abstractNumId="19" w15:restartNumberingAfterBreak="0">
     <w:nsid w:val="2CAB64FB"/>
     <w:multiLevelType w:val="hybridMultilevel"/>
     <w:tmpl w:val="F9A6FF1E"/>
@@ -30360,7 +31613,7 @@
       </w:pPr>
     </w:lvl>
   </w:abstractNum>
-  <w:abstractNum w:abstractNumId="17" w15:restartNumberingAfterBreak="0">
+  <w:abstractNum w:abstractNumId="20" w15:restartNumberingAfterBreak="0">
     <w:nsid w:val="2F0468D7"/>
     <w:multiLevelType w:val="multilevel"/>
     <w:tmpl w:val="BE7E59BE"/>
@@ -30509,7 +31762,7 @@
       </w:rPr>
     </w:lvl>
   </w:abstractNum>
-  <w:abstractNum w:abstractNumId="18" w15:restartNumberingAfterBreak="0">
+  <w:abstractNum w:abstractNumId="21" w15:restartNumberingAfterBreak="0">
     <w:nsid w:val="31FD7C11"/>
     <w:multiLevelType w:val="multilevel"/>
     <w:tmpl w:val="AF50FAFE"/>
@@ -30640,7 +31893,7 @@
       </w:rPr>
     </w:lvl>
   </w:abstractNum>
-  <w:abstractNum w:abstractNumId="19" w15:restartNumberingAfterBreak="0">
+  <w:abstractNum w:abstractNumId="22" w15:restartNumberingAfterBreak="0">
     <w:nsid w:val="3B49125C"/>
     <w:multiLevelType w:val="hybridMultilevel"/>
     <w:tmpl w:val="F3B02CA6"/>
@@ -30753,7 +32006,7 @@
       </w:rPr>
     </w:lvl>
   </w:abstractNum>
-  <w:abstractNum w:abstractNumId="20" w15:restartNumberingAfterBreak="0">
+  <w:abstractNum w:abstractNumId="23" w15:restartNumberingAfterBreak="0">
     <w:nsid w:val="3C096DF2"/>
     <w:multiLevelType w:val="multilevel"/>
     <w:tmpl w:val="40AC667C"/>
@@ -30902,7 +32155,7 @@
       </w:rPr>
     </w:lvl>
   </w:abstractNum>
-  <w:abstractNum w:abstractNumId="21" w15:restartNumberingAfterBreak="0">
+  <w:abstractNum w:abstractNumId="24" w15:restartNumberingAfterBreak="0">
     <w:nsid w:val="3C42012D"/>
     <w:multiLevelType w:val="multilevel"/>
     <w:tmpl w:val="6DC6A26C"/>
@@ -31051,7 +32304,7 @@
       </w:rPr>
     </w:lvl>
   </w:abstractNum>
-  <w:abstractNum w:abstractNumId="22" w15:restartNumberingAfterBreak="0">
+  <w:abstractNum w:abstractNumId="25" w15:restartNumberingAfterBreak="0">
     <w:nsid w:val="3D5A7145"/>
     <w:multiLevelType w:val="multilevel"/>
     <w:tmpl w:val="4C7E038C"/>
@@ -31200,10 +32453,10 @@
       </w:rPr>
     </w:lvl>
   </w:abstractNum>
-  <w:abstractNum w:abstractNumId="23" w15:restartNumberingAfterBreak="0">
+  <w:abstractNum w:abstractNumId="26" w15:restartNumberingAfterBreak="0">
     <w:nsid w:val="3E354A79"/>
     <w:multiLevelType w:val="multilevel"/>
-    <w:tmpl w:val="7F30B580"/>
+    <w:tmpl w:val="AC62D2BE"/>
     <w:lvl w:ilvl="0">
       <w:start w:val="1"/>
       <w:numFmt w:val="bullet"/>
@@ -31217,7 +32470,8 @@
       </w:pPr>
       <w:rPr>
         <w:rFonts w:ascii="Symbol" w:hAnsi="Symbol" w:hint="default"/>
-        <w:sz w:val="20"/>
+        <w:sz w:val="26"/>
+        <w:szCs w:val="26"/>
       </w:rPr>
     </w:lvl>
     <w:lvl w:ilvl="1" w:tentative="1">
@@ -31349,7 +32603,7 @@
       </w:rPr>
     </w:lvl>
   </w:abstractNum>
-  <w:abstractNum w:abstractNumId="24" w15:restartNumberingAfterBreak="0">
+  <w:abstractNum w:abstractNumId="27" w15:restartNumberingAfterBreak="0">
     <w:nsid w:val="43166180"/>
     <w:multiLevelType w:val="multilevel"/>
     <w:tmpl w:val="150CC908"/>
@@ -31499,7 +32753,7 @@
       </w:rPr>
     </w:lvl>
   </w:abstractNum>
-  <w:abstractNum w:abstractNumId="25" w15:restartNumberingAfterBreak="0">
+  <w:abstractNum w:abstractNumId="28" w15:restartNumberingAfterBreak="0">
     <w:nsid w:val="43333919"/>
     <w:multiLevelType w:val="multilevel"/>
     <w:tmpl w:val="5FC0D69E"/>
@@ -31648,7 +32902,7 @@
       </w:rPr>
     </w:lvl>
   </w:abstractNum>
-  <w:abstractNum w:abstractNumId="26" w15:restartNumberingAfterBreak="0">
+  <w:abstractNum w:abstractNumId="29" w15:restartNumberingAfterBreak="0">
     <w:nsid w:val="44942FD9"/>
     <w:multiLevelType w:val="multilevel"/>
     <w:tmpl w:val="660C5A9E"/>
@@ -31798,7 +33052,7 @@
       </w:rPr>
     </w:lvl>
   </w:abstractNum>
-  <w:abstractNum w:abstractNumId="27" w15:restartNumberingAfterBreak="0">
+  <w:abstractNum w:abstractNumId="30" w15:restartNumberingAfterBreak="0">
     <w:nsid w:val="455479AE"/>
     <w:multiLevelType w:val="multilevel"/>
     <w:tmpl w:val="D1CCF8F4"/>
@@ -31948,7 +33202,7 @@
       </w:rPr>
     </w:lvl>
   </w:abstractNum>
-  <w:abstractNum w:abstractNumId="28" w15:restartNumberingAfterBreak="0">
+  <w:abstractNum w:abstractNumId="31" w15:restartNumberingAfterBreak="0">
     <w:nsid w:val="4821656E"/>
     <w:multiLevelType w:val="multilevel"/>
     <w:tmpl w:val="0ADA9428"/>
@@ -32097,7 +33351,7 @@
       </w:rPr>
     </w:lvl>
   </w:abstractNum>
-  <w:abstractNum w:abstractNumId="29" w15:restartNumberingAfterBreak="0">
+  <w:abstractNum w:abstractNumId="32" w15:restartNumberingAfterBreak="0">
     <w:nsid w:val="4B0F4F94"/>
     <w:multiLevelType w:val="multilevel"/>
     <w:tmpl w:val="3C0ACFF6"/>
@@ -32246,7 +33500,7 @@
       </w:rPr>
     </w:lvl>
   </w:abstractNum>
-  <w:abstractNum w:abstractNumId="30" w15:restartNumberingAfterBreak="0">
+  <w:abstractNum w:abstractNumId="33" w15:restartNumberingAfterBreak="0">
     <w:nsid w:val="4CE708E0"/>
     <w:multiLevelType w:val="hybridMultilevel"/>
     <w:tmpl w:val="0F6E6C6E"/>
@@ -32362,7 +33616,7 @@
       </w:rPr>
     </w:lvl>
   </w:abstractNum>
-  <w:abstractNum w:abstractNumId="31" w15:restartNumberingAfterBreak="0">
+  <w:abstractNum w:abstractNumId="34" w15:restartNumberingAfterBreak="0">
     <w:nsid w:val="4E4E494E"/>
     <w:multiLevelType w:val="hybridMultilevel"/>
     <w:tmpl w:val="E89ADA4C"/>
@@ -32452,7 +33706,7 @@
       </w:pPr>
     </w:lvl>
   </w:abstractNum>
-  <w:abstractNum w:abstractNumId="32" w15:restartNumberingAfterBreak="0">
+  <w:abstractNum w:abstractNumId="35" w15:restartNumberingAfterBreak="0">
     <w:nsid w:val="51515E60"/>
     <w:multiLevelType w:val="multilevel"/>
     <w:tmpl w:val="B60A49E2"/>
@@ -32601,7 +33855,7 @@
       </w:rPr>
     </w:lvl>
   </w:abstractNum>
-  <w:abstractNum w:abstractNumId="33" w15:restartNumberingAfterBreak="0">
+  <w:abstractNum w:abstractNumId="36" w15:restartNumberingAfterBreak="0">
     <w:nsid w:val="515E3AF2"/>
     <w:multiLevelType w:val="multilevel"/>
     <w:tmpl w:val="B5147328"/>
@@ -32750,7 +34004,7 @@
       </w:rPr>
     </w:lvl>
   </w:abstractNum>
-  <w:abstractNum w:abstractNumId="34" w15:restartNumberingAfterBreak="0">
+  <w:abstractNum w:abstractNumId="37" w15:restartNumberingAfterBreak="0">
     <w:nsid w:val="52AD7959"/>
     <w:multiLevelType w:val="hybridMultilevel"/>
     <w:tmpl w:val="551CA6C8"/>
@@ -32836,7 +34090,7 @@
       </w:pPr>
     </w:lvl>
   </w:abstractNum>
-  <w:abstractNum w:abstractNumId="35" w15:restartNumberingAfterBreak="0">
+  <w:abstractNum w:abstractNumId="38" w15:restartNumberingAfterBreak="0">
     <w:nsid w:val="53E4141C"/>
     <w:multiLevelType w:val="multilevel"/>
     <w:tmpl w:val="D1CCF8F4"/>
@@ -32986,7 +34240,7 @@
       </w:rPr>
     </w:lvl>
   </w:abstractNum>
-  <w:abstractNum w:abstractNumId="36" w15:restartNumberingAfterBreak="0">
+  <w:abstractNum w:abstractNumId="39" w15:restartNumberingAfterBreak="0">
     <w:nsid w:val="558F10D8"/>
     <w:multiLevelType w:val="multilevel"/>
     <w:tmpl w:val="B5BEDC44"/>
@@ -33099,7 +34353,7 @@
       </w:pPr>
     </w:lvl>
   </w:abstractNum>
-  <w:abstractNum w:abstractNumId="37" w15:restartNumberingAfterBreak="0">
+  <w:abstractNum w:abstractNumId="40" w15:restartNumberingAfterBreak="0">
     <w:nsid w:val="56540A7B"/>
     <w:multiLevelType w:val="multilevel"/>
     <w:tmpl w:val="80F242AA"/>
@@ -33248,7 +34502,7 @@
       </w:rPr>
     </w:lvl>
   </w:abstractNum>
-  <w:abstractNum w:abstractNumId="38" w15:restartNumberingAfterBreak="0">
+  <w:abstractNum w:abstractNumId="41" w15:restartNumberingAfterBreak="0">
     <w:nsid w:val="62354820"/>
     <w:multiLevelType w:val="multilevel"/>
     <w:tmpl w:val="8082981C"/>
@@ -33397,7 +34651,7 @@
       </w:rPr>
     </w:lvl>
   </w:abstractNum>
-  <w:abstractNum w:abstractNumId="39" w15:restartNumberingAfterBreak="0">
+  <w:abstractNum w:abstractNumId="42" w15:restartNumberingAfterBreak="0">
     <w:nsid w:val="65194B2F"/>
     <w:multiLevelType w:val="hybridMultilevel"/>
     <w:tmpl w:val="0B980CA0"/>
@@ -33487,7 +34741,7 @@
       </w:pPr>
     </w:lvl>
   </w:abstractNum>
-  <w:abstractNum w:abstractNumId="40" w15:restartNumberingAfterBreak="0">
+  <w:abstractNum w:abstractNumId="43" w15:restartNumberingAfterBreak="0">
     <w:nsid w:val="6AB56393"/>
     <w:multiLevelType w:val="multilevel"/>
     <w:tmpl w:val="B22A9494"/>
@@ -33636,7 +34890,7 @@
       </w:rPr>
     </w:lvl>
   </w:abstractNum>
-  <w:abstractNum w:abstractNumId="41" w15:restartNumberingAfterBreak="0">
+  <w:abstractNum w:abstractNumId="44" w15:restartNumberingAfterBreak="0">
     <w:nsid w:val="6C5832DA"/>
     <w:multiLevelType w:val="multilevel"/>
     <w:tmpl w:val="1556C652"/>
@@ -33785,7 +35039,7 @@
       </w:rPr>
     </w:lvl>
   </w:abstractNum>
-  <w:abstractNum w:abstractNumId="42" w15:restartNumberingAfterBreak="0">
+  <w:abstractNum w:abstractNumId="45" w15:restartNumberingAfterBreak="0">
     <w:nsid w:val="6D786304"/>
     <w:multiLevelType w:val="multilevel"/>
     <w:tmpl w:val="C22CBC20"/>
@@ -33934,7 +35188,7 @@
       </w:rPr>
     </w:lvl>
   </w:abstractNum>
-  <w:abstractNum w:abstractNumId="43" w15:restartNumberingAfterBreak="0">
+  <w:abstractNum w:abstractNumId="46" w15:restartNumberingAfterBreak="0">
     <w:nsid w:val="70966828"/>
     <w:multiLevelType w:val="multilevel"/>
     <w:tmpl w:val="19D8CF6C"/>
@@ -34083,7 +35337,7 @@
       </w:rPr>
     </w:lvl>
   </w:abstractNum>
-  <w:abstractNum w:abstractNumId="44" w15:restartNumberingAfterBreak="0">
+  <w:abstractNum w:abstractNumId="47" w15:restartNumberingAfterBreak="0">
     <w:nsid w:val="724214E0"/>
     <w:multiLevelType w:val="multilevel"/>
     <w:tmpl w:val="1250FCB4"/>
@@ -34232,7 +35486,7 @@
       </w:rPr>
     </w:lvl>
   </w:abstractNum>
-  <w:abstractNum w:abstractNumId="45" w15:restartNumberingAfterBreak="0">
+  <w:abstractNum w:abstractNumId="48" w15:restartNumberingAfterBreak="0">
     <w:nsid w:val="72D94831"/>
     <w:multiLevelType w:val="multilevel"/>
     <w:tmpl w:val="75C2F55E"/>
@@ -34381,7 +35635,7 @@
       </w:rPr>
     </w:lvl>
   </w:abstractNum>
-  <w:abstractNum w:abstractNumId="46" w15:restartNumberingAfterBreak="0">
+  <w:abstractNum w:abstractNumId="49" w15:restartNumberingAfterBreak="0">
     <w:nsid w:val="73E97B72"/>
     <w:multiLevelType w:val="multilevel"/>
     <w:tmpl w:val="297A93B8"/>
@@ -34530,7 +35784,7 @@
       </w:rPr>
     </w:lvl>
   </w:abstractNum>
-  <w:abstractNum w:abstractNumId="47" w15:restartNumberingAfterBreak="0">
+  <w:abstractNum w:abstractNumId="50" w15:restartNumberingAfterBreak="0">
     <w:nsid w:val="75422933"/>
     <w:multiLevelType w:val="multilevel"/>
     <w:tmpl w:val="6818E780"/>
@@ -34679,7 +35933,157 @@
       </w:rPr>
     </w:lvl>
   </w:abstractNum>
-  <w:abstractNum w:abstractNumId="48" w15:restartNumberingAfterBreak="0">
+  <w:abstractNum w:abstractNumId="51" w15:restartNumberingAfterBreak="0">
+    <w:nsid w:val="762B1B1E"/>
+    <w:multiLevelType w:val="multilevel"/>
+    <w:tmpl w:val="B732A112"/>
+    <w:lvl w:ilvl="0">
+      <w:start w:val="1"/>
+      <w:numFmt w:val="bullet"/>
+      <w:lvlText w:val=""/>
+      <w:lvlJc w:val="left"/>
+      <w:pPr>
+        <w:tabs>
+          <w:tab w:val="num" w:pos="720"/>
+        </w:tabs>
+        <w:ind w:left="720" w:hanging="360"/>
+      </w:pPr>
+      <w:rPr>
+        <w:rFonts w:ascii="Symbol" w:hAnsi="Symbol" w:hint="default"/>
+        <w:sz w:val="26"/>
+        <w:szCs w:val="26"/>
+      </w:rPr>
+    </w:lvl>
+    <w:lvl w:ilvl="1" w:tentative="1">
+      <w:start w:val="1"/>
+      <w:numFmt w:val="bullet"/>
+      <w:lvlText w:val="o"/>
+      <w:lvlJc w:val="left"/>
+      <w:pPr>
+        <w:tabs>
+          <w:tab w:val="num" w:pos="1440"/>
+        </w:tabs>
+        <w:ind w:left="1440" w:hanging="360"/>
+      </w:pPr>
+      <w:rPr>
+        <w:rFonts w:ascii="Courier New" w:hAnsi="Courier New" w:hint="default"/>
+        <w:sz w:val="20"/>
+      </w:rPr>
+    </w:lvl>
+    <w:lvl w:ilvl="2" w:tentative="1">
+      <w:start w:val="1"/>
+      <w:numFmt w:val="bullet"/>
+      <w:lvlText w:val=""/>
+      <w:lvlJc w:val="left"/>
+      <w:pPr>
+        <w:tabs>
+          <w:tab w:val="num" w:pos="2160"/>
+        </w:tabs>
+        <w:ind w:left="2160" w:hanging="360"/>
+      </w:pPr>
+      <w:rPr>
+        <w:rFonts w:ascii="Wingdings" w:hAnsi="Wingdings" w:hint="default"/>
+        <w:sz w:val="20"/>
+      </w:rPr>
+    </w:lvl>
+    <w:lvl w:ilvl="3" w:tentative="1">
+      <w:start w:val="1"/>
+      <w:numFmt w:val="bullet"/>
+      <w:lvlText w:val=""/>
+      <w:lvlJc w:val="left"/>
+      <w:pPr>
+        <w:tabs>
+          <w:tab w:val="num" w:pos="2880"/>
+        </w:tabs>
+        <w:ind w:left="2880" w:hanging="360"/>
+      </w:pPr>
+      <w:rPr>
+        <w:rFonts w:ascii="Wingdings" w:hAnsi="Wingdings" w:hint="default"/>
+        <w:sz w:val="20"/>
+      </w:rPr>
+    </w:lvl>
+    <w:lvl w:ilvl="4" w:tentative="1">
+      <w:start w:val="1"/>
+      <w:numFmt w:val="bullet"/>
+      <w:lvlText w:val=""/>
+      <w:lvlJc w:val="left"/>
+      <w:pPr>
+        <w:tabs>
+          <w:tab w:val="num" w:pos="3600"/>
+        </w:tabs>
+        <w:ind w:left="3600" w:hanging="360"/>
+      </w:pPr>
+      <w:rPr>
+        <w:rFonts w:ascii="Wingdings" w:hAnsi="Wingdings" w:hint="default"/>
+        <w:sz w:val="20"/>
+      </w:rPr>
+    </w:lvl>
+    <w:lvl w:ilvl="5" w:tentative="1">
+      <w:start w:val="1"/>
+      <w:numFmt w:val="bullet"/>
+      <w:lvlText w:val=""/>
+      <w:lvlJc w:val="left"/>
+      <w:pPr>
+        <w:tabs>
+          <w:tab w:val="num" w:pos="4320"/>
+        </w:tabs>
+        <w:ind w:left="4320" w:hanging="360"/>
+      </w:pPr>
+      <w:rPr>
+        <w:rFonts w:ascii="Wingdings" w:hAnsi="Wingdings" w:hint="default"/>
+        <w:sz w:val="20"/>
+      </w:rPr>
+    </w:lvl>
+    <w:lvl w:ilvl="6" w:tentative="1">
+      <w:start w:val="1"/>
+      <w:numFmt w:val="bullet"/>
+      <w:lvlText w:val=""/>
+      <w:lvlJc w:val="left"/>
+      <w:pPr>
+        <w:tabs>
+          <w:tab w:val="num" w:pos="5040"/>
+        </w:tabs>
+        <w:ind w:left="5040" w:hanging="360"/>
+      </w:pPr>
+      <w:rPr>
+        <w:rFonts w:ascii="Wingdings" w:hAnsi="Wingdings" w:hint="default"/>
+        <w:sz w:val="20"/>
+      </w:rPr>
+    </w:lvl>
+    <w:lvl w:ilvl="7" w:tentative="1">
+      <w:start w:val="1"/>
+      <w:numFmt w:val="bullet"/>
+      <w:lvlText w:val=""/>
+      <w:lvlJc w:val="left"/>
+      <w:pPr>
+        <w:tabs>
+          <w:tab w:val="num" w:pos="5760"/>
+        </w:tabs>
+        <w:ind w:left="5760" w:hanging="360"/>
+      </w:pPr>
+      <w:rPr>
+        <w:rFonts w:ascii="Wingdings" w:hAnsi="Wingdings" w:hint="default"/>
+        <w:sz w:val="20"/>
+      </w:rPr>
+    </w:lvl>
+    <w:lvl w:ilvl="8" w:tentative="1">
+      <w:start w:val="1"/>
+      <w:numFmt w:val="bullet"/>
+      <w:lvlText w:val=""/>
+      <w:lvlJc w:val="left"/>
+      <w:pPr>
+        <w:tabs>
+          <w:tab w:val="num" w:pos="6480"/>
+        </w:tabs>
+        <w:ind w:left="6480" w:hanging="360"/>
+      </w:pPr>
+      <w:rPr>
+        <w:rFonts w:ascii="Wingdings" w:hAnsi="Wingdings" w:hint="default"/>
+        <w:sz w:val="20"/>
+      </w:rPr>
+    </w:lvl>
+  </w:abstractNum>
+  <w:abstractNum w:abstractNumId="52" w15:restartNumberingAfterBreak="0">
     <w:nsid w:val="76491EF4"/>
     <w:multiLevelType w:val="multilevel"/>
     <w:tmpl w:val="805A980A"/>
@@ -34828,7 +36232,7 @@
       </w:rPr>
     </w:lvl>
   </w:abstractNum>
-  <w:abstractNum w:abstractNumId="49" w15:restartNumberingAfterBreak="0">
+  <w:abstractNum w:abstractNumId="53" w15:restartNumberingAfterBreak="0">
     <w:nsid w:val="7A3D3F57"/>
     <w:multiLevelType w:val="hybridMultilevel"/>
     <w:tmpl w:val="6B80AFE2"/>
@@ -34941,7 +36345,7 @@
       </w:rPr>
     </w:lvl>
   </w:abstractNum>
-  <w:abstractNum w:abstractNumId="50" w15:restartNumberingAfterBreak="0">
+  <w:abstractNum w:abstractNumId="54" w15:restartNumberingAfterBreak="0">
     <w:nsid w:val="7CEE7CF7"/>
     <w:multiLevelType w:val="multilevel"/>
     <w:tmpl w:val="C0AE7AF8"/>
@@ -35090,7 +36494,7 @@
       </w:rPr>
     </w:lvl>
   </w:abstractNum>
-  <w:abstractNum w:abstractNumId="51" w15:restartNumberingAfterBreak="0">
+  <w:abstractNum w:abstractNumId="55" w15:restartNumberingAfterBreak="0">
     <w:nsid w:val="7D5D2820"/>
     <w:multiLevelType w:val="multilevel"/>
     <w:tmpl w:val="09487B14"/>
@@ -35239,7 +36643,7 @@
       </w:rPr>
     </w:lvl>
   </w:abstractNum>
-  <w:abstractNum w:abstractNumId="52" w15:restartNumberingAfterBreak="0">
+  <w:abstractNum w:abstractNumId="56" w15:restartNumberingAfterBreak="0">
     <w:nsid w:val="7DEB61DA"/>
     <w:multiLevelType w:val="multilevel"/>
     <w:tmpl w:val="6D306702"/>
@@ -35388,7 +36792,7 @@
       </w:rPr>
     </w:lvl>
   </w:abstractNum>
-  <w:abstractNum w:abstractNumId="53" w15:restartNumberingAfterBreak="0">
+  <w:abstractNum w:abstractNumId="57" w15:restartNumberingAfterBreak="0">
     <w:nsid w:val="7FA41DEA"/>
     <w:multiLevelType w:val="multilevel"/>
     <w:tmpl w:val="D4F09944"/>
@@ -35539,16 +36943,16 @@
     </w:lvl>
   </w:abstractNum>
   <w:num w:numId="1" w16cid:durableId="531578418">
-    <w:abstractNumId w:val="49"/>
+    <w:abstractNumId w:val="53"/>
   </w:num>
   <w:num w:numId="2" w16cid:durableId="535043752">
-    <w:abstractNumId w:val="18"/>
+    <w:abstractNumId w:val="21"/>
   </w:num>
   <w:num w:numId="3" w16cid:durableId="1454249317">
-    <w:abstractNumId w:val="33"/>
+    <w:abstractNumId w:val="36"/>
   </w:num>
   <w:num w:numId="4" w16cid:durableId="1167403667">
-    <w:abstractNumId w:val="18"/>
+    <w:abstractNumId w:val="21"/>
     <w:lvlOverride w:ilvl="0">
       <w:startOverride w:val="1"/>
     </w:lvlOverride>
@@ -35578,7 +36982,7 @@
     </w:lvlOverride>
   </w:num>
   <w:num w:numId="5" w16cid:durableId="1037317670">
-    <w:abstractNumId w:val="18"/>
+    <w:abstractNumId w:val="21"/>
     <w:lvlOverride w:ilvl="0">
       <w:startOverride w:val="2"/>
     </w:lvlOverride>
@@ -35608,7 +37012,7 @@
     </w:lvlOverride>
   </w:num>
   <w:num w:numId="6" w16cid:durableId="537399422">
-    <w:abstractNumId w:val="18"/>
+    <w:abstractNumId w:val="21"/>
     <w:lvlOverride w:ilvl="0">
       <w:startOverride w:val="3"/>
     </w:lvlOverride>
@@ -35638,7 +37042,7 @@
     </w:lvlOverride>
   </w:num>
   <w:num w:numId="7" w16cid:durableId="1959331421">
-    <w:abstractNumId w:val="18"/>
+    <w:abstractNumId w:val="21"/>
     <w:lvlOverride w:ilvl="0">
       <w:startOverride w:val="4"/>
     </w:lvlOverride>
@@ -35668,157 +37072,169 @@
     </w:lvlOverride>
   </w:num>
   <w:num w:numId="8" w16cid:durableId="1990132673">
+    <w:abstractNumId w:val="33"/>
+  </w:num>
+  <w:num w:numId="9" w16cid:durableId="189998431">
+    <w:abstractNumId w:val="10"/>
+  </w:num>
+  <w:num w:numId="10" w16cid:durableId="1438520260">
+    <w:abstractNumId w:val="34"/>
+  </w:num>
+  <w:num w:numId="11" w16cid:durableId="1857110141">
+    <w:abstractNumId w:val="26"/>
+  </w:num>
+  <w:num w:numId="12" w16cid:durableId="1661621084">
+    <w:abstractNumId w:val="22"/>
+  </w:num>
+  <w:num w:numId="13" w16cid:durableId="688877789">
+    <w:abstractNumId w:val="6"/>
+  </w:num>
+  <w:num w:numId="14" w16cid:durableId="1571620297">
+    <w:abstractNumId w:val="18"/>
+  </w:num>
+  <w:num w:numId="15" w16cid:durableId="815562522">
+    <w:abstractNumId w:val="38"/>
+  </w:num>
+  <w:num w:numId="16" w16cid:durableId="712921630">
+    <w:abstractNumId w:val="1"/>
+  </w:num>
+  <w:num w:numId="17" w16cid:durableId="295261067">
     <w:abstractNumId w:val="30"/>
   </w:num>
-  <w:num w:numId="9" w16cid:durableId="189998431">
+  <w:num w:numId="18" w16cid:durableId="187062912">
+    <w:abstractNumId w:val="16"/>
+  </w:num>
+  <w:num w:numId="19" w16cid:durableId="1476755236">
+    <w:abstractNumId w:val="19"/>
+  </w:num>
+  <w:num w:numId="20" w16cid:durableId="982926310">
+    <w:abstractNumId w:val="11"/>
+  </w:num>
+  <w:num w:numId="21" w16cid:durableId="1806584032">
+    <w:abstractNumId w:val="41"/>
+  </w:num>
+  <w:num w:numId="22" w16cid:durableId="913321053">
+    <w:abstractNumId w:val="4"/>
+  </w:num>
+  <w:num w:numId="23" w16cid:durableId="318920045">
+    <w:abstractNumId w:val="20"/>
+  </w:num>
+  <w:num w:numId="24" w16cid:durableId="2022927777">
+    <w:abstractNumId w:val="44"/>
+  </w:num>
+  <w:num w:numId="25" w16cid:durableId="875233574">
     <w:abstractNumId w:val="8"/>
   </w:num>
-  <w:num w:numId="10" w16cid:durableId="1438520260">
+  <w:num w:numId="26" w16cid:durableId="1562401975">
+    <w:abstractNumId w:val="24"/>
+  </w:num>
+  <w:num w:numId="27" w16cid:durableId="120804019">
+    <w:abstractNumId w:val="7"/>
+  </w:num>
+  <w:num w:numId="28" w16cid:durableId="1576083484">
+    <w:abstractNumId w:val="48"/>
+  </w:num>
+  <w:num w:numId="29" w16cid:durableId="334773344">
+    <w:abstractNumId w:val="55"/>
+  </w:num>
+  <w:num w:numId="30" w16cid:durableId="1820535772">
+    <w:abstractNumId w:val="46"/>
+  </w:num>
+  <w:num w:numId="31" w16cid:durableId="1778788139">
+    <w:abstractNumId w:val="35"/>
+  </w:num>
+  <w:num w:numId="32" w16cid:durableId="29962626">
+    <w:abstractNumId w:val="40"/>
+  </w:num>
+  <w:num w:numId="33" w16cid:durableId="1476338739">
+    <w:abstractNumId w:val="5"/>
+  </w:num>
+  <w:num w:numId="34" w16cid:durableId="1935353777">
+    <w:abstractNumId w:val="54"/>
+  </w:num>
+  <w:num w:numId="35" w16cid:durableId="822350772">
+    <w:abstractNumId w:val="43"/>
+  </w:num>
+  <w:num w:numId="36" w16cid:durableId="1397437641">
+    <w:abstractNumId w:val="13"/>
+  </w:num>
+  <w:num w:numId="37" w16cid:durableId="1741754865">
+    <w:abstractNumId w:val="32"/>
+  </w:num>
+  <w:num w:numId="38" w16cid:durableId="1633172903">
+    <w:abstractNumId w:val="45"/>
+  </w:num>
+  <w:num w:numId="39" w16cid:durableId="1304703033">
+    <w:abstractNumId w:val="49"/>
+  </w:num>
+  <w:num w:numId="40" w16cid:durableId="427427305">
     <w:abstractNumId w:val="31"/>
   </w:num>
-  <w:num w:numId="11" w16cid:durableId="1857110141">
+  <w:num w:numId="41" w16cid:durableId="323703767">
+    <w:abstractNumId w:val="52"/>
+  </w:num>
+  <w:num w:numId="42" w16cid:durableId="599341439">
+    <w:abstractNumId w:val="17"/>
+  </w:num>
+  <w:num w:numId="43" w16cid:durableId="1862358241">
+    <w:abstractNumId w:val="50"/>
+  </w:num>
+  <w:num w:numId="44" w16cid:durableId="233244423">
+    <w:abstractNumId w:val="56"/>
+  </w:num>
+  <w:num w:numId="45" w16cid:durableId="2059890659">
+    <w:abstractNumId w:val="28"/>
+  </w:num>
+  <w:num w:numId="46" w16cid:durableId="1051462332">
+    <w:abstractNumId w:val="12"/>
+  </w:num>
+  <w:num w:numId="47" w16cid:durableId="330838831">
+    <w:abstractNumId w:val="47"/>
+  </w:num>
+  <w:num w:numId="48" w16cid:durableId="1022629365">
+    <w:abstractNumId w:val="25"/>
+  </w:num>
+  <w:num w:numId="49" w16cid:durableId="1528131656">
+    <w:abstractNumId w:val="2"/>
+  </w:num>
+  <w:num w:numId="50" w16cid:durableId="1382023953">
+    <w:abstractNumId w:val="42"/>
+  </w:num>
+  <w:num w:numId="51" w16cid:durableId="1058897383">
+    <w:abstractNumId w:val="37"/>
+  </w:num>
+  <w:num w:numId="52" w16cid:durableId="1536960399">
+    <w:abstractNumId w:val="39"/>
+  </w:num>
+  <w:num w:numId="53" w16cid:durableId="13386614">
+    <w:abstractNumId w:val="29"/>
+  </w:num>
+  <w:num w:numId="54" w16cid:durableId="1217938889">
+    <w:abstractNumId w:val="27"/>
+  </w:num>
+  <w:num w:numId="55" w16cid:durableId="323433370">
     <w:abstractNumId w:val="23"/>
   </w:num>
-  <w:num w:numId="12" w16cid:durableId="1661621084">
-    <w:abstractNumId w:val="19"/>
+  <w:num w:numId="56" w16cid:durableId="456065693">
+    <w:abstractNumId w:val="57"/>
   </w:num>
-  <w:num w:numId="13" w16cid:durableId="688877789">
-    <w:abstractNumId w:val="5"/>
+  <w:num w:numId="57" w16cid:durableId="109974452">
+    <w:abstractNumId w:val="3"/>
   </w:num>
-  <w:num w:numId="14" w16cid:durableId="1571620297">
+  <w:num w:numId="58" w16cid:durableId="1862738263">
+    <w:abstractNumId w:val="14"/>
+  </w:num>
+  <w:num w:numId="59" w16cid:durableId="1019546542">
     <w:abstractNumId w:val="15"/>
   </w:num>
-  <w:num w:numId="15" w16cid:durableId="815562522">
-    <w:abstractNumId w:val="35"/>
-  </w:num>
-  <w:num w:numId="16" w16cid:durableId="712921630">
-    <w:abstractNumId w:val="0"/>
-  </w:num>
-  <w:num w:numId="17" w16cid:durableId="295261067">
-    <w:abstractNumId w:val="27"/>
-  </w:num>
-  <w:num w:numId="18" w16cid:durableId="187062912">
-    <w:abstractNumId w:val="13"/>
-  </w:num>
-  <w:num w:numId="19" w16cid:durableId="1476755236">
-    <w:abstractNumId w:val="16"/>
-  </w:num>
-  <w:num w:numId="20" w16cid:durableId="982926310">
+  <w:num w:numId="60" w16cid:durableId="1602300686">
     <w:abstractNumId w:val="9"/>
   </w:num>
-  <w:num w:numId="21" w16cid:durableId="1806584032">
-    <w:abstractNumId w:val="38"/>
-  </w:num>
-  <w:num w:numId="22" w16cid:durableId="913321053">
-    <w:abstractNumId w:val="3"/>
-  </w:num>
-  <w:num w:numId="23" w16cid:durableId="318920045">
-    <w:abstractNumId w:val="17"/>
-  </w:num>
-  <w:num w:numId="24" w16cid:durableId="2022927777">
-    <w:abstractNumId w:val="41"/>
-  </w:num>
-  <w:num w:numId="25" w16cid:durableId="875233574">
-    <w:abstractNumId w:val="7"/>
-  </w:num>
-  <w:num w:numId="26" w16cid:durableId="1562401975">
-    <w:abstractNumId w:val="21"/>
-  </w:num>
-  <w:num w:numId="27" w16cid:durableId="120804019">
-    <w:abstractNumId w:val="6"/>
-  </w:num>
-  <w:num w:numId="28" w16cid:durableId="1576083484">
-    <w:abstractNumId w:val="45"/>
-  </w:num>
-  <w:num w:numId="29" w16cid:durableId="334773344">
+  <w:num w:numId="61" w16cid:durableId="1022584728">
     <w:abstractNumId w:val="51"/>
   </w:num>
-  <w:num w:numId="30" w16cid:durableId="1820535772">
-    <w:abstractNumId w:val="43"/>
-  </w:num>
-  <w:num w:numId="31" w16cid:durableId="1778788139">
-    <w:abstractNumId w:val="32"/>
-  </w:num>
-  <w:num w:numId="32" w16cid:durableId="29962626">
-    <w:abstractNumId w:val="37"/>
-  </w:num>
-  <w:num w:numId="33" w16cid:durableId="1476338739">
-    <w:abstractNumId w:val="4"/>
-  </w:num>
-  <w:num w:numId="34" w16cid:durableId="1935353777">
-    <w:abstractNumId w:val="50"/>
-  </w:num>
-  <w:num w:numId="35" w16cid:durableId="822350772">
-    <w:abstractNumId w:val="40"/>
-  </w:num>
-  <w:num w:numId="36" w16cid:durableId="1397437641">
-    <w:abstractNumId w:val="11"/>
-  </w:num>
-  <w:num w:numId="37" w16cid:durableId="1741754865">
-    <w:abstractNumId w:val="29"/>
-  </w:num>
-  <w:num w:numId="38" w16cid:durableId="1633172903">
-    <w:abstractNumId w:val="42"/>
-  </w:num>
-  <w:num w:numId="39" w16cid:durableId="1304703033">
-    <w:abstractNumId w:val="46"/>
-  </w:num>
-  <w:num w:numId="40" w16cid:durableId="427427305">
-    <w:abstractNumId w:val="28"/>
-  </w:num>
-  <w:num w:numId="41" w16cid:durableId="323703767">
-    <w:abstractNumId w:val="48"/>
-  </w:num>
-  <w:num w:numId="42" w16cid:durableId="599341439">
-    <w:abstractNumId w:val="14"/>
-  </w:num>
-  <w:num w:numId="43" w16cid:durableId="1862358241">
-    <w:abstractNumId w:val="47"/>
-  </w:num>
-  <w:num w:numId="44" w16cid:durableId="233244423">
-    <w:abstractNumId w:val="52"/>
-  </w:num>
-  <w:num w:numId="45" w16cid:durableId="2059890659">
-    <w:abstractNumId w:val="25"/>
-  </w:num>
-  <w:num w:numId="46" w16cid:durableId="1051462332">
-    <w:abstractNumId w:val="10"/>
-  </w:num>
-  <w:num w:numId="47" w16cid:durableId="330838831">
-    <w:abstractNumId w:val="44"/>
-  </w:num>
-  <w:num w:numId="48" w16cid:durableId="1022629365">
-    <w:abstractNumId w:val="22"/>
-  </w:num>
-  <w:num w:numId="49" w16cid:durableId="1528131656">
-    <w:abstractNumId w:val="1"/>
-  </w:num>
-  <w:num w:numId="50" w16cid:durableId="1382023953">
-    <w:abstractNumId w:val="39"/>
-  </w:num>
-  <w:num w:numId="51" w16cid:durableId="1058897383">
-    <w:abstractNumId w:val="34"/>
-  </w:num>
-  <w:num w:numId="52" w16cid:durableId="1536960399">
-    <w:abstractNumId w:val="36"/>
-  </w:num>
-  <w:num w:numId="53" w16cid:durableId="13386614">
-    <w:abstractNumId w:val="26"/>
-  </w:num>
-  <w:num w:numId="54" w16cid:durableId="1217938889">
-    <w:abstractNumId w:val="24"/>
-  </w:num>
-  <w:num w:numId="55" w16cid:durableId="323433370">
-    <w:abstractNumId w:val="20"/>
-  </w:num>
-  <w:num w:numId="56" w16cid:durableId="456065693">
-    <w:abstractNumId w:val="53"/>
-  </w:num>
-  <w:num w:numId="57" w16cid:durableId="109974452">
-    <w:abstractNumId w:val="2"/>
-  </w:num>
-  <w:num w:numId="58" w16cid:durableId="1862738263">
-    <w:abstractNumId w:val="12"/>
+  <w:num w:numId="62" w16cid:durableId="1465584145">
+    <w:abstractNumId w:val="0"/>
   </w:num>
   <w:numIdMacAtCleanup w:val="50"/>
 </w:numbering>
@@ -36445,7 +37861,6 @@
   <w:style w:type="character" w:default="1" w:styleId="DefaultParagraphFont">
     <w:name w:val="Default Paragraph Font"/>
     <w:uiPriority w:val="1"/>
-    <w:semiHidden/>
     <w:unhideWhenUsed/>
   </w:style>
   <w:style w:type="table" w:default="1" w:styleId="TableNormal">

</xml_diff>